<commit_message>
docs/SOW v1.1 폰트 macOS 호환 — 맑은 고딕 → Apple SD Gothic Neo
macOS 에는 "맑은 고딕"(Windows 한글 폰트) 기본 미설치 → Word/Pages/Preview
에서 폰트 fallback 되며 한글이 깨져 보임. 사용자 시스템 (m5pro16, macOS)
에서 한글이 깨져 보인다는 보고.

수정
- word/document.xml: 1304 곳 치환
- word/styles.xml:   4 곳 치환
- 텍스트 내용 변경 없음 (run/paragraph 수 312/337 동일)
- Apple SD Gothic Neo 는 macOS 기본 폰트.
  Windows 에선 자체 폰트 fallback (맑은 고딕/Malgun Gothic) → 양쪽 정상

Co-Authored-By: Claude Opus 4.7 (1M context) <noreply@anthropic.com>
</commit_message>
<xml_diff>
--- a/docs/Pathwave_MVP_SOW_v1.1.docx
+++ b/docs/Pathwave_MVP_SOW_v1.1.docx
@@ -8,7 +8,7 @@
       </w:pPr>
       <w:r>
         <w:rPr>
-          <w:rFonts w:ascii="맑은 고딕" w:hAnsi="맑은 고딕" w:eastAsia="맑은 고딕" w:cs="맑은 고딕"/>
+          <w:rFonts w:ascii="Apple SD Gothic Neo" w:hAnsi="Apple SD Gothic Neo" w:eastAsia="Apple SD Gothic Neo" w:cs="Apple SD Gothic Neo"/>
           <w:b w:val="0"/>
           <w:i w:val="0"/>
           <w:sz w:val="20"/>
@@ -21,7 +21,7 @@
       </w:pPr>
       <w:r>
         <w:rPr>
-          <w:rFonts w:ascii="맑은 고딕" w:hAnsi="맑은 고딕" w:eastAsia="맑은 고딕" w:cs="맑은 고딕"/>
+          <w:rFonts w:ascii="Apple SD Gothic Neo" w:hAnsi="Apple SD Gothic Neo" w:eastAsia="Apple SD Gothic Neo" w:cs="Apple SD Gothic Neo"/>
           <w:b w:val="0"/>
           <w:i w:val="0"/>
           <w:sz w:val="20"/>
@@ -35,7 +35,7 @@
       </w:pPr>
       <w:r>
         <w:rPr>
-          <w:rFonts w:ascii="맑은 고딕" w:hAnsi="맑은 고딕" w:eastAsia="맑은 고딕" w:cs="맑은 고딕"/>
+          <w:rFonts w:ascii="Apple SD Gothic Neo" w:hAnsi="Apple SD Gothic Neo" w:eastAsia="Apple SD Gothic Neo" w:cs="Apple SD Gothic Neo"/>
           <w:b/>
           <w:i w:val="0"/>
           <w:color w:val="1F4E78"/>
@@ -51,7 +51,7 @@
       </w:pPr>
       <w:r>
         <w:rPr>
-          <w:rFonts w:ascii="맑은 고딕" w:hAnsi="맑은 고딕" w:eastAsia="맑은 고딕" w:cs="맑은 고딕"/>
+          <w:rFonts w:ascii="Apple SD Gothic Neo" w:hAnsi="Apple SD Gothic Neo" w:eastAsia="Apple SD Gothic Neo" w:cs="Apple SD Gothic Neo"/>
           <w:b w:val="0"/>
           <w:i w:val="0"/>
           <w:color w:val="595959"/>
@@ -67,7 +67,7 @@
       </w:pPr>
       <w:r>
         <w:rPr>
-          <w:rFonts w:ascii="맑은 고딕" w:hAnsi="맑은 고딕" w:eastAsia="맑은 고딕" w:cs="맑은 고딕"/>
+          <w:rFonts w:ascii="Apple SD Gothic Neo" w:hAnsi="Apple SD Gothic Neo" w:eastAsia="Apple SD Gothic Neo" w:cs="Apple SD Gothic Neo"/>
           <w:b/>
           <w:i w:val="0"/>
           <w:sz w:val="40"/>
@@ -82,7 +82,7 @@
       </w:pPr>
       <w:r>
         <w:rPr>
-          <w:rFonts w:ascii="맑은 고딕" w:hAnsi="맑은 고딕" w:eastAsia="맑은 고딕" w:cs="맑은 고딕"/>
+          <w:rFonts w:ascii="Apple SD Gothic Neo" w:hAnsi="Apple SD Gothic Neo" w:eastAsia="Apple SD Gothic Neo" w:cs="Apple SD Gothic Neo"/>
           <w:b w:val="0"/>
           <w:i w:val="0"/>
           <w:color w:val="595959"/>
@@ -116,7 +116,7 @@
             <w:r/>
             <w:r>
               <w:rPr>
-                <w:rFonts w:ascii="맑은 고딕" w:hAnsi="맑은 고딕" w:eastAsia="맑은 고딕" w:cs="맑은 고딕"/>
+                <w:rFonts w:ascii="Apple SD Gothic Neo" w:hAnsi="Apple SD Gothic Neo" w:eastAsia="Apple SD Gothic Neo" w:cs="Apple SD Gothic Neo"/>
                 <w:b w:val="0"/>
                 <w:sz w:val="20"/>
               </w:rPr>
@@ -137,7 +137,7 @@
             <w:r/>
             <w:r>
               <w:rPr>
-                <w:rFonts w:ascii="맑은 고딕" w:hAnsi="맑은 고딕" w:eastAsia="맑은 고딕" w:cs="맑은 고딕"/>
+                <w:rFonts w:ascii="Apple SD Gothic Neo" w:hAnsi="Apple SD Gothic Neo" w:eastAsia="Apple SD Gothic Neo" w:cs="Apple SD Gothic Neo"/>
                 <w:b w:val="0"/>
                 <w:sz w:val="20"/>
               </w:rPr>
@@ -160,7 +160,7 @@
             <w:r/>
             <w:r>
               <w:rPr>
-                <w:rFonts w:ascii="맑은 고딕" w:hAnsi="맑은 고딕" w:eastAsia="맑은 고딕" w:cs="맑은 고딕"/>
+                <w:rFonts w:ascii="Apple SD Gothic Neo" w:hAnsi="Apple SD Gothic Neo" w:eastAsia="Apple SD Gothic Neo" w:cs="Apple SD Gothic Neo"/>
                 <w:b w:val="0"/>
                 <w:sz w:val="20"/>
               </w:rPr>
@@ -181,7 +181,7 @@
             <w:r/>
             <w:r>
               <w:rPr>
-                <w:rFonts w:ascii="맑은 고딕" w:hAnsi="맑은 고딕" w:eastAsia="맑은 고딕" w:cs="맑은 고딕"/>
+                <w:rFonts w:ascii="Apple SD Gothic Neo" w:hAnsi="Apple SD Gothic Neo" w:eastAsia="Apple SD Gothic Neo" w:cs="Apple SD Gothic Neo"/>
                 <w:b w:val="0"/>
                 <w:sz w:val="20"/>
               </w:rPr>
@@ -204,7 +204,7 @@
             <w:r/>
             <w:r>
               <w:rPr>
-                <w:rFonts w:ascii="맑은 고딕" w:hAnsi="맑은 고딕" w:eastAsia="맑은 고딕" w:cs="맑은 고딕"/>
+                <w:rFonts w:ascii="Apple SD Gothic Neo" w:hAnsi="Apple SD Gothic Neo" w:eastAsia="Apple SD Gothic Neo" w:cs="Apple SD Gothic Neo"/>
                 <w:b w:val="0"/>
                 <w:sz w:val="20"/>
               </w:rPr>
@@ -225,7 +225,7 @@
             <w:r/>
             <w:r>
               <w:rPr>
-                <w:rFonts w:ascii="맑은 고딕" w:hAnsi="맑은 고딕" w:eastAsia="맑은 고딕" w:cs="맑은 고딕"/>
+                <w:rFonts w:ascii="Apple SD Gothic Neo" w:hAnsi="Apple SD Gothic Neo" w:eastAsia="Apple SD Gothic Neo" w:cs="Apple SD Gothic Neo"/>
                 <w:b w:val="0"/>
                 <w:sz w:val="20"/>
               </w:rPr>
@@ -248,7 +248,7 @@
             <w:r/>
             <w:r>
               <w:rPr>
-                <w:rFonts w:ascii="맑은 고딕" w:hAnsi="맑은 고딕" w:eastAsia="맑은 고딕" w:cs="맑은 고딕"/>
+                <w:rFonts w:ascii="Apple SD Gothic Neo" w:hAnsi="Apple SD Gothic Neo" w:eastAsia="Apple SD Gothic Neo" w:cs="Apple SD Gothic Neo"/>
                 <w:b w:val="0"/>
                 <w:sz w:val="20"/>
               </w:rPr>
@@ -269,7 +269,7 @@
             <w:r/>
             <w:r>
               <w:rPr>
-                <w:rFonts w:ascii="맑은 고딕" w:hAnsi="맑은 고딕" w:eastAsia="맑은 고딕" w:cs="맑은 고딕"/>
+                <w:rFonts w:ascii="Apple SD Gothic Neo" w:hAnsi="Apple SD Gothic Neo" w:eastAsia="Apple SD Gothic Neo" w:cs="Apple SD Gothic Neo"/>
                 <w:b w:val="0"/>
                 <w:sz w:val="20"/>
               </w:rPr>
@@ -292,7 +292,7 @@
             <w:r/>
             <w:r>
               <w:rPr>
-                <w:rFonts w:ascii="맑은 고딕" w:hAnsi="맑은 고딕" w:eastAsia="맑은 고딕" w:cs="맑은 고딕"/>
+                <w:rFonts w:ascii="Apple SD Gothic Neo" w:hAnsi="Apple SD Gothic Neo" w:eastAsia="Apple SD Gothic Neo" w:cs="Apple SD Gothic Neo"/>
                 <w:b w:val="0"/>
                 <w:sz w:val="20"/>
               </w:rPr>
@@ -313,7 +313,7 @@
             <w:r/>
             <w:r>
               <w:rPr>
-                <w:rFonts w:ascii="맑은 고딕" w:hAnsi="맑은 고딕" w:eastAsia="맑은 고딕" w:cs="맑은 고딕"/>
+                <w:rFonts w:ascii="Apple SD Gothic Neo" w:hAnsi="Apple SD Gothic Neo" w:eastAsia="Apple SD Gothic Neo" w:cs="Apple SD Gothic Neo"/>
                 <w:b w:val="0"/>
                 <w:sz w:val="20"/>
               </w:rPr>
@@ -336,7 +336,7 @@
             <w:r/>
             <w:r>
               <w:rPr>
-                <w:rFonts w:ascii="맑은 고딕" w:hAnsi="맑은 고딕" w:eastAsia="맑은 고딕" w:cs="맑은 고딕"/>
+                <w:rFonts w:ascii="Apple SD Gothic Neo" w:hAnsi="Apple SD Gothic Neo" w:eastAsia="Apple SD Gothic Neo" w:cs="Apple SD Gothic Neo"/>
                 <w:b w:val="0"/>
                 <w:sz w:val="20"/>
               </w:rPr>
@@ -357,7 +357,7 @@
             <w:r/>
             <w:r>
               <w:rPr>
-                <w:rFonts w:ascii="맑은 고딕" w:hAnsi="맑은 고딕" w:eastAsia="맑은 고딕" w:cs="맑은 고딕"/>
+                <w:rFonts w:ascii="Apple SD Gothic Neo" w:hAnsi="Apple SD Gothic Neo" w:eastAsia="Apple SD Gothic Neo" w:cs="Apple SD Gothic Neo"/>
                 <w:b w:val="0"/>
                 <w:sz w:val="20"/>
               </w:rPr>
@@ -373,7 +373,7 @@
       </w:pPr>
       <w:r>
         <w:rPr>
-          <w:rFonts w:ascii="맑은 고딕" w:hAnsi="맑은 고딕" w:eastAsia="맑은 고딕" w:cs="맑은 고딕"/>
+          <w:rFonts w:ascii="Apple SD Gothic Neo" w:hAnsi="Apple SD Gothic Neo" w:eastAsia="Apple SD Gothic Neo" w:cs="Apple SD Gothic Neo"/>
           <w:b w:val="0"/>
           <w:i w:val="0"/>
           <w:sz w:val="2"/>
@@ -386,7 +386,7 @@
       </w:pPr>
       <w:r>
         <w:rPr>
-          <w:rFonts w:ascii="맑은 고딕" w:hAnsi="맑은 고딕" w:eastAsia="맑은 고딕" w:cs="맑은 고딕"/>
+          <w:rFonts w:ascii="Apple SD Gothic Neo" w:hAnsi="Apple SD Gothic Neo" w:eastAsia="Apple SD Gothic Neo" w:cs="Apple SD Gothic Neo"/>
           <w:b w:val="0"/>
           <w:i w:val="0"/>
           <w:sz w:val="22"/>
@@ -400,7 +400,7 @@
       </w:pPr>
       <w:r>
         <w:rPr>
-          <w:rFonts w:ascii="맑은 고딕" w:hAnsi="맑은 고딕" w:eastAsia="맑은 고딕" w:cs="맑은 고딕"/>
+          <w:rFonts w:ascii="Apple SD Gothic Neo" w:hAnsi="Apple SD Gothic Neo" w:eastAsia="Apple SD Gothic Neo" w:cs="Apple SD Gothic Neo"/>
           <w:b w:val="0"/>
           <w:i/>
           <w:color w:val="808080"/>
@@ -421,7 +421,7 @@
       </w:pPr>
       <w:r>
         <w:rPr>
-          <w:rFonts w:ascii="맑은 고딕" w:hAnsi="맑은 고딕" w:eastAsia="맑은 고딕" w:cs="맑은 고딕"/>
+          <w:rFonts w:ascii="Apple SD Gothic Neo" w:hAnsi="Apple SD Gothic Neo" w:eastAsia="Apple SD Gothic Neo" w:cs="Apple SD Gothic Neo"/>
           <w:b/>
           <w:color w:val="1F4E78"/>
           <w:sz w:val="30"/>
@@ -436,7 +436,7 @@
       </w:pPr>
       <w:r>
         <w:rPr>
-          <w:rFonts w:ascii="맑은 고딕" w:hAnsi="맑은 고딕" w:eastAsia="맑은 고딕" w:cs="맑은 고딕"/>
+          <w:rFonts w:ascii="Apple SD Gothic Neo" w:hAnsi="Apple SD Gothic Neo" w:eastAsia="Apple SD Gothic Neo" w:cs="Apple SD Gothic Neo"/>
           <w:b/>
           <w:color w:val="2E75B6"/>
           <w:sz w:val="25"/>
@@ -450,7 +450,7 @@
       </w:pPr>
       <w:r>
         <w:rPr>
-          <w:rFonts w:ascii="맑은 고딕" w:hAnsi="맑은 고딕" w:eastAsia="맑은 고딕" w:cs="맑은 고딕"/>
+          <w:rFonts w:ascii="Apple SD Gothic Neo" w:hAnsi="Apple SD Gothic Neo" w:eastAsia="Apple SD Gothic Neo" w:cs="Apple SD Gothic Neo"/>
           <w:b w:val="0"/>
           <w:i w:val="0"/>
           <w:sz w:val="22"/>
@@ -465,7 +465,7 @@
       </w:pPr>
       <w:r>
         <w:rPr>
-          <w:rFonts w:ascii="맑은 고딕" w:hAnsi="맑은 고딕" w:eastAsia="맑은 고딕" w:cs="맑은 고딕"/>
+          <w:rFonts w:ascii="Apple SD Gothic Neo" w:hAnsi="Apple SD Gothic Neo" w:eastAsia="Apple SD Gothic Neo" w:cs="Apple SD Gothic Neo"/>
           <w:b/>
           <w:color w:val="2E75B6"/>
           <w:sz w:val="25"/>
@@ -499,7 +499,7 @@
             <w:r/>
             <w:r>
               <w:rPr>
-                <w:rFonts w:ascii="맑은 고딕" w:hAnsi="맑은 고딕" w:eastAsia="맑은 고딕" w:cs="맑은 고딕"/>
+                <w:rFonts w:ascii="Apple SD Gothic Neo" w:hAnsi="Apple SD Gothic Neo" w:eastAsia="Apple SD Gothic Neo" w:cs="Apple SD Gothic Neo"/>
                 <w:b/>
                 <w:color w:val="FFFFFF"/>
                 <w:sz w:val="21"/>
@@ -522,7 +522,7 @@
             <w:r/>
             <w:r>
               <w:rPr>
-                <w:rFonts w:ascii="맑은 고딕" w:hAnsi="맑은 고딕" w:eastAsia="맑은 고딕" w:cs="맑은 고딕"/>
+                <w:rFonts w:ascii="Apple SD Gothic Neo" w:hAnsi="Apple SD Gothic Neo" w:eastAsia="Apple SD Gothic Neo" w:cs="Apple SD Gothic Neo"/>
                 <w:b/>
                 <w:color w:val="FFFFFF"/>
                 <w:sz w:val="21"/>
@@ -546,7 +546,7 @@
             <w:r/>
             <w:r>
               <w:rPr>
-                <w:rFonts w:ascii="맑은 고딕" w:hAnsi="맑은 고딕" w:eastAsia="맑은 고딕" w:cs="맑은 고딕"/>
+                <w:rFonts w:ascii="Apple SD Gothic Neo" w:hAnsi="Apple SD Gothic Neo" w:eastAsia="Apple SD Gothic Neo" w:cs="Apple SD Gothic Neo"/>
                 <w:b w:val="0"/>
                 <w:sz w:val="20"/>
               </w:rPr>
@@ -567,7 +567,7 @@
             <w:r/>
             <w:r>
               <w:rPr>
-                <w:rFonts w:ascii="맑은 고딕" w:hAnsi="맑은 고딕" w:eastAsia="맑은 고딕" w:cs="맑은 고딕"/>
+                <w:rFonts w:ascii="Apple SD Gothic Neo" w:hAnsi="Apple SD Gothic Neo" w:eastAsia="Apple SD Gothic Neo" w:cs="Apple SD Gothic Neo"/>
                 <w:b w:val="0"/>
                 <w:sz w:val="20"/>
               </w:rPr>
@@ -591,7 +591,7 @@
             <w:r/>
             <w:r>
               <w:rPr>
-                <w:rFonts w:ascii="맑은 고딕" w:hAnsi="맑은 고딕" w:eastAsia="맑은 고딕" w:cs="맑은 고딕"/>
+                <w:rFonts w:ascii="Apple SD Gothic Neo" w:hAnsi="Apple SD Gothic Neo" w:eastAsia="Apple SD Gothic Neo" w:cs="Apple SD Gothic Neo"/>
                 <w:b w:val="0"/>
                 <w:sz w:val="20"/>
               </w:rPr>
@@ -613,7 +613,7 @@
             <w:r/>
             <w:r>
               <w:rPr>
-                <w:rFonts w:ascii="맑은 고딕" w:hAnsi="맑은 고딕" w:eastAsia="맑은 고딕" w:cs="맑은 고딕"/>
+                <w:rFonts w:ascii="Apple SD Gothic Neo" w:hAnsi="Apple SD Gothic Neo" w:eastAsia="Apple SD Gothic Neo" w:cs="Apple SD Gothic Neo"/>
                 <w:b w:val="0"/>
                 <w:sz w:val="20"/>
               </w:rPr>
@@ -636,7 +636,7 @@
             <w:r/>
             <w:r>
               <w:rPr>
-                <w:rFonts w:ascii="맑은 고딕" w:hAnsi="맑은 고딕" w:eastAsia="맑은 고딕" w:cs="맑은 고딕"/>
+                <w:rFonts w:ascii="Apple SD Gothic Neo" w:hAnsi="Apple SD Gothic Neo" w:eastAsia="Apple SD Gothic Neo" w:cs="Apple SD Gothic Neo"/>
                 <w:b w:val="0"/>
                 <w:sz w:val="20"/>
               </w:rPr>
@@ -657,7 +657,7 @@
             <w:r/>
             <w:r>
               <w:rPr>
-                <w:rFonts w:ascii="맑은 고딕" w:hAnsi="맑은 고딕" w:eastAsia="맑은 고딕" w:cs="맑은 고딕"/>
+                <w:rFonts w:ascii="Apple SD Gothic Neo" w:hAnsi="Apple SD Gothic Neo" w:eastAsia="Apple SD Gothic Neo" w:cs="Apple SD Gothic Neo"/>
                 <w:b w:val="0"/>
                 <w:sz w:val="20"/>
               </w:rPr>
@@ -681,7 +681,7 @@
             <w:r/>
             <w:r>
               <w:rPr>
-                <w:rFonts w:ascii="맑은 고딕" w:hAnsi="맑은 고딕" w:eastAsia="맑은 고딕" w:cs="맑은 고딕"/>
+                <w:rFonts w:ascii="Apple SD Gothic Neo" w:hAnsi="Apple SD Gothic Neo" w:eastAsia="Apple SD Gothic Neo" w:cs="Apple SD Gothic Neo"/>
                 <w:b w:val="0"/>
                 <w:sz w:val="20"/>
               </w:rPr>
@@ -703,7 +703,7 @@
             <w:r/>
             <w:r>
               <w:rPr>
-                <w:rFonts w:ascii="맑은 고딕" w:hAnsi="맑은 고딕" w:eastAsia="맑은 고딕" w:cs="맑은 고딕"/>
+                <w:rFonts w:ascii="Apple SD Gothic Neo" w:hAnsi="Apple SD Gothic Neo" w:eastAsia="Apple SD Gothic Neo" w:cs="Apple SD Gothic Neo"/>
                 <w:b w:val="0"/>
                 <w:sz w:val="20"/>
               </w:rPr>
@@ -719,7 +719,7 @@
       </w:pPr>
       <w:r>
         <w:rPr>
-          <w:rFonts w:ascii="맑은 고딕" w:hAnsi="맑은 고딕" w:eastAsia="맑은 고딕" w:cs="맑은 고딕"/>
+          <w:rFonts w:ascii="Apple SD Gothic Neo" w:hAnsi="Apple SD Gothic Neo" w:eastAsia="Apple SD Gothic Neo" w:cs="Apple SD Gothic Neo"/>
           <w:b w:val="0"/>
           <w:i w:val="0"/>
           <w:sz w:val="2"/>
@@ -733,7 +733,7 @@
       </w:pPr>
       <w:r>
         <w:rPr>
-          <w:rFonts w:ascii="맑은 고딕" w:hAnsi="맑은 고딕" w:eastAsia="맑은 고딕" w:cs="맑은 고딕"/>
+          <w:rFonts w:ascii="Apple SD Gothic Neo" w:hAnsi="Apple SD Gothic Neo" w:eastAsia="Apple SD Gothic Neo" w:cs="Apple SD Gothic Neo"/>
           <w:b/>
           <w:color w:val="2E75B6"/>
           <w:sz w:val="25"/>
@@ -748,7 +748,7 @@
       </w:pPr>
       <w:r>
         <w:rPr>
-          <w:rFonts w:ascii="맑은 고딕" w:hAnsi="맑은 고딕" w:eastAsia="맑은 고딕" w:cs="맑은 고딕"/>
+          <w:rFonts w:ascii="Apple SD Gothic Neo" w:hAnsi="Apple SD Gothic Neo" w:eastAsia="Apple SD Gothic Neo" w:cs="Apple SD Gothic Neo"/>
           <w:sz w:val="21"/>
         </w:rPr>
         <w:t>국내 서비스 시설(매장, 카페, 공공장소 등)에서 고객이 별도 비밀번호 입력 없이 1회 사용자 확인으로 매장 WiFi에 자동 연결되는 신규 플랫폼 구축.</w:t>
@@ -761,7 +761,7 @@
       </w:pPr>
       <w:r>
         <w:rPr>
-          <w:rFonts w:ascii="맑은 고딕" w:hAnsi="맑은 고딕" w:eastAsia="맑은 고딕" w:cs="맑은 고딕"/>
+          <w:rFonts w:ascii="Apple SD Gothic Neo" w:hAnsi="Apple SD Gothic Neo" w:eastAsia="Apple SD Gothic Neo" w:cs="Apple SD Gothic Neo"/>
           <w:sz w:val="21"/>
         </w:rPr>
         <w:t>기존 WiFi 접속 페인포인트 제거 및 매장-고객 간 디지털 접점 형성을 통해 충성도 프로그램(스탬프, 쿠폰), 다국어 채팅 등 부가가치 서비스의 기반 확보.</w:t>
@@ -774,7 +774,7 @@
       </w:pPr>
       <w:r>
         <w:rPr>
-          <w:rFonts w:ascii="맑은 고딕" w:hAnsi="맑은 고딕" w:eastAsia="맑은 고딕" w:cs="맑은 고딕"/>
+          <w:rFonts w:ascii="Apple SD Gothic Neo" w:hAnsi="Apple SD Gothic Neo" w:eastAsia="Apple SD Gothic Neo" w:cs="Apple SD Gothic Neo"/>
           <w:sz w:val="21"/>
         </w:rPr>
         <w:t>MVP(P1) 단계에서 핵심 기능을 안정적으로 출시하여 시장 검증 및 2차 확장 기반을 마련함.</w:t>
@@ -787,7 +787,7 @@
       </w:pPr>
       <w:r>
         <w:rPr>
-          <w:rFonts w:ascii="맑은 고딕" w:hAnsi="맑은 고딕" w:eastAsia="맑은 고딕" w:cs="맑은 고딕"/>
+          <w:rFonts w:ascii="Apple SD Gothic Neo" w:hAnsi="Apple SD Gothic Neo" w:eastAsia="Apple SD Gothic Neo" w:cs="Apple SD Gothic Neo"/>
           <w:b/>
           <w:color w:val="2E75B6"/>
           <w:sz w:val="25"/>
@@ -802,7 +802,7 @@
       </w:pPr>
       <w:r>
         <w:rPr>
-          <w:rFonts w:ascii="맑은 고딕" w:hAnsi="맑은 고딕" w:eastAsia="맑은 고딕" w:cs="맑은 고딕"/>
+          <w:rFonts w:ascii="Apple SD Gothic Neo" w:hAnsi="Apple SD Gothic Neo" w:eastAsia="Apple SD Gothic Neo" w:cs="Apple SD Gothic Neo"/>
           <w:sz w:val="21"/>
         </w:rPr>
         <w:t>WiFi 접속을 위한 비밀번호 노출 및 입력 절차가 사용자 경험(UX)을 크게 저해함.</w:t>
@@ -815,7 +815,7 @@
       </w:pPr>
       <w:r>
         <w:rPr>
-          <w:rFonts w:ascii="맑은 고딕" w:hAnsi="맑은 고딕" w:eastAsia="맑은 고딕" w:cs="맑은 고딕"/>
+          <w:rFonts w:ascii="Apple SD Gothic Neo" w:hAnsi="Apple SD Gothic Neo" w:eastAsia="Apple SD Gothic Neo" w:cs="Apple SD Gothic Neo"/>
           <w:sz w:val="21"/>
         </w:rPr>
         <w:t>매장 운영자는 고객의 첫 디지털 접점을 확보할 수단이 부재하여 마케팅 채널 다각화의 한계가 존재함.</w:t>
@@ -828,7 +828,7 @@
       </w:pPr>
       <w:r>
         <w:rPr>
-          <w:rFonts w:ascii="맑은 고딕" w:hAnsi="맑은 고딕" w:eastAsia="맑은 고딕" w:cs="맑은 고딕"/>
+          <w:rFonts w:ascii="Apple SD Gothic Neo" w:hAnsi="Apple SD Gothic Neo" w:eastAsia="Apple SD Gothic Neo" w:cs="Apple SD Gothic Neo"/>
           <w:sz w:val="21"/>
         </w:rPr>
         <w:t>BLE 비콘 기반 핸드셰이크 방식으로 보안성과 UX를 동시에 확보할 수 있음을 사전 기술 검증을 통해 확인함.</w:t>
@@ -846,7 +846,7 @@
       </w:pPr>
       <w:r>
         <w:rPr>
-          <w:rFonts w:ascii="맑은 고딕" w:hAnsi="맑은 고딕" w:eastAsia="맑은 고딕" w:cs="맑은 고딕"/>
+          <w:rFonts w:ascii="Apple SD Gothic Neo" w:hAnsi="Apple SD Gothic Neo" w:eastAsia="Apple SD Gothic Neo" w:cs="Apple SD Gothic Neo"/>
           <w:b/>
           <w:color w:val="1F4E78"/>
           <w:sz w:val="30"/>
@@ -861,7 +861,7 @@
       </w:pPr>
       <w:r>
         <w:rPr>
-          <w:rFonts w:ascii="맑은 고딕" w:hAnsi="맑은 고딕" w:eastAsia="맑은 고딕" w:cs="맑은 고딕"/>
+          <w:rFonts w:ascii="Apple SD Gothic Neo" w:hAnsi="Apple SD Gothic Neo" w:eastAsia="Apple SD Gothic Neo" w:cs="Apple SD Gothic Neo"/>
           <w:b/>
           <w:color w:val="2E75B6"/>
           <w:sz w:val="25"/>
@@ -896,7 +896,7 @@
             <w:r/>
             <w:r>
               <w:rPr>
-                <w:rFonts w:ascii="맑은 고딕" w:hAnsi="맑은 고딕" w:eastAsia="맑은 고딕" w:cs="맑은 고딕"/>
+                <w:rFonts w:ascii="Apple SD Gothic Neo" w:hAnsi="Apple SD Gothic Neo" w:eastAsia="Apple SD Gothic Neo" w:cs="Apple SD Gothic Neo"/>
                 <w:b/>
                 <w:color w:val="FFFFFF"/>
                 <w:sz w:val="21"/>
@@ -919,7 +919,7 @@
             <w:r/>
             <w:r>
               <w:rPr>
-                <w:rFonts w:ascii="맑은 고딕" w:hAnsi="맑은 고딕" w:eastAsia="맑은 고딕" w:cs="맑은 고딕"/>
+                <w:rFonts w:ascii="Apple SD Gothic Neo" w:hAnsi="Apple SD Gothic Neo" w:eastAsia="Apple SD Gothic Neo" w:cs="Apple SD Gothic Neo"/>
                 <w:b/>
                 <w:color w:val="FFFFFF"/>
                 <w:sz w:val="21"/>
@@ -942,7 +942,7 @@
             <w:r/>
             <w:r>
               <w:rPr>
-                <w:rFonts w:ascii="맑은 고딕" w:hAnsi="맑은 고딕" w:eastAsia="맑은 고딕" w:cs="맑은 고딕"/>
+                <w:rFonts w:ascii="Apple SD Gothic Neo" w:hAnsi="Apple SD Gothic Neo" w:eastAsia="Apple SD Gothic Neo" w:cs="Apple SD Gothic Neo"/>
                 <w:b/>
                 <w:color w:val="FFFFFF"/>
                 <w:sz w:val="21"/>
@@ -966,7 +966,7 @@
             <w:r/>
             <w:r>
               <w:rPr>
-                <w:rFonts w:ascii="맑은 고딕" w:hAnsi="맑은 고딕" w:eastAsia="맑은 고딕" w:cs="맑은 고딕"/>
+                <w:rFonts w:ascii="Apple SD Gothic Neo" w:hAnsi="Apple SD Gothic Neo" w:eastAsia="Apple SD Gothic Neo" w:cs="Apple SD Gothic Neo"/>
                 <w:b w:val="0"/>
                 <w:sz w:val="20"/>
               </w:rPr>
@@ -987,7 +987,7 @@
             <w:r/>
             <w:r>
               <w:rPr>
-                <w:rFonts w:ascii="맑은 고딕" w:hAnsi="맑은 고딕" w:eastAsia="맑은 고딕" w:cs="맑은 고딕"/>
+                <w:rFonts w:ascii="Apple SD Gothic Neo" w:hAnsi="Apple SD Gothic Neo" w:eastAsia="Apple SD Gothic Neo" w:cs="Apple SD Gothic Neo"/>
                 <w:b w:val="0"/>
                 <w:sz w:val="20"/>
               </w:rPr>
@@ -1008,7 +1008,7 @@
             <w:r/>
             <w:r>
               <w:rPr>
-                <w:rFonts w:ascii="맑은 고딕" w:hAnsi="맑은 고딕" w:eastAsia="맑은 고딕" w:cs="맑은 고딕"/>
+                <w:rFonts w:ascii="Apple SD Gothic Neo" w:hAnsi="Apple SD Gothic Neo" w:eastAsia="Apple SD Gothic Neo" w:cs="Apple SD Gothic Neo"/>
                 <w:b w:val="0"/>
                 <w:sz w:val="20"/>
               </w:rPr>
@@ -1032,7 +1032,7 @@
             <w:r/>
             <w:r>
               <w:rPr>
-                <w:rFonts w:ascii="맑은 고딕" w:hAnsi="맑은 고딕" w:eastAsia="맑은 고딕" w:cs="맑은 고딕"/>
+                <w:rFonts w:ascii="Apple SD Gothic Neo" w:hAnsi="Apple SD Gothic Neo" w:eastAsia="Apple SD Gothic Neo" w:cs="Apple SD Gothic Neo"/>
                 <w:b w:val="0"/>
                 <w:sz w:val="20"/>
               </w:rPr>
@@ -1054,7 +1054,7 @@
             <w:r/>
             <w:r>
               <w:rPr>
-                <w:rFonts w:ascii="맑은 고딕" w:hAnsi="맑은 고딕" w:eastAsia="맑은 고딕" w:cs="맑은 고딕"/>
+                <w:rFonts w:ascii="Apple SD Gothic Neo" w:hAnsi="Apple SD Gothic Neo" w:eastAsia="Apple SD Gothic Neo" w:cs="Apple SD Gothic Neo"/>
                 <w:b w:val="0"/>
                 <w:sz w:val="20"/>
               </w:rPr>
@@ -1076,7 +1076,7 @@
             <w:r/>
             <w:r>
               <w:rPr>
-                <w:rFonts w:ascii="맑은 고딕" w:hAnsi="맑은 고딕" w:eastAsia="맑은 고딕" w:cs="맑은 고딕"/>
+                <w:rFonts w:ascii="Apple SD Gothic Neo" w:hAnsi="Apple SD Gothic Neo" w:eastAsia="Apple SD Gothic Neo" w:cs="Apple SD Gothic Neo"/>
                 <w:b w:val="0"/>
                 <w:sz w:val="20"/>
               </w:rPr>
@@ -1099,7 +1099,7 @@
             <w:r/>
             <w:r>
               <w:rPr>
-                <w:rFonts w:ascii="맑은 고딕" w:hAnsi="맑은 고딕" w:eastAsia="맑은 고딕" w:cs="맑은 고딕"/>
+                <w:rFonts w:ascii="Apple SD Gothic Neo" w:hAnsi="Apple SD Gothic Neo" w:eastAsia="Apple SD Gothic Neo" w:cs="Apple SD Gothic Neo"/>
                 <w:b w:val="0"/>
                 <w:sz w:val="20"/>
               </w:rPr>
@@ -1120,7 +1120,7 @@
             <w:r/>
             <w:r>
               <w:rPr>
-                <w:rFonts w:ascii="맑은 고딕" w:hAnsi="맑은 고딕" w:eastAsia="맑은 고딕" w:cs="맑은 고딕"/>
+                <w:rFonts w:ascii="Apple SD Gothic Neo" w:hAnsi="Apple SD Gothic Neo" w:eastAsia="Apple SD Gothic Neo" w:cs="Apple SD Gothic Neo"/>
                 <w:b w:val="0"/>
                 <w:sz w:val="20"/>
               </w:rPr>
@@ -1141,7 +1141,7 @@
             <w:r/>
             <w:r>
               <w:rPr>
-                <w:rFonts w:ascii="맑은 고딕" w:hAnsi="맑은 고딕" w:eastAsia="맑은 고딕" w:cs="맑은 고딕"/>
+                <w:rFonts w:ascii="Apple SD Gothic Neo" w:hAnsi="Apple SD Gothic Neo" w:eastAsia="Apple SD Gothic Neo" w:cs="Apple SD Gothic Neo"/>
                 <w:b w:val="0"/>
                 <w:sz w:val="20"/>
               </w:rPr>
@@ -1165,7 +1165,7 @@
             <w:r/>
             <w:r>
               <w:rPr>
-                <w:rFonts w:ascii="맑은 고딕" w:hAnsi="맑은 고딕" w:eastAsia="맑은 고딕" w:cs="맑은 고딕"/>
+                <w:rFonts w:ascii="Apple SD Gothic Neo" w:hAnsi="Apple SD Gothic Neo" w:eastAsia="Apple SD Gothic Neo" w:cs="Apple SD Gothic Neo"/>
                 <w:b w:val="0"/>
                 <w:sz w:val="20"/>
               </w:rPr>
@@ -1187,7 +1187,7 @@
             <w:r/>
             <w:r>
               <w:rPr>
-                <w:rFonts w:ascii="맑은 고딕" w:hAnsi="맑은 고딕" w:eastAsia="맑은 고딕" w:cs="맑은 고딕"/>
+                <w:rFonts w:ascii="Apple SD Gothic Neo" w:hAnsi="Apple SD Gothic Neo" w:eastAsia="Apple SD Gothic Neo" w:cs="Apple SD Gothic Neo"/>
                 <w:b w:val="0"/>
                 <w:sz w:val="20"/>
               </w:rPr>
@@ -1209,7 +1209,7 @@
             <w:r/>
             <w:r>
               <w:rPr>
-                <w:rFonts w:ascii="맑은 고딕" w:hAnsi="맑은 고딕" w:eastAsia="맑은 고딕" w:cs="맑은 고딕"/>
+                <w:rFonts w:ascii="Apple SD Gothic Neo" w:hAnsi="Apple SD Gothic Neo" w:eastAsia="Apple SD Gothic Neo" w:cs="Apple SD Gothic Neo"/>
                 <w:b w:val="0"/>
                 <w:sz w:val="20"/>
               </w:rPr>
@@ -1225,7 +1225,7 @@
       </w:pPr>
       <w:r>
         <w:rPr>
-          <w:rFonts w:ascii="맑은 고딕" w:hAnsi="맑은 고딕" w:eastAsia="맑은 고딕" w:cs="맑은 고딕"/>
+          <w:rFonts w:ascii="Apple SD Gothic Neo" w:hAnsi="Apple SD Gothic Neo" w:eastAsia="Apple SD Gothic Neo" w:cs="Apple SD Gothic Neo"/>
           <w:b w:val="0"/>
           <w:i w:val="0"/>
           <w:sz w:val="2"/>
@@ -1238,7 +1238,7 @@
       </w:pPr>
       <w:r>
         <w:rPr>
-          <w:rFonts w:ascii="맑은 고딕" w:hAnsi="맑은 고딕" w:eastAsia="맑은 고딕" w:cs="맑은 고딕"/>
+          <w:rFonts w:ascii="Apple SD Gothic Neo" w:hAnsi="Apple SD Gothic Neo" w:eastAsia="Apple SD Gothic Neo" w:cs="Apple SD Gothic Neo"/>
           <w:b w:val="0"/>
           <w:i w:val="0"/>
           <w:color w:val="595959"/>
@@ -1254,7 +1254,7 @@
       </w:pPr>
       <w:r>
         <w:rPr>
-          <w:rFonts w:ascii="맑은 고딕" w:hAnsi="맑은 고딕" w:eastAsia="맑은 고딕" w:cs="맑은 고딕"/>
+          <w:rFonts w:ascii="Apple SD Gothic Neo" w:hAnsi="Apple SD Gothic Neo" w:eastAsia="Apple SD Gothic Neo" w:cs="Apple SD Gothic Neo"/>
           <w:b/>
           <w:color w:val="2E75B6"/>
           <w:sz w:val="25"/>
@@ -1269,7 +1269,7 @@
       </w:pPr>
       <w:r>
         <w:rPr>
-          <w:rFonts w:ascii="맑은 고딕" w:hAnsi="맑은 고딕" w:eastAsia="맑은 고딕" w:cs="맑은 고딕"/>
+          <w:rFonts w:ascii="Apple SD Gothic Neo" w:hAnsi="Apple SD Gothic Neo" w:eastAsia="Apple SD Gothic Neo" w:cs="Apple SD Gothic Neo"/>
           <w:sz w:val="21"/>
         </w:rPr>
         <w:t>본 과업은 기능정의서에서 "P1"로 분류된 기능에 한정함.</w:t>
@@ -1282,7 +1282,7 @@
       </w:pPr>
       <w:r>
         <w:rPr>
-          <w:rFonts w:ascii="맑은 고딕" w:hAnsi="맑은 고딕" w:eastAsia="맑은 고딕" w:cs="맑은 고딕"/>
+          <w:rFonts w:ascii="Apple SD Gothic Neo" w:hAnsi="Apple SD Gothic Neo" w:eastAsia="Apple SD Gothic Neo" w:cs="Apple SD Gothic Neo"/>
           <w:sz w:val="21"/>
         </w:rPr>
         <w:t>P2(2차) 및 P3(향후) 기능은 본 과업에서 명시적으로 제외하며, 별도 계약을 통해 추가 발주함.</w:t>
@@ -1295,7 +1295,7 @@
       </w:pPr>
       <w:r>
         <w:rPr>
-          <w:rFonts w:ascii="맑은 고딕" w:hAnsi="맑은 고딕" w:eastAsia="맑은 고딕" w:cs="맑은 고딕"/>
+          <w:rFonts w:ascii="Apple SD Gothic Neo" w:hAnsi="Apple SD Gothic Neo" w:eastAsia="Apple SD Gothic Neo" w:cs="Apple SD Gothic Neo"/>
           <w:sz w:val="21"/>
         </w:rPr>
         <w:t>MVP 핵심 가치 검증을 위한 최소 기능 셋이며, 향후 확장을 고려한 아키텍처 설계는 본 과업의 의무 사항임.</w:t>
@@ -1308,7 +1308,7 @@
       </w:pPr>
       <w:r>
         <w:rPr>
-          <w:rFonts w:ascii="맑은 고딕" w:hAnsi="맑은 고딕" w:eastAsia="맑은 고딕" w:cs="맑은 고딕"/>
+          <w:rFonts w:ascii="Apple SD Gothic Neo" w:hAnsi="Apple SD Gothic Neo" w:eastAsia="Apple SD Gothic Neo" w:cs="Apple SD Gothic Neo"/>
           <w:b/>
           <w:color w:val="2E75B6"/>
           <w:sz w:val="25"/>
@@ -1323,7 +1323,7 @@
       </w:pPr>
       <w:r>
         <w:rPr>
-          <w:rFonts w:ascii="맑은 고딕" w:hAnsi="맑은 고딕" w:eastAsia="맑은 고딕" w:cs="맑은 고딕"/>
+          <w:rFonts w:ascii="Apple SD Gothic Neo" w:hAnsi="Apple SD Gothic Neo" w:eastAsia="Apple SD Gothic Neo" w:cs="Apple SD Gothic Neo"/>
           <w:sz w:val="21"/>
         </w:rPr>
         <w:t>다국어 실시간 채팅 (P2 이관)</w:t>
@@ -1336,7 +1336,7 @@
       </w:pPr>
       <w:r>
         <w:rPr>
-          <w:rFonts w:ascii="맑은 고딕" w:hAnsi="맑은 고딕" w:eastAsia="맑은 고딕" w:cs="맑은 고딕"/>
+          <w:rFonts w:ascii="Apple SD Gothic Neo" w:hAnsi="Apple SD Gothic Neo" w:eastAsia="Apple SD Gothic Neo" w:cs="Apple SD Gothic Neo"/>
           <w:sz w:val="21"/>
         </w:rPr>
         <w:t>고급 분석 대시보드 및 AI 추천 (P3 이관)</w:t>
@@ -1349,7 +1349,7 @@
       </w:pPr>
       <w:r>
         <w:rPr>
-          <w:rFonts w:ascii="맑은 고딕" w:hAnsi="맑은 고딕" w:eastAsia="맑은 고딕" w:cs="맑은 고딕"/>
+          <w:rFonts w:ascii="Apple SD Gothic Neo" w:hAnsi="Apple SD Gothic Neo" w:eastAsia="Apple SD Gothic Neo" w:cs="Apple SD Gothic Neo"/>
           <w:sz w:val="21"/>
         </w:rPr>
         <w:t>타사 POS/CRM/ERP 연동 (별도 발주)</w:t>
@@ -1362,7 +1362,7 @@
       </w:pPr>
       <w:r>
         <w:rPr>
-          <w:rFonts w:ascii="맑은 고딕" w:hAnsi="맑은 고딕" w:eastAsia="맑은 고딕" w:cs="맑은 고딕"/>
+          <w:rFonts w:ascii="Apple SD Gothic Neo" w:hAnsi="Apple SD Gothic Neo" w:eastAsia="Apple SD Gothic Neo" w:cs="Apple SD Gothic Neo"/>
           <w:sz w:val="21"/>
         </w:rPr>
         <w:t>앱스토어/플레이스토어 심사 계정 및 비콘 양산 비용 (발주처 부담)</w:t>
@@ -1375,7 +1375,7 @@
       </w:pPr>
       <w:r>
         <w:rPr>
-          <w:rFonts w:ascii="맑은 고딕" w:hAnsi="맑은 고딕" w:eastAsia="맑은 고딕" w:cs="맑은 고딕"/>
+          <w:rFonts w:ascii="Apple SD Gothic Neo" w:hAnsi="Apple SD Gothic Neo" w:eastAsia="Apple SD Gothic Neo" w:cs="Apple SD Gothic Neo"/>
           <w:sz w:val="21"/>
         </w:rPr>
         <w:t>운영 단계의 서버 인프라 비용 및 운영 인력 (발주처 부담)</w:t>
@@ -1388,7 +1388,7 @@
       </w:pPr>
       <w:r>
         <w:rPr>
-          <w:rFonts w:ascii="맑은 고딕" w:hAnsi="맑은 고딕" w:eastAsia="맑은 고딕" w:cs="맑은 고딕"/>
+          <w:rFonts w:ascii="Apple SD Gothic Neo" w:hAnsi="Apple SD Gothic Neo" w:eastAsia="Apple SD Gothic Neo" w:cs="Apple SD Gothic Neo"/>
           <w:sz w:val="21"/>
         </w:rPr>
         <w:t>개시 후 유지보수 (본 과업의 하자보수 기간 이후는 별도 계약)</w:t>
@@ -1422,7 +1422,7 @@
       </w:pPr>
       <w:r>
         <w:rPr>
-          <w:rFonts w:ascii="맑은 고딕" w:hAnsi="맑은 고딕" w:eastAsia="맑은 고딕" w:cs="맑은 고딕"/>
+          <w:rFonts w:ascii="Apple SD Gothic Neo" w:hAnsi="Apple SD Gothic Neo" w:eastAsia="Apple SD Gothic Neo" w:cs="Apple SD Gothic Neo"/>
           <w:b/>
           <w:color w:val="1F4E78"/>
           <w:sz w:val="30"/>
@@ -1437,7 +1437,7 @@
       </w:pPr>
       <w:r>
         <w:rPr>
-          <w:rFonts w:ascii="맑은 고딕" w:hAnsi="맑은 고딕" w:eastAsia="맑은 고딕" w:cs="맑은 고딕"/>
+          <w:rFonts w:ascii="Apple SD Gothic Neo" w:hAnsi="Apple SD Gothic Neo" w:eastAsia="Apple SD Gothic Neo" w:cs="Apple SD Gothic Neo"/>
           <w:b/>
           <w:color w:val="2E75B6"/>
           <w:sz w:val="25"/>
@@ -1451,7 +1451,7 @@
       </w:pPr>
       <w:r>
         <w:rPr>
-          <w:rFonts w:ascii="맑은 고딕" w:hAnsi="맑은 고딕" w:eastAsia="맑은 고딕" w:cs="맑은 고딕"/>
+          <w:rFonts w:ascii="Apple SD Gothic Neo" w:hAnsi="Apple SD Gothic Neo" w:eastAsia="Apple SD Gothic Neo" w:cs="Apple SD Gothic Neo"/>
           <w:b w:val="0"/>
           <w:i w:val="0"/>
           <w:sz w:val="22"/>
@@ -1487,7 +1487,7 @@
             <w:r/>
             <w:r>
               <w:rPr>
-                <w:rFonts w:ascii="맑은 고딕" w:hAnsi="맑은 고딕" w:eastAsia="맑은 고딕" w:cs="맑은 고딕"/>
+                <w:rFonts w:ascii="Apple SD Gothic Neo" w:hAnsi="Apple SD Gothic Neo" w:eastAsia="Apple SD Gothic Neo" w:cs="Apple SD Gothic Neo"/>
                 <w:b/>
                 <w:color w:val="FFFFFF"/>
                 <w:sz w:val="21"/>
@@ -1510,7 +1510,7 @@
             <w:r/>
             <w:r>
               <w:rPr>
-                <w:rFonts w:ascii="맑은 고딕" w:hAnsi="맑은 고딕" w:eastAsia="맑은 고딕" w:cs="맑은 고딕"/>
+                <w:rFonts w:ascii="Apple SD Gothic Neo" w:hAnsi="Apple SD Gothic Neo" w:eastAsia="Apple SD Gothic Neo" w:cs="Apple SD Gothic Neo"/>
                 <w:b/>
                 <w:color w:val="FFFFFF"/>
                 <w:sz w:val="21"/>
@@ -1533,7 +1533,7 @@
             <w:r/>
             <w:r>
               <w:rPr>
-                <w:rFonts w:ascii="맑은 고딕" w:hAnsi="맑은 고딕" w:eastAsia="맑은 고딕" w:cs="맑은 고딕"/>
+                <w:rFonts w:ascii="Apple SD Gothic Neo" w:hAnsi="Apple SD Gothic Neo" w:eastAsia="Apple SD Gothic Neo" w:cs="Apple SD Gothic Neo"/>
                 <w:b/>
                 <w:color w:val="FFFFFF"/>
                 <w:sz w:val="21"/>
@@ -1556,7 +1556,7 @@
             <w:r/>
             <w:r>
               <w:rPr>
-                <w:rFonts w:ascii="맑은 고딕" w:hAnsi="맑은 고딕" w:eastAsia="맑은 고딕" w:cs="맑은 고딕"/>
+                <w:rFonts w:ascii="Apple SD Gothic Neo" w:hAnsi="Apple SD Gothic Neo" w:eastAsia="Apple SD Gothic Neo" w:cs="Apple SD Gothic Neo"/>
                 <w:b/>
                 <w:color w:val="FFFFFF"/>
                 <w:sz w:val="21"/>
@@ -1580,7 +1580,7 @@
             <w:r/>
             <w:r>
               <w:rPr>
-                <w:rFonts w:ascii="맑은 고딕" w:hAnsi="맑은 고딕" w:eastAsia="맑은 고딕" w:cs="맑은 고딕"/>
+                <w:rFonts w:ascii="Apple SD Gothic Neo" w:hAnsi="Apple SD Gothic Neo" w:eastAsia="Apple SD Gothic Neo" w:cs="Apple SD Gothic Neo"/>
                 <w:b w:val="0"/>
                 <w:sz w:val="20"/>
               </w:rPr>
@@ -1601,7 +1601,7 @@
             <w:r/>
             <w:r>
               <w:rPr>
-                <w:rFonts w:ascii="맑은 고딕" w:hAnsi="맑은 고딕" w:eastAsia="맑은 고딕" w:cs="맑은 고딕"/>
+                <w:rFonts w:ascii="Apple SD Gothic Neo" w:hAnsi="Apple SD Gothic Neo" w:eastAsia="Apple SD Gothic Neo" w:cs="Apple SD Gothic Neo"/>
                 <w:b w:val="0"/>
                 <w:sz w:val="20"/>
               </w:rPr>
@@ -1622,7 +1622,7 @@
             <w:r/>
             <w:r>
               <w:rPr>
-                <w:rFonts w:ascii="맑은 고딕" w:hAnsi="맑은 고딕" w:eastAsia="맑은 고딕" w:cs="맑은 고딕"/>
+                <w:rFonts w:ascii="Apple SD Gothic Neo" w:hAnsi="Apple SD Gothic Neo" w:eastAsia="Apple SD Gothic Neo" w:cs="Apple SD Gothic Neo"/>
                 <w:b w:val="0"/>
                 <w:sz w:val="20"/>
               </w:rPr>
@@ -1643,7 +1643,7 @@
             <w:r/>
             <w:r>
               <w:rPr>
-                <w:rFonts w:ascii="맑은 고딕" w:hAnsi="맑은 고딕" w:eastAsia="맑은 고딕" w:cs="맑은 고딕"/>
+                <w:rFonts w:ascii="Apple SD Gothic Neo" w:hAnsi="Apple SD Gothic Neo" w:eastAsia="Apple SD Gothic Neo" w:cs="Apple SD Gothic Neo"/>
                 <w:b w:val="0"/>
                 <w:sz w:val="20"/>
               </w:rPr>
@@ -1667,7 +1667,7 @@
             <w:r/>
             <w:r>
               <w:rPr>
-                <w:rFonts w:ascii="맑은 고딕" w:hAnsi="맑은 고딕" w:eastAsia="맑은 고딕" w:cs="맑은 고딕"/>
+                <w:rFonts w:ascii="Apple SD Gothic Neo" w:hAnsi="Apple SD Gothic Neo" w:eastAsia="Apple SD Gothic Neo" w:cs="Apple SD Gothic Neo"/>
                 <w:b w:val="0"/>
                 <w:sz w:val="20"/>
               </w:rPr>
@@ -1689,7 +1689,7 @@
             <w:r/>
             <w:r>
               <w:rPr>
-                <w:rFonts w:ascii="맑은 고딕" w:hAnsi="맑은 고딕" w:eastAsia="맑은 고딕" w:cs="맑은 고딕"/>
+                <w:rFonts w:ascii="Apple SD Gothic Neo" w:hAnsi="Apple SD Gothic Neo" w:eastAsia="Apple SD Gothic Neo" w:cs="Apple SD Gothic Neo"/>
                 <w:b w:val="0"/>
                 <w:sz w:val="20"/>
               </w:rPr>
@@ -1711,7 +1711,7 @@
             <w:r/>
             <w:r>
               <w:rPr>
-                <w:rFonts w:ascii="맑은 고딕" w:hAnsi="맑은 고딕" w:eastAsia="맑은 고딕" w:cs="맑은 고딕"/>
+                <w:rFonts w:ascii="Apple SD Gothic Neo" w:hAnsi="Apple SD Gothic Neo" w:eastAsia="Apple SD Gothic Neo" w:cs="Apple SD Gothic Neo"/>
                 <w:b w:val="0"/>
                 <w:sz w:val="20"/>
               </w:rPr>
@@ -1733,7 +1733,7 @@
             <w:r/>
             <w:r>
               <w:rPr>
-                <w:rFonts w:ascii="맑은 고딕" w:hAnsi="맑은 고딕" w:eastAsia="맑은 고딕" w:cs="맑은 고딕"/>
+                <w:rFonts w:ascii="Apple SD Gothic Neo" w:hAnsi="Apple SD Gothic Neo" w:eastAsia="Apple SD Gothic Neo" w:cs="Apple SD Gothic Neo"/>
                 <w:b w:val="0"/>
                 <w:sz w:val="20"/>
               </w:rPr>
@@ -1756,7 +1756,7 @@
             <w:r/>
             <w:r>
               <w:rPr>
-                <w:rFonts w:ascii="맑은 고딕" w:hAnsi="맑은 고딕" w:eastAsia="맑은 고딕" w:cs="맑은 고딕"/>
+                <w:rFonts w:ascii="Apple SD Gothic Neo" w:hAnsi="Apple SD Gothic Neo" w:eastAsia="Apple SD Gothic Neo" w:cs="Apple SD Gothic Neo"/>
                 <w:b w:val="0"/>
                 <w:sz w:val="20"/>
               </w:rPr>
@@ -1777,7 +1777,7 @@
             <w:r/>
             <w:r>
               <w:rPr>
-                <w:rFonts w:ascii="맑은 고딕" w:hAnsi="맑은 고딕" w:eastAsia="맑은 고딕" w:cs="맑은 고딕"/>
+                <w:rFonts w:ascii="Apple SD Gothic Neo" w:hAnsi="Apple SD Gothic Neo" w:eastAsia="Apple SD Gothic Neo" w:cs="Apple SD Gothic Neo"/>
                 <w:b w:val="0"/>
                 <w:sz w:val="20"/>
               </w:rPr>
@@ -1798,7 +1798,7 @@
             <w:r/>
             <w:r>
               <w:rPr>
-                <w:rFonts w:ascii="맑은 고딕" w:hAnsi="맑은 고딕" w:eastAsia="맑은 고딕" w:cs="맑은 고딕"/>
+                <w:rFonts w:ascii="Apple SD Gothic Neo" w:hAnsi="Apple SD Gothic Neo" w:eastAsia="Apple SD Gothic Neo" w:cs="Apple SD Gothic Neo"/>
                 <w:b w:val="0"/>
                 <w:sz w:val="20"/>
               </w:rPr>
@@ -1819,7 +1819,7 @@
             <w:r/>
             <w:r>
               <w:rPr>
-                <w:rFonts w:ascii="맑은 고딕" w:hAnsi="맑은 고딕" w:eastAsia="맑은 고딕" w:cs="맑은 고딕"/>
+                <w:rFonts w:ascii="Apple SD Gothic Neo" w:hAnsi="Apple SD Gothic Neo" w:eastAsia="Apple SD Gothic Neo" w:cs="Apple SD Gothic Neo"/>
                 <w:b w:val="0"/>
                 <w:sz w:val="20"/>
               </w:rPr>
@@ -1843,7 +1843,7 @@
             <w:r/>
             <w:r>
               <w:rPr>
-                <w:rFonts w:ascii="맑은 고딕" w:hAnsi="맑은 고딕" w:eastAsia="맑은 고딕" w:cs="맑은 고딕"/>
+                <w:rFonts w:ascii="Apple SD Gothic Neo" w:hAnsi="Apple SD Gothic Neo" w:eastAsia="Apple SD Gothic Neo" w:cs="Apple SD Gothic Neo"/>
                 <w:b w:val="0"/>
                 <w:sz w:val="20"/>
               </w:rPr>
@@ -1865,7 +1865,7 @@
             <w:r/>
             <w:r>
               <w:rPr>
-                <w:rFonts w:ascii="맑은 고딕" w:hAnsi="맑은 고딕" w:eastAsia="맑은 고딕" w:cs="맑은 고딕"/>
+                <w:rFonts w:ascii="Apple SD Gothic Neo" w:hAnsi="Apple SD Gothic Neo" w:eastAsia="Apple SD Gothic Neo" w:cs="Apple SD Gothic Neo"/>
                 <w:b w:val="0"/>
                 <w:sz w:val="20"/>
               </w:rPr>
@@ -1887,7 +1887,7 @@
             <w:r/>
             <w:r>
               <w:rPr>
-                <w:rFonts w:ascii="맑은 고딕" w:hAnsi="맑은 고딕" w:eastAsia="맑은 고딕" w:cs="맑은 고딕"/>
+                <w:rFonts w:ascii="Apple SD Gothic Neo" w:hAnsi="Apple SD Gothic Neo" w:eastAsia="Apple SD Gothic Neo" w:cs="Apple SD Gothic Neo"/>
                 <w:b w:val="0"/>
                 <w:sz w:val="20"/>
               </w:rPr>
@@ -1909,7 +1909,7 @@
             <w:r/>
             <w:r>
               <w:rPr>
-                <w:rFonts w:ascii="맑은 고딕" w:hAnsi="맑은 고딕" w:eastAsia="맑은 고딕" w:cs="맑은 고딕"/>
+                <w:rFonts w:ascii="Apple SD Gothic Neo" w:hAnsi="Apple SD Gothic Neo" w:eastAsia="Apple SD Gothic Neo" w:cs="Apple SD Gothic Neo"/>
                 <w:b w:val="0"/>
                 <w:sz w:val="20"/>
               </w:rPr>
@@ -1932,7 +1932,7 @@
             <w:r/>
             <w:r>
               <w:rPr>
-                <w:rFonts w:ascii="맑은 고딕" w:hAnsi="맑은 고딕" w:eastAsia="맑은 고딕" w:cs="맑은 고딕"/>
+                <w:rFonts w:ascii="Apple SD Gothic Neo" w:hAnsi="Apple SD Gothic Neo" w:eastAsia="Apple SD Gothic Neo" w:cs="Apple SD Gothic Neo"/>
                 <w:b w:val="0"/>
                 <w:sz w:val="20"/>
               </w:rPr>
@@ -1953,7 +1953,7 @@
             <w:r/>
             <w:r>
               <w:rPr>
-                <w:rFonts w:ascii="맑은 고딕" w:hAnsi="맑은 고딕" w:eastAsia="맑은 고딕" w:cs="맑은 고딕"/>
+                <w:rFonts w:ascii="Apple SD Gothic Neo" w:hAnsi="Apple SD Gothic Neo" w:eastAsia="Apple SD Gothic Neo" w:cs="Apple SD Gothic Neo"/>
                 <w:b w:val="0"/>
                 <w:sz w:val="20"/>
               </w:rPr>
@@ -1974,7 +1974,7 @@
             <w:r/>
             <w:r>
               <w:rPr>
-                <w:rFonts w:ascii="맑은 고딕" w:hAnsi="맑은 고딕" w:eastAsia="맑은 고딕" w:cs="맑은 고딕"/>
+                <w:rFonts w:ascii="Apple SD Gothic Neo" w:hAnsi="Apple SD Gothic Neo" w:eastAsia="Apple SD Gothic Neo" w:cs="Apple SD Gothic Neo"/>
                 <w:b w:val="0"/>
                 <w:sz w:val="20"/>
               </w:rPr>
@@ -1995,7 +1995,7 @@
             <w:r/>
             <w:r>
               <w:rPr>
-                <w:rFonts w:ascii="맑은 고딕" w:hAnsi="맑은 고딕" w:eastAsia="맑은 고딕" w:cs="맑은 고딕"/>
+                <w:rFonts w:ascii="Apple SD Gothic Neo" w:hAnsi="Apple SD Gothic Neo" w:eastAsia="Apple SD Gothic Neo" w:cs="Apple SD Gothic Neo"/>
                 <w:b w:val="0"/>
                 <w:sz w:val="20"/>
               </w:rPr>
@@ -2019,7 +2019,7 @@
             <w:r/>
             <w:r>
               <w:rPr>
-                <w:rFonts w:ascii="맑은 고딕" w:hAnsi="맑은 고딕" w:eastAsia="맑은 고딕" w:cs="맑은 고딕"/>
+                <w:rFonts w:ascii="Apple SD Gothic Neo" w:hAnsi="Apple SD Gothic Neo" w:eastAsia="Apple SD Gothic Neo" w:cs="Apple SD Gothic Neo"/>
                 <w:b w:val="0"/>
                 <w:sz w:val="20"/>
               </w:rPr>
@@ -2041,7 +2041,7 @@
             <w:r/>
             <w:r>
               <w:rPr>
-                <w:rFonts w:ascii="맑은 고딕" w:hAnsi="맑은 고딕" w:eastAsia="맑은 고딕" w:cs="맑은 고딕"/>
+                <w:rFonts w:ascii="Apple SD Gothic Neo" w:hAnsi="Apple SD Gothic Neo" w:eastAsia="Apple SD Gothic Neo" w:cs="Apple SD Gothic Neo"/>
                 <w:b w:val="0"/>
                 <w:sz w:val="20"/>
               </w:rPr>
@@ -2063,7 +2063,7 @@
             <w:r/>
             <w:r>
               <w:rPr>
-                <w:rFonts w:ascii="맑은 고딕" w:hAnsi="맑은 고딕" w:eastAsia="맑은 고딕" w:cs="맑은 고딕"/>
+                <w:rFonts w:ascii="Apple SD Gothic Neo" w:hAnsi="Apple SD Gothic Neo" w:eastAsia="Apple SD Gothic Neo" w:cs="Apple SD Gothic Neo"/>
                 <w:b w:val="0"/>
                 <w:sz w:val="20"/>
               </w:rPr>
@@ -2085,7 +2085,7 @@
             <w:r/>
             <w:r>
               <w:rPr>
-                <w:rFonts w:ascii="맑은 고딕" w:hAnsi="맑은 고딕" w:eastAsia="맑은 고딕" w:cs="맑은 고딕"/>
+                <w:rFonts w:ascii="Apple SD Gothic Neo" w:hAnsi="Apple SD Gothic Neo" w:eastAsia="Apple SD Gothic Neo" w:cs="Apple SD Gothic Neo"/>
                 <w:b w:val="0"/>
                 <w:sz w:val="20"/>
               </w:rPr>
@@ -2101,7 +2101,7 @@
       </w:pPr>
       <w:r>
         <w:rPr>
-          <w:rFonts w:ascii="맑은 고딕" w:hAnsi="맑은 고딕" w:eastAsia="맑은 고딕" w:cs="맑은 고딕"/>
+          <w:rFonts w:ascii="Apple SD Gothic Neo" w:hAnsi="Apple SD Gothic Neo" w:eastAsia="Apple SD Gothic Neo" w:cs="Apple SD Gothic Neo"/>
           <w:b w:val="0"/>
           <w:i w:val="0"/>
           <w:sz w:val="2"/>
@@ -2114,7 +2114,7 @@
       </w:pPr>
       <w:r>
         <w:rPr>
-          <w:rFonts w:ascii="맑은 고딕" w:hAnsi="맑은 고딕" w:eastAsia="맑은 고딕" w:cs="맑은 고딕"/>
+          <w:rFonts w:ascii="Apple SD Gothic Neo" w:hAnsi="Apple SD Gothic Neo" w:eastAsia="Apple SD Gothic Neo" w:cs="Apple SD Gothic Neo"/>
           <w:b w:val="0"/>
           <w:i w:val="0"/>
           <w:color w:val="595959"/>
@@ -2130,7 +2130,7 @@
       </w:pPr>
       <w:r>
         <w:rPr>
-          <w:rFonts w:ascii="맑은 고딕" w:hAnsi="맑은 고딕" w:eastAsia="맑은 고딕" w:cs="맑은 고딕"/>
+          <w:rFonts w:ascii="Apple SD Gothic Neo" w:hAnsi="Apple SD Gothic Neo" w:eastAsia="Apple SD Gothic Neo" w:cs="Apple SD Gothic Neo"/>
           <w:b/>
           <w:color w:val="2E75B6"/>
           <w:sz w:val="25"/>
@@ -2145,7 +2145,7 @@
       </w:pPr>
       <w:r>
         <w:rPr>
-          <w:rFonts w:ascii="맑은 고딕" w:hAnsi="맑은 고딕" w:eastAsia="맑은 고딕" w:cs="맑은 고딕"/>
+          <w:rFonts w:ascii="Apple SD Gothic Neo" w:hAnsi="Apple SD Gothic Neo" w:eastAsia="Apple SD Gothic Neo" w:cs="Apple SD Gothic Neo"/>
           <w:sz w:val="21"/>
         </w:rPr>
         <w:t>정기 회의: 별도 운영 안 함 (필요 시 비정기 소집)</w:t>
@@ -2158,7 +2158,7 @@
       </w:pPr>
       <w:r>
         <w:rPr>
-          <w:rFonts w:ascii="맑은 고딕" w:hAnsi="맑은 고딕" w:eastAsia="맑은 고딕" w:cs="맑은 고딕"/>
+          <w:rFonts w:ascii="Apple SD Gothic Neo" w:hAnsi="Apple SD Gothic Neo" w:eastAsia="Apple SD Gothic Neo" w:cs="Apple SD Gothic Neo"/>
           <w:sz w:val="21"/>
         </w:rPr>
         <w:t>비정기 회의: 주요 의사결정/이슈 발생 시 발주측 PM 요청에 따라 24시간 내 회의 가능 상태 유지</w:t>
@@ -2171,7 +2171,7 @@
       </w:pPr>
       <w:r>
         <w:rPr>
-          <w:rFonts w:ascii="맑은 고딕" w:hAnsi="맑은 고딕" w:eastAsia="맑은 고딕" w:cs="맑은 고딕"/>
+          <w:rFonts w:ascii="Apple SD Gothic Neo" w:hAnsi="Apple SD Gothic Neo" w:eastAsia="Apple SD Gothic Neo" w:cs="Apple SD Gothic Neo"/>
           <w:sz w:val="21"/>
         </w:rPr>
         <w:t>이슈 관리: 발주처에서 직접 관리 (협업 도구 선택은 발주처 재량)</w:t>
@@ -2184,7 +2184,7 @@
       </w:pPr>
       <w:r>
         <w:rPr>
-          <w:rFonts w:ascii="맑은 고딕" w:hAnsi="맑은 고딕" w:eastAsia="맑은 고딕" w:cs="맑은 고딕"/>
+          <w:rFonts w:ascii="Apple SD Gothic Neo" w:hAnsi="Apple SD Gothic Neo" w:eastAsia="Apple SD Gothic Neo" w:cs="Apple SD Gothic Neo"/>
           <w:sz w:val="21"/>
         </w:rPr>
         <w:t>진척률 보고: 발주처 필요 시점에 확인 (정기 보고서 제출 의무 없음)</w:t>
@@ -2202,7 +2202,7 @@
       </w:pPr>
       <w:r>
         <w:rPr>
-          <w:rFonts w:ascii="맑은 고딕" w:hAnsi="맑은 고딕" w:eastAsia="맑은 고딕" w:cs="맑은 고딕"/>
+          <w:rFonts w:ascii="Apple SD Gothic Neo" w:hAnsi="Apple SD Gothic Neo" w:eastAsia="Apple SD Gothic Neo" w:cs="Apple SD Gothic Neo"/>
           <w:b/>
           <w:color w:val="1F4E78"/>
           <w:sz w:val="30"/>
@@ -2216,7 +2216,7 @@
       </w:pPr>
       <w:r>
         <w:rPr>
-          <w:rFonts w:ascii="맑은 고딕" w:hAnsi="맑은 고딕" w:eastAsia="맑은 고딕" w:cs="맑은 고딕"/>
+          <w:rFonts w:ascii="Apple SD Gothic Neo" w:hAnsi="Apple SD Gothic Neo" w:eastAsia="Apple SD Gothic Neo" w:cs="Apple SD Gothic Neo"/>
           <w:b w:val="0"/>
           <w:i w:val="0"/>
           <w:sz w:val="22"/>
@@ -2231,7 +2231,7 @@
       </w:pPr>
       <w:r>
         <w:rPr>
-          <w:rFonts w:ascii="맑은 고딕" w:hAnsi="맑은 고딕" w:eastAsia="맑은 고딕" w:cs="맑은 고딕"/>
+          <w:rFonts w:ascii="Apple SD Gothic Neo" w:hAnsi="Apple SD Gothic Neo" w:eastAsia="Apple SD Gothic Neo" w:cs="Apple SD Gothic Neo"/>
           <w:b/>
           <w:color w:val="2E75B6"/>
           <w:sz w:val="25"/>
@@ -2265,7 +2265,7 @@
             <w:r/>
             <w:r>
               <w:rPr>
-                <w:rFonts w:ascii="맑은 고딕" w:hAnsi="맑은 고딕" w:eastAsia="맑은 고딕" w:cs="맑은 고딕"/>
+                <w:rFonts w:ascii="Apple SD Gothic Neo" w:hAnsi="Apple SD Gothic Neo" w:eastAsia="Apple SD Gothic Neo" w:cs="Apple SD Gothic Neo"/>
                 <w:b/>
                 <w:color w:val="FFFFFF"/>
                 <w:sz w:val="21"/>
@@ -2288,7 +2288,7 @@
             <w:r/>
             <w:r>
               <w:rPr>
-                <w:rFonts w:ascii="맑은 고딕" w:hAnsi="맑은 고딕" w:eastAsia="맑은 고딕" w:cs="맑은 고딕"/>
+                <w:rFonts w:ascii="Apple SD Gothic Neo" w:hAnsi="Apple SD Gothic Neo" w:eastAsia="Apple SD Gothic Neo" w:cs="Apple SD Gothic Neo"/>
                 <w:b/>
                 <w:color w:val="FFFFFF"/>
                 <w:sz w:val="21"/>
@@ -2312,7 +2312,7 @@
             <w:r/>
             <w:r>
               <w:rPr>
-                <w:rFonts w:ascii="맑은 고딕" w:hAnsi="맑은 고딕" w:eastAsia="맑은 고딕" w:cs="맑은 고딕"/>
+                <w:rFonts w:ascii="Apple SD Gothic Neo" w:hAnsi="Apple SD Gothic Neo" w:eastAsia="Apple SD Gothic Neo" w:cs="Apple SD Gothic Neo"/>
                 <w:b w:val="0"/>
                 <w:sz w:val="20"/>
               </w:rPr>
@@ -2333,7 +2333,7 @@
             <w:r/>
             <w:r>
               <w:rPr>
-                <w:rFonts w:ascii="맑은 고딕" w:hAnsi="맑은 고딕" w:eastAsia="맑은 고딕" w:cs="맑은 고딕"/>
+                <w:rFonts w:ascii="Apple SD Gothic Neo" w:hAnsi="Apple SD Gothic Neo" w:eastAsia="Apple SD Gothic Neo" w:cs="Apple SD Gothic Neo"/>
                 <w:b w:val="0"/>
                 <w:sz w:val="20"/>
               </w:rPr>
@@ -2357,7 +2357,7 @@
             <w:r/>
             <w:r>
               <w:rPr>
-                <w:rFonts w:ascii="맑은 고딕" w:hAnsi="맑은 고딕" w:eastAsia="맑은 고딕" w:cs="맑은 고딕"/>
+                <w:rFonts w:ascii="Apple SD Gothic Neo" w:hAnsi="Apple SD Gothic Neo" w:eastAsia="Apple SD Gothic Neo" w:cs="Apple SD Gothic Neo"/>
                 <w:b w:val="0"/>
                 <w:sz w:val="20"/>
               </w:rPr>
@@ -2379,7 +2379,7 @@
             <w:r/>
             <w:r>
               <w:rPr>
-                <w:rFonts w:ascii="맑은 고딕" w:hAnsi="맑은 고딕" w:eastAsia="맑은 고딕" w:cs="맑은 고딕"/>
+                <w:rFonts w:ascii="Apple SD Gothic Neo" w:hAnsi="Apple SD Gothic Neo" w:eastAsia="Apple SD Gothic Neo" w:cs="Apple SD Gothic Neo"/>
                 <w:b w:val="0"/>
                 <w:sz w:val="20"/>
               </w:rPr>
@@ -2402,7 +2402,7 @@
             <w:r/>
             <w:r>
               <w:rPr>
-                <w:rFonts w:ascii="맑은 고딕" w:hAnsi="맑은 고딕" w:eastAsia="맑은 고딕" w:cs="맑은 고딕"/>
+                <w:rFonts w:ascii="Apple SD Gothic Neo" w:hAnsi="Apple SD Gothic Neo" w:eastAsia="Apple SD Gothic Neo" w:cs="Apple SD Gothic Neo"/>
                 <w:b w:val="0"/>
                 <w:sz w:val="20"/>
               </w:rPr>
@@ -2423,7 +2423,7 @@
             <w:r/>
             <w:r>
               <w:rPr>
-                <w:rFonts w:ascii="맑은 고딕" w:hAnsi="맑은 고딕" w:eastAsia="맑은 고딕" w:cs="맑은 고딕"/>
+                <w:rFonts w:ascii="Apple SD Gothic Neo" w:hAnsi="Apple SD Gothic Neo" w:eastAsia="Apple SD Gothic Neo" w:cs="Apple SD Gothic Neo"/>
                 <w:b w:val="0"/>
                 <w:sz w:val="20"/>
               </w:rPr>
@@ -2447,7 +2447,7 @@
             <w:r/>
             <w:r>
               <w:rPr>
-                <w:rFonts w:ascii="맑은 고딕" w:hAnsi="맑은 고딕" w:eastAsia="맑은 고딕" w:cs="맑은 고딕"/>
+                <w:rFonts w:ascii="Apple SD Gothic Neo" w:hAnsi="Apple SD Gothic Neo" w:eastAsia="Apple SD Gothic Neo" w:cs="Apple SD Gothic Neo"/>
                 <w:b w:val="0"/>
                 <w:sz w:val="20"/>
               </w:rPr>
@@ -2469,7 +2469,7 @@
             <w:r/>
             <w:r>
               <w:rPr>
-                <w:rFonts w:ascii="맑은 고딕" w:hAnsi="맑은 고딕" w:eastAsia="맑은 고딕" w:cs="맑은 고딕"/>
+                <w:rFonts w:ascii="Apple SD Gothic Neo" w:hAnsi="Apple SD Gothic Neo" w:eastAsia="Apple SD Gothic Neo" w:cs="Apple SD Gothic Neo"/>
                 <w:b w:val="0"/>
                 <w:sz w:val="20"/>
               </w:rPr>
@@ -2492,7 +2492,7 @@
             <w:r/>
             <w:r>
               <w:rPr>
-                <w:rFonts w:ascii="맑은 고딕" w:hAnsi="맑은 고딕" w:eastAsia="맑은 고딕" w:cs="맑은 고딕"/>
+                <w:rFonts w:ascii="Apple SD Gothic Neo" w:hAnsi="Apple SD Gothic Neo" w:eastAsia="Apple SD Gothic Neo" w:cs="Apple SD Gothic Neo"/>
                 <w:b w:val="0"/>
                 <w:sz w:val="20"/>
               </w:rPr>
@@ -2513,7 +2513,7 @@
             <w:r/>
             <w:r>
               <w:rPr>
-                <w:rFonts w:ascii="맑은 고딕" w:hAnsi="맑은 고딕" w:eastAsia="맑은 고딕" w:cs="맑은 고딕"/>
+                <w:rFonts w:ascii="Apple SD Gothic Neo" w:hAnsi="Apple SD Gothic Neo" w:eastAsia="Apple SD Gothic Neo" w:cs="Apple SD Gothic Neo"/>
                 <w:b w:val="0"/>
                 <w:sz w:val="20"/>
               </w:rPr>
@@ -2537,7 +2537,7 @@
             <w:r/>
             <w:r>
               <w:rPr>
-                <w:rFonts w:ascii="맑은 고딕" w:hAnsi="맑은 고딕" w:eastAsia="맑은 고딕" w:cs="맑은 고딕"/>
+                <w:rFonts w:ascii="Apple SD Gothic Neo" w:hAnsi="Apple SD Gothic Neo" w:eastAsia="Apple SD Gothic Neo" w:cs="Apple SD Gothic Neo"/>
                 <w:b w:val="0"/>
                 <w:sz w:val="20"/>
               </w:rPr>
@@ -2559,7 +2559,7 @@
             <w:r/>
             <w:r>
               <w:rPr>
-                <w:rFonts w:ascii="맑은 고딕" w:hAnsi="맑은 고딕" w:eastAsia="맑은 고딕" w:cs="맑은 고딕"/>
+                <w:rFonts w:ascii="Apple SD Gothic Neo" w:hAnsi="Apple SD Gothic Neo" w:eastAsia="Apple SD Gothic Neo" w:cs="Apple SD Gothic Neo"/>
                 <w:b w:val="0"/>
                 <w:sz w:val="20"/>
               </w:rPr>
@@ -2582,7 +2582,7 @@
             <w:r/>
             <w:r>
               <w:rPr>
-                <w:rFonts w:ascii="맑은 고딕" w:hAnsi="맑은 고딕" w:eastAsia="맑은 고딕" w:cs="맑은 고딕"/>
+                <w:rFonts w:ascii="Apple SD Gothic Neo" w:hAnsi="Apple SD Gothic Neo" w:eastAsia="Apple SD Gothic Neo" w:cs="Apple SD Gothic Neo"/>
                 <w:b w:val="0"/>
                 <w:sz w:val="20"/>
               </w:rPr>
@@ -2603,7 +2603,7 @@
             <w:r/>
             <w:r>
               <w:rPr>
-                <w:rFonts w:ascii="맑은 고딕" w:hAnsi="맑은 고딕" w:eastAsia="맑은 고딕" w:cs="맑은 고딕"/>
+                <w:rFonts w:ascii="Apple SD Gothic Neo" w:hAnsi="Apple SD Gothic Neo" w:eastAsia="Apple SD Gothic Neo" w:cs="Apple SD Gothic Neo"/>
                 <w:b w:val="0"/>
                 <w:sz w:val="20"/>
               </w:rPr>
@@ -2619,7 +2619,7 @@
       </w:pPr>
       <w:r>
         <w:rPr>
-          <w:rFonts w:ascii="맑은 고딕" w:hAnsi="맑은 고딕" w:eastAsia="맑은 고딕" w:cs="맑은 고딕"/>
+          <w:rFonts w:ascii="Apple SD Gothic Neo" w:hAnsi="Apple SD Gothic Neo" w:eastAsia="Apple SD Gothic Neo" w:cs="Apple SD Gothic Neo"/>
           <w:b w:val="0"/>
           <w:i w:val="0"/>
           <w:sz w:val="2"/>
@@ -2633,7 +2633,7 @@
       </w:pPr>
       <w:r>
         <w:rPr>
-          <w:rFonts w:ascii="맑은 고딕" w:hAnsi="맑은 고딕" w:eastAsia="맑은 고딕" w:cs="맑은 고딕"/>
+          <w:rFonts w:ascii="Apple SD Gothic Neo" w:hAnsi="Apple SD Gothic Neo" w:eastAsia="Apple SD Gothic Neo" w:cs="Apple SD Gothic Neo"/>
           <w:b/>
           <w:color w:val="2E75B6"/>
           <w:sz w:val="25"/>
@@ -2667,7 +2667,7 @@
             <w:r/>
             <w:r>
               <w:rPr>
-                <w:rFonts w:ascii="맑은 고딕" w:hAnsi="맑은 고딕" w:eastAsia="맑은 고딕" w:cs="맑은 고딕"/>
+                <w:rFonts w:ascii="Apple SD Gothic Neo" w:hAnsi="Apple SD Gothic Neo" w:eastAsia="Apple SD Gothic Neo" w:cs="Apple SD Gothic Neo"/>
                 <w:b/>
                 <w:color w:val="FFFFFF"/>
                 <w:sz w:val="21"/>
@@ -2690,7 +2690,7 @@
             <w:r/>
             <w:r>
               <w:rPr>
-                <w:rFonts w:ascii="맑은 고딕" w:hAnsi="맑은 고딕" w:eastAsia="맑은 고딕" w:cs="맑은 고딕"/>
+                <w:rFonts w:ascii="Apple SD Gothic Neo" w:hAnsi="Apple SD Gothic Neo" w:eastAsia="Apple SD Gothic Neo" w:cs="Apple SD Gothic Neo"/>
                 <w:b/>
                 <w:color w:val="FFFFFF"/>
                 <w:sz w:val="21"/>
@@ -2714,7 +2714,7 @@
             <w:r/>
             <w:r>
               <w:rPr>
-                <w:rFonts w:ascii="맑은 고딕" w:hAnsi="맑은 고딕" w:eastAsia="맑은 고딕" w:cs="맑은 고딕"/>
+                <w:rFonts w:ascii="Apple SD Gothic Neo" w:hAnsi="Apple SD Gothic Neo" w:eastAsia="Apple SD Gothic Neo" w:cs="Apple SD Gothic Neo"/>
                 <w:b w:val="0"/>
                 <w:sz w:val="20"/>
               </w:rPr>
@@ -2735,7 +2735,7 @@
             <w:r/>
             <w:r>
               <w:rPr>
-                <w:rFonts w:ascii="맑은 고딕" w:hAnsi="맑은 고딕" w:eastAsia="맑은 고딕" w:cs="맑은 고딕"/>
+                <w:rFonts w:ascii="Apple SD Gothic Neo" w:hAnsi="Apple SD Gothic Neo" w:eastAsia="Apple SD Gothic Neo" w:cs="Apple SD Gothic Neo"/>
                 <w:b w:val="0"/>
                 <w:sz w:val="20"/>
               </w:rPr>
@@ -2759,7 +2759,7 @@
             <w:r/>
             <w:r>
               <w:rPr>
-                <w:rFonts w:ascii="맑은 고딕" w:hAnsi="맑은 고딕" w:eastAsia="맑은 고딕" w:cs="맑은 고딕"/>
+                <w:rFonts w:ascii="Apple SD Gothic Neo" w:hAnsi="Apple SD Gothic Neo" w:eastAsia="Apple SD Gothic Neo" w:cs="Apple SD Gothic Neo"/>
                 <w:b w:val="0"/>
                 <w:sz w:val="20"/>
               </w:rPr>
@@ -2781,7 +2781,7 @@
             <w:r/>
             <w:r>
               <w:rPr>
-                <w:rFonts w:ascii="맑은 고딕" w:hAnsi="맑은 고딕" w:eastAsia="맑은 고딕" w:cs="맑은 고딕"/>
+                <w:rFonts w:ascii="Apple SD Gothic Neo" w:hAnsi="Apple SD Gothic Neo" w:eastAsia="Apple SD Gothic Neo" w:cs="Apple SD Gothic Neo"/>
                 <w:b w:val="0"/>
                 <w:sz w:val="20"/>
               </w:rPr>
@@ -2804,7 +2804,7 @@
             <w:r/>
             <w:r>
               <w:rPr>
-                <w:rFonts w:ascii="맑은 고딕" w:hAnsi="맑은 고딕" w:eastAsia="맑은 고딕" w:cs="맑은 고딕"/>
+                <w:rFonts w:ascii="Apple SD Gothic Neo" w:hAnsi="Apple SD Gothic Neo" w:eastAsia="Apple SD Gothic Neo" w:cs="Apple SD Gothic Neo"/>
                 <w:b w:val="0"/>
                 <w:sz w:val="20"/>
               </w:rPr>
@@ -2825,7 +2825,7 @@
             <w:r/>
             <w:r>
               <w:rPr>
-                <w:rFonts w:ascii="맑은 고딕" w:hAnsi="맑은 고딕" w:eastAsia="맑은 고딕" w:cs="맑은 고딕"/>
+                <w:rFonts w:ascii="Apple SD Gothic Neo" w:hAnsi="Apple SD Gothic Neo" w:eastAsia="Apple SD Gothic Neo" w:cs="Apple SD Gothic Neo"/>
                 <w:b w:val="0"/>
                 <w:sz w:val="20"/>
               </w:rPr>
@@ -2849,7 +2849,7 @@
             <w:r/>
             <w:r>
               <w:rPr>
-                <w:rFonts w:ascii="맑은 고딕" w:hAnsi="맑은 고딕" w:eastAsia="맑은 고딕" w:cs="맑은 고딕"/>
+                <w:rFonts w:ascii="Apple SD Gothic Neo" w:hAnsi="Apple SD Gothic Neo" w:eastAsia="Apple SD Gothic Neo" w:cs="Apple SD Gothic Neo"/>
                 <w:b w:val="0"/>
                 <w:sz w:val="20"/>
               </w:rPr>
@@ -2871,7 +2871,7 @@
             <w:r/>
             <w:r>
               <w:rPr>
-                <w:rFonts w:ascii="맑은 고딕" w:hAnsi="맑은 고딕" w:eastAsia="맑은 고딕" w:cs="맑은 고딕"/>
+                <w:rFonts w:ascii="Apple SD Gothic Neo" w:hAnsi="Apple SD Gothic Neo" w:eastAsia="Apple SD Gothic Neo" w:cs="Apple SD Gothic Neo"/>
                 <w:b w:val="0"/>
                 <w:sz w:val="20"/>
               </w:rPr>
@@ -2894,7 +2894,7 @@
             <w:r/>
             <w:r>
               <w:rPr>
-                <w:rFonts w:ascii="맑은 고딕" w:hAnsi="맑은 고딕" w:eastAsia="맑은 고딕" w:cs="맑은 고딕"/>
+                <w:rFonts w:ascii="Apple SD Gothic Neo" w:hAnsi="Apple SD Gothic Neo" w:eastAsia="Apple SD Gothic Neo" w:cs="Apple SD Gothic Neo"/>
                 <w:b w:val="0"/>
                 <w:sz w:val="20"/>
               </w:rPr>
@@ -2915,7 +2915,7 @@
             <w:r/>
             <w:r>
               <w:rPr>
-                <w:rFonts w:ascii="맑은 고딕" w:hAnsi="맑은 고딕" w:eastAsia="맑은 고딕" w:cs="맑은 고딕"/>
+                <w:rFonts w:ascii="Apple SD Gothic Neo" w:hAnsi="Apple SD Gothic Neo" w:eastAsia="Apple SD Gothic Neo" w:cs="Apple SD Gothic Neo"/>
                 <w:b w:val="0"/>
                 <w:sz w:val="20"/>
               </w:rPr>
@@ -2931,7 +2931,7 @@
       </w:pPr>
       <w:r>
         <w:rPr>
-          <w:rFonts w:ascii="맑은 고딕" w:hAnsi="맑은 고딕" w:eastAsia="맑은 고딕" w:cs="맑은 고딕"/>
+          <w:rFonts w:ascii="Apple SD Gothic Neo" w:hAnsi="Apple SD Gothic Neo" w:eastAsia="Apple SD Gothic Neo" w:cs="Apple SD Gothic Neo"/>
           <w:b w:val="0"/>
           <w:i w:val="0"/>
           <w:sz w:val="2"/>
@@ -2945,7 +2945,7 @@
       </w:pPr>
       <w:r>
         <w:rPr>
-          <w:rFonts w:ascii="맑은 고딕" w:hAnsi="맑은 고딕" w:eastAsia="맑은 고딕" w:cs="맑은 고딕"/>
+          <w:rFonts w:ascii="Apple SD Gothic Neo" w:hAnsi="Apple SD Gothic Neo" w:eastAsia="Apple SD Gothic Neo" w:cs="Apple SD Gothic Neo"/>
           <w:b/>
           <w:color w:val="2E75B6"/>
           <w:sz w:val="25"/>
@@ -2979,7 +2979,7 @@
             <w:r/>
             <w:r>
               <w:rPr>
-                <w:rFonts w:ascii="맑은 고딕" w:hAnsi="맑은 고딕" w:eastAsia="맑은 고딕" w:cs="맑은 고딕"/>
+                <w:rFonts w:ascii="Apple SD Gothic Neo" w:hAnsi="Apple SD Gothic Neo" w:eastAsia="Apple SD Gothic Neo" w:cs="Apple SD Gothic Neo"/>
                 <w:b/>
                 <w:color w:val="FFFFFF"/>
                 <w:sz w:val="21"/>
@@ -3002,7 +3002,7 @@
             <w:r/>
             <w:r>
               <w:rPr>
-                <w:rFonts w:ascii="맑은 고딕" w:hAnsi="맑은 고딕" w:eastAsia="맑은 고딕" w:cs="맑은 고딕"/>
+                <w:rFonts w:ascii="Apple SD Gothic Neo" w:hAnsi="Apple SD Gothic Neo" w:eastAsia="Apple SD Gothic Neo" w:cs="Apple SD Gothic Neo"/>
                 <w:b/>
                 <w:color w:val="FFFFFF"/>
                 <w:sz w:val="21"/>
@@ -3026,7 +3026,7 @@
             <w:r/>
             <w:r>
               <w:rPr>
-                <w:rFonts w:ascii="맑은 고딕" w:hAnsi="맑은 고딕" w:eastAsia="맑은 고딕" w:cs="맑은 고딕"/>
+                <w:rFonts w:ascii="Apple SD Gothic Neo" w:hAnsi="Apple SD Gothic Neo" w:eastAsia="Apple SD Gothic Neo" w:cs="Apple SD Gothic Neo"/>
                 <w:b w:val="0"/>
                 <w:sz w:val="20"/>
               </w:rPr>
@@ -3047,7 +3047,7 @@
             <w:r/>
             <w:r>
               <w:rPr>
-                <w:rFonts w:ascii="맑은 고딕" w:hAnsi="맑은 고딕" w:eastAsia="맑은 고딕" w:cs="맑은 고딕"/>
+                <w:rFonts w:ascii="Apple SD Gothic Neo" w:hAnsi="Apple SD Gothic Neo" w:eastAsia="Apple SD Gothic Neo" w:cs="Apple SD Gothic Neo"/>
                 <w:b w:val="0"/>
                 <w:sz w:val="20"/>
               </w:rPr>
@@ -3071,7 +3071,7 @@
             <w:r/>
             <w:r>
               <w:rPr>
-                <w:rFonts w:ascii="맑은 고딕" w:hAnsi="맑은 고딕" w:eastAsia="맑은 고딕" w:cs="맑은 고딕"/>
+                <w:rFonts w:ascii="Apple SD Gothic Neo" w:hAnsi="Apple SD Gothic Neo" w:eastAsia="Apple SD Gothic Neo" w:cs="Apple SD Gothic Neo"/>
                 <w:b w:val="0"/>
                 <w:sz w:val="20"/>
               </w:rPr>
@@ -3093,7 +3093,7 @@
             <w:r/>
             <w:r>
               <w:rPr>
-                <w:rFonts w:ascii="맑은 고딕" w:hAnsi="맑은 고딕" w:eastAsia="맑은 고딕" w:cs="맑은 고딕"/>
+                <w:rFonts w:ascii="Apple SD Gothic Neo" w:hAnsi="Apple SD Gothic Neo" w:eastAsia="Apple SD Gothic Neo" w:cs="Apple SD Gothic Neo"/>
                 <w:b w:val="0"/>
                 <w:sz w:val="20"/>
               </w:rPr>
@@ -3117,7 +3117,7 @@
             <w:r/>
             <w:r>
               <w:rPr>
-                <w:rFonts w:ascii="맑은 고딕" w:hAnsi="맑은 고딕" w:eastAsia="맑은 고딕" w:cs="맑은 고딕"/>
+                <w:rFonts w:ascii="Apple SD Gothic Neo" w:hAnsi="Apple SD Gothic Neo" w:eastAsia="Apple SD Gothic Neo" w:cs="Apple SD Gothic Neo"/>
                 <w:b w:val="0"/>
                 <w:sz w:val="20"/>
               </w:rPr>
@@ -3139,7 +3139,7 @@
             <w:r/>
             <w:r>
               <w:rPr>
-                <w:rFonts w:ascii="맑은 고딕" w:hAnsi="맑은 고딕" w:eastAsia="맑은 고딕" w:cs="맑은 고딕"/>
+                <w:rFonts w:ascii="Apple SD Gothic Neo" w:hAnsi="Apple SD Gothic Neo" w:eastAsia="Apple SD Gothic Neo" w:cs="Apple SD Gothic Neo"/>
                 <w:b w:val="0"/>
                 <w:sz w:val="20"/>
               </w:rPr>
@@ -3162,7 +3162,7 @@
             <w:r/>
             <w:r>
               <w:rPr>
-                <w:rFonts w:ascii="맑은 고딕" w:hAnsi="맑은 고딕" w:eastAsia="맑은 고딕" w:cs="맑은 고딕"/>
+                <w:rFonts w:ascii="Apple SD Gothic Neo" w:hAnsi="Apple SD Gothic Neo" w:eastAsia="Apple SD Gothic Neo" w:cs="Apple SD Gothic Neo"/>
                 <w:b w:val="0"/>
                 <w:sz w:val="20"/>
               </w:rPr>
@@ -3183,7 +3183,7 @@
             <w:r/>
             <w:r>
               <w:rPr>
-                <w:rFonts w:ascii="맑은 고딕" w:hAnsi="맑은 고딕" w:eastAsia="맑은 고딕" w:cs="맑은 고딕"/>
+                <w:rFonts w:ascii="Apple SD Gothic Neo" w:hAnsi="Apple SD Gothic Neo" w:eastAsia="Apple SD Gothic Neo" w:cs="Apple SD Gothic Neo"/>
                 <w:b w:val="0"/>
                 <w:sz w:val="20"/>
               </w:rPr>
@@ -3199,7 +3199,7 @@
       </w:pPr>
       <w:r>
         <w:rPr>
-          <w:rFonts w:ascii="맑은 고딕" w:hAnsi="맑은 고딕" w:eastAsia="맑은 고딕" w:cs="맑은 고딕"/>
+          <w:rFonts w:ascii="Apple SD Gothic Neo" w:hAnsi="Apple SD Gothic Neo" w:eastAsia="Apple SD Gothic Neo" w:cs="Apple SD Gothic Neo"/>
           <w:b w:val="0"/>
           <w:i w:val="0"/>
           <w:sz w:val="2"/>
@@ -3213,7 +3213,7 @@
       </w:pPr>
       <w:r>
         <w:rPr>
-          <w:rFonts w:ascii="맑은 고딕" w:hAnsi="맑은 고딕" w:eastAsia="맑은 고딕" w:cs="맑은 고딕"/>
+          <w:rFonts w:ascii="Apple SD Gothic Neo" w:hAnsi="Apple SD Gothic Neo" w:eastAsia="Apple SD Gothic Neo" w:cs="Apple SD Gothic Neo"/>
           <w:b/>
           <w:color w:val="2E75B6"/>
           <w:sz w:val="25"/>
@@ -3247,7 +3247,7 @@
             <w:r/>
             <w:r>
               <w:rPr>
-                <w:rFonts w:ascii="맑은 고딕" w:hAnsi="맑은 고딕" w:eastAsia="맑은 고딕" w:cs="맑은 고딕"/>
+                <w:rFonts w:ascii="Apple SD Gothic Neo" w:hAnsi="Apple SD Gothic Neo" w:eastAsia="Apple SD Gothic Neo" w:cs="Apple SD Gothic Neo"/>
                 <w:b/>
                 <w:color w:val="FFFFFF"/>
                 <w:sz w:val="21"/>
@@ -3270,7 +3270,7 @@
             <w:r/>
             <w:r>
               <w:rPr>
-                <w:rFonts w:ascii="맑은 고딕" w:hAnsi="맑은 고딕" w:eastAsia="맑은 고딕" w:cs="맑은 고딕"/>
+                <w:rFonts w:ascii="Apple SD Gothic Neo" w:hAnsi="Apple SD Gothic Neo" w:eastAsia="Apple SD Gothic Neo" w:cs="Apple SD Gothic Neo"/>
                 <w:b/>
                 <w:color w:val="FFFFFF"/>
                 <w:sz w:val="21"/>
@@ -3294,7 +3294,7 @@
             <w:r/>
             <w:r>
               <w:rPr>
-                <w:rFonts w:ascii="맑은 고딕" w:hAnsi="맑은 고딕" w:eastAsia="맑은 고딕" w:cs="맑은 고딕"/>
+                <w:rFonts w:ascii="Apple SD Gothic Neo" w:hAnsi="Apple SD Gothic Neo" w:eastAsia="Apple SD Gothic Neo" w:cs="Apple SD Gothic Neo"/>
                 <w:b w:val="0"/>
                 <w:sz w:val="20"/>
               </w:rPr>
@@ -3315,7 +3315,7 @@
             <w:r/>
             <w:r>
               <w:rPr>
-                <w:rFonts w:ascii="맑은 고딕" w:hAnsi="맑은 고딕" w:eastAsia="맑은 고딕" w:cs="맑은 고딕"/>
+                <w:rFonts w:ascii="Apple SD Gothic Neo" w:hAnsi="Apple SD Gothic Neo" w:eastAsia="Apple SD Gothic Neo" w:cs="Apple SD Gothic Neo"/>
                 <w:b w:val="0"/>
                 <w:sz w:val="20"/>
               </w:rPr>
@@ -3339,7 +3339,7 @@
             <w:r/>
             <w:r>
               <w:rPr>
-                <w:rFonts w:ascii="맑은 고딕" w:hAnsi="맑은 고딕" w:eastAsia="맑은 고딕" w:cs="맑은 고딕"/>
+                <w:rFonts w:ascii="Apple SD Gothic Neo" w:hAnsi="Apple SD Gothic Neo" w:eastAsia="Apple SD Gothic Neo" w:cs="Apple SD Gothic Neo"/>
                 <w:b w:val="0"/>
                 <w:sz w:val="20"/>
               </w:rPr>
@@ -3361,7 +3361,7 @@
             <w:r/>
             <w:r>
               <w:rPr>
-                <w:rFonts w:ascii="맑은 고딕" w:hAnsi="맑은 고딕" w:eastAsia="맑은 고딕" w:cs="맑은 고딕"/>
+                <w:rFonts w:ascii="Apple SD Gothic Neo" w:hAnsi="Apple SD Gothic Neo" w:eastAsia="Apple SD Gothic Neo" w:cs="Apple SD Gothic Neo"/>
                 <w:b w:val="0"/>
                 <w:sz w:val="20"/>
               </w:rPr>
@@ -3384,7 +3384,7 @@
             <w:r/>
             <w:r>
               <w:rPr>
-                <w:rFonts w:ascii="맑은 고딕" w:hAnsi="맑은 고딕" w:eastAsia="맑은 고딕" w:cs="맑은 고딕"/>
+                <w:rFonts w:ascii="Apple SD Gothic Neo" w:hAnsi="Apple SD Gothic Neo" w:eastAsia="Apple SD Gothic Neo" w:cs="Apple SD Gothic Neo"/>
                 <w:b w:val="0"/>
                 <w:sz w:val="20"/>
               </w:rPr>
@@ -3405,7 +3405,7 @@
             <w:r/>
             <w:r>
               <w:rPr>
-                <w:rFonts w:ascii="맑은 고딕" w:hAnsi="맑은 고딕" w:eastAsia="맑은 고딕" w:cs="맑은 고딕"/>
+                <w:rFonts w:ascii="Apple SD Gothic Neo" w:hAnsi="Apple SD Gothic Neo" w:eastAsia="Apple SD Gothic Neo" w:cs="Apple SD Gothic Neo"/>
                 <w:b w:val="0"/>
                 <w:sz w:val="20"/>
               </w:rPr>
@@ -3429,7 +3429,7 @@
             <w:r/>
             <w:r>
               <w:rPr>
-                <w:rFonts w:ascii="맑은 고딕" w:hAnsi="맑은 고딕" w:eastAsia="맑은 고딕" w:cs="맑은 고딕"/>
+                <w:rFonts w:ascii="Apple SD Gothic Neo" w:hAnsi="Apple SD Gothic Neo" w:eastAsia="Apple SD Gothic Neo" w:cs="Apple SD Gothic Neo"/>
                 <w:b w:val="0"/>
                 <w:sz w:val="20"/>
               </w:rPr>
@@ -3451,7 +3451,7 @@
             <w:r/>
             <w:r>
               <w:rPr>
-                <w:rFonts w:ascii="맑은 고딕" w:hAnsi="맑은 고딕" w:eastAsia="맑은 고딕" w:cs="맑은 고딕"/>
+                <w:rFonts w:ascii="Apple SD Gothic Neo" w:hAnsi="Apple SD Gothic Neo" w:eastAsia="Apple SD Gothic Neo" w:cs="Apple SD Gothic Neo"/>
                 <w:b w:val="0"/>
                 <w:sz w:val="20"/>
               </w:rPr>
@@ -3474,7 +3474,7 @@
             <w:r/>
             <w:r>
               <w:rPr>
-                <w:rFonts w:ascii="맑은 고딕" w:hAnsi="맑은 고딕" w:eastAsia="맑은 고딕" w:cs="맑은 고딕"/>
+                <w:rFonts w:ascii="Apple SD Gothic Neo" w:hAnsi="Apple SD Gothic Neo" w:eastAsia="Apple SD Gothic Neo" w:cs="Apple SD Gothic Neo"/>
                 <w:b w:val="0"/>
                 <w:sz w:val="20"/>
               </w:rPr>
@@ -3495,7 +3495,7 @@
             <w:r/>
             <w:r>
               <w:rPr>
-                <w:rFonts w:ascii="맑은 고딕" w:hAnsi="맑은 고딕" w:eastAsia="맑은 고딕" w:cs="맑은 고딕"/>
+                <w:rFonts w:ascii="Apple SD Gothic Neo" w:hAnsi="Apple SD Gothic Neo" w:eastAsia="Apple SD Gothic Neo" w:cs="Apple SD Gothic Neo"/>
                 <w:b w:val="0"/>
                 <w:sz w:val="20"/>
               </w:rPr>
@@ -3519,7 +3519,7 @@
             <w:r/>
             <w:r>
               <w:rPr>
-                <w:rFonts w:ascii="맑은 고딕" w:hAnsi="맑은 고딕" w:eastAsia="맑은 고딕" w:cs="맑은 고딕"/>
+                <w:rFonts w:ascii="Apple SD Gothic Neo" w:hAnsi="Apple SD Gothic Neo" w:eastAsia="Apple SD Gothic Neo" w:cs="Apple SD Gothic Neo"/>
                 <w:b w:val="0"/>
                 <w:sz w:val="20"/>
               </w:rPr>
@@ -3541,7 +3541,7 @@
             <w:r/>
             <w:r>
               <w:rPr>
-                <w:rFonts w:ascii="맑은 고딕" w:hAnsi="맑은 고딕" w:eastAsia="맑은 고딕" w:cs="맑은 고딕"/>
+                <w:rFonts w:ascii="Apple SD Gothic Neo" w:hAnsi="Apple SD Gothic Neo" w:eastAsia="Apple SD Gothic Neo" w:cs="Apple SD Gothic Neo"/>
                 <w:b w:val="0"/>
                 <w:sz w:val="20"/>
               </w:rPr>
@@ -3564,7 +3564,7 @@
             <w:r/>
             <w:r>
               <w:rPr>
-                <w:rFonts w:ascii="맑은 고딕" w:hAnsi="맑은 고딕" w:eastAsia="맑은 고딕" w:cs="맑은 고딕"/>
+                <w:rFonts w:ascii="Apple SD Gothic Neo" w:hAnsi="Apple SD Gothic Neo" w:eastAsia="Apple SD Gothic Neo" w:cs="Apple SD Gothic Neo"/>
                 <w:b w:val="0"/>
                 <w:sz w:val="20"/>
               </w:rPr>
@@ -3585,7 +3585,7 @@
             <w:r/>
             <w:r>
               <w:rPr>
-                <w:rFonts w:ascii="맑은 고딕" w:hAnsi="맑은 고딕" w:eastAsia="맑은 고딕" w:cs="맑은 고딕"/>
+                <w:rFonts w:ascii="Apple SD Gothic Neo" w:hAnsi="Apple SD Gothic Neo" w:eastAsia="Apple SD Gothic Neo" w:cs="Apple SD Gothic Neo"/>
                 <w:b w:val="0"/>
                 <w:sz w:val="20"/>
               </w:rPr>
@@ -3601,7 +3601,7 @@
       </w:pPr>
       <w:r>
         <w:rPr>
-          <w:rFonts w:ascii="맑은 고딕" w:hAnsi="맑은 고딕" w:eastAsia="맑은 고딕" w:cs="맑은 고딕"/>
+          <w:rFonts w:ascii="Apple SD Gothic Neo" w:hAnsi="Apple SD Gothic Neo" w:eastAsia="Apple SD Gothic Neo" w:cs="Apple SD Gothic Neo"/>
           <w:b w:val="0"/>
           <w:i w:val="0"/>
           <w:sz w:val="2"/>
@@ -3615,7 +3615,7 @@
       </w:pPr>
       <w:r>
         <w:rPr>
-          <w:rFonts w:ascii="맑은 고딕" w:hAnsi="맑은 고딕" w:eastAsia="맑은 고딕" w:cs="맑은 고딕"/>
+          <w:rFonts w:ascii="Apple SD Gothic Neo" w:hAnsi="Apple SD Gothic Neo" w:eastAsia="Apple SD Gothic Neo" w:cs="Apple SD Gothic Neo"/>
           <w:b/>
           <w:color w:val="1F4E78"/>
           <w:sz w:val="30"/>
@@ -3630,7 +3630,7 @@
       </w:pPr>
       <w:r>
         <w:rPr>
-          <w:rFonts w:ascii="맑은 고딕" w:hAnsi="맑은 고딕" w:eastAsia="맑은 고딕" w:cs="맑은 고딕"/>
+          <w:rFonts w:ascii="Apple SD Gothic Neo" w:hAnsi="Apple SD Gothic Neo" w:eastAsia="Apple SD Gothic Neo" w:cs="Apple SD Gothic Neo"/>
           <w:b/>
           <w:color w:val="2E75B6"/>
           <w:sz w:val="25"/>
@@ -3645,7 +3645,7 @@
       </w:pPr>
       <w:r>
         <w:rPr>
-          <w:rFonts w:ascii="맑은 고딕" w:hAnsi="맑은 고딕" w:eastAsia="맑은 고딕" w:cs="맑은 고딕"/>
+          <w:rFonts w:ascii="Apple SD Gothic Neo" w:hAnsi="Apple SD Gothic Neo" w:eastAsia="Apple SD Gothic Neo" w:cs="Apple SD Gothic Neo"/>
           <w:sz w:val="21"/>
         </w:rPr>
         <w:t>클라우드/서버: 가비아 등 일반 호스팅 서버를 우선 사용 (출시 직후). 트래픽 증가 시 AWS 등 확장 가능 구조로 설계.</w:t>
@@ -3658,7 +3658,7 @@
       </w:pPr>
       <w:r>
         <w:rPr>
-          <w:rFonts w:ascii="맑은 고딕" w:hAnsi="맑은 고딕" w:eastAsia="맑은 고딕" w:cs="맑은 고딕"/>
+          <w:rFonts w:ascii="Apple SD Gothic Neo" w:hAnsi="Apple SD Gothic Neo" w:eastAsia="Apple SD Gothic Neo" w:cs="Apple SD Gothic Neo"/>
           <w:sz w:val="21"/>
         </w:rPr>
         <w:t>백엔드: 마이크로서비스 또는 모듈러 모놀리스 구조 (수행사 제안). API는 RESTful 또는 GraphQL 명세 제공 의무.</w:t>
@@ -3671,7 +3671,7 @@
       </w:pPr>
       <w:r>
         <w:rPr>
-          <w:rFonts w:ascii="맑은 고딕" w:hAnsi="맑은 고딕" w:eastAsia="맑은 고딕" w:cs="맑은 고딕"/>
+          <w:rFonts w:ascii="Apple SD Gothic Neo" w:hAnsi="Apple SD Gothic Neo" w:eastAsia="Apple SD Gothic Neo" w:cs="Apple SD Gothic Neo"/>
           <w:sz w:val="21"/>
         </w:rPr>
         <w:t>데이터베이스: 트랜잭션성 데이터(RDB) + 시계열/로그 데이터(별도 저장소) 이원화 권장.</w:t>
@@ -3684,7 +3684,7 @@
       </w:pPr>
       <w:r>
         <w:rPr>
-          <w:rFonts w:ascii="맑은 고딕" w:hAnsi="맑은 고딕" w:eastAsia="맑은 고딕" w:cs="맑은 고딕"/>
+          <w:rFonts w:ascii="Apple SD Gothic Neo" w:hAnsi="Apple SD Gothic Neo" w:eastAsia="Apple SD Gothic Neo" w:cs="Apple SD Gothic Neo"/>
           <w:sz w:val="21"/>
         </w:rPr>
         <w:t>CI/CD: Git 기반 형상관리, 자동 빌드/배포 파이프라인 구축 의무.</w:t>
@@ -3697,7 +3697,7 @@
       </w:pPr>
       <w:r>
         <w:rPr>
-          <w:rFonts w:ascii="맑은 고딕" w:hAnsi="맑은 고딕" w:eastAsia="맑은 고딕" w:cs="맑은 고딕"/>
+          <w:rFonts w:ascii="Apple SD Gothic Neo" w:hAnsi="Apple SD Gothic Neo" w:eastAsia="Apple SD Gothic Neo" w:cs="Apple SD Gothic Neo"/>
           <w:sz w:val="21"/>
         </w:rPr>
         <w:t>관측성: 로그, 메트릭, 알림 체계 구축 (Sentry 또는 동급, CloudWatch 또는 동급).</w:t>
@@ -3710,7 +3710,7 @@
       </w:pPr>
       <w:r>
         <w:rPr>
-          <w:rFonts w:ascii="맑은 고딕" w:hAnsi="맑은 고딕" w:eastAsia="맑은 고딕" w:cs="맑은 고딕"/>
+          <w:rFonts w:ascii="Apple SD Gothic Neo" w:hAnsi="Apple SD Gothic Neo" w:eastAsia="Apple SD Gothic Neo" w:cs="Apple SD Gothic Neo"/>
           <w:b/>
           <w:color w:val="2E75B6"/>
           <w:sz w:val="25"/>
@@ -3744,7 +3744,7 @@
             <w:r/>
             <w:r>
               <w:rPr>
-                <w:rFonts w:ascii="맑은 고딕" w:hAnsi="맑은 고딕" w:eastAsia="맑은 고딕" w:cs="맑은 고딕"/>
+                <w:rFonts w:ascii="Apple SD Gothic Neo" w:hAnsi="Apple SD Gothic Neo" w:eastAsia="Apple SD Gothic Neo" w:cs="Apple SD Gothic Neo"/>
                 <w:b/>
                 <w:color w:val="FFFFFF"/>
                 <w:sz w:val="21"/>
@@ -3767,7 +3767,7 @@
             <w:r/>
             <w:r>
               <w:rPr>
-                <w:rFonts w:ascii="맑은 고딕" w:hAnsi="맑은 고딕" w:eastAsia="맑은 고딕" w:cs="맑은 고딕"/>
+                <w:rFonts w:ascii="Apple SD Gothic Neo" w:hAnsi="Apple SD Gothic Neo" w:eastAsia="Apple SD Gothic Neo" w:cs="Apple SD Gothic Neo"/>
                 <w:b/>
                 <w:color w:val="FFFFFF"/>
                 <w:sz w:val="21"/>
@@ -3791,7 +3791,7 @@
             <w:r/>
             <w:r>
               <w:rPr>
-                <w:rFonts w:ascii="맑은 고딕" w:hAnsi="맑은 고딕" w:eastAsia="맑은 고딕" w:cs="맑은 고딕"/>
+                <w:rFonts w:ascii="Apple SD Gothic Neo" w:hAnsi="Apple SD Gothic Neo" w:eastAsia="Apple SD Gothic Neo" w:cs="Apple SD Gothic Neo"/>
                 <w:b w:val="0"/>
                 <w:sz w:val="20"/>
               </w:rPr>
@@ -3812,7 +3812,7 @@
             <w:r/>
             <w:r>
               <w:rPr>
-                <w:rFonts w:ascii="맑은 고딕" w:hAnsi="맑은 고딕" w:eastAsia="맑은 고딕" w:cs="맑은 고딕"/>
+                <w:rFonts w:ascii="Apple SD Gothic Neo" w:hAnsi="Apple SD Gothic Neo" w:eastAsia="Apple SD Gothic Neo" w:cs="Apple SD Gothic Neo"/>
                 <w:b w:val="0"/>
                 <w:sz w:val="20"/>
               </w:rPr>
@@ -3836,7 +3836,7 @@
             <w:r/>
             <w:r>
               <w:rPr>
-                <w:rFonts w:ascii="맑은 고딕" w:hAnsi="맑은 고딕" w:eastAsia="맑은 고딕" w:cs="맑은 고딕"/>
+                <w:rFonts w:ascii="Apple SD Gothic Neo" w:hAnsi="Apple SD Gothic Neo" w:eastAsia="Apple SD Gothic Neo" w:cs="Apple SD Gothic Neo"/>
                 <w:b w:val="0"/>
                 <w:sz w:val="20"/>
               </w:rPr>
@@ -3858,7 +3858,7 @@
             <w:r/>
             <w:r>
               <w:rPr>
-                <w:rFonts w:ascii="맑은 고딕" w:hAnsi="맑은 고딕" w:eastAsia="맑은 고딕" w:cs="맑은 고딕"/>
+                <w:rFonts w:ascii="Apple SD Gothic Neo" w:hAnsi="Apple SD Gothic Neo" w:eastAsia="Apple SD Gothic Neo" w:cs="Apple SD Gothic Neo"/>
                 <w:b w:val="0"/>
                 <w:sz w:val="20"/>
               </w:rPr>
@@ -3881,7 +3881,7 @@
             <w:r/>
             <w:r>
               <w:rPr>
-                <w:rFonts w:ascii="맑은 고딕" w:hAnsi="맑은 고딕" w:eastAsia="맑은 고딕" w:cs="맑은 고딕"/>
+                <w:rFonts w:ascii="Apple SD Gothic Neo" w:hAnsi="Apple SD Gothic Neo" w:eastAsia="Apple SD Gothic Neo" w:cs="Apple SD Gothic Neo"/>
                 <w:b w:val="0"/>
                 <w:sz w:val="20"/>
               </w:rPr>
@@ -3902,7 +3902,7 @@
             <w:r/>
             <w:r>
               <w:rPr>
-                <w:rFonts w:ascii="맑은 고딕" w:hAnsi="맑은 고딕" w:eastAsia="맑은 고딕" w:cs="맑은 고딕"/>
+                <w:rFonts w:ascii="Apple SD Gothic Neo" w:hAnsi="Apple SD Gothic Neo" w:eastAsia="Apple SD Gothic Neo" w:cs="Apple SD Gothic Neo"/>
                 <w:b w:val="0"/>
                 <w:sz w:val="20"/>
               </w:rPr>
@@ -3926,7 +3926,7 @@
             <w:r/>
             <w:r>
               <w:rPr>
-                <w:rFonts w:ascii="맑은 고딕" w:hAnsi="맑은 고딕" w:eastAsia="맑은 고딕" w:cs="맑은 고딕"/>
+                <w:rFonts w:ascii="Apple SD Gothic Neo" w:hAnsi="Apple SD Gothic Neo" w:eastAsia="Apple SD Gothic Neo" w:cs="Apple SD Gothic Neo"/>
                 <w:b w:val="0"/>
                 <w:sz w:val="20"/>
               </w:rPr>
@@ -3948,7 +3948,7 @@
             <w:r/>
             <w:r>
               <w:rPr>
-                <w:rFonts w:ascii="맑은 고딕" w:hAnsi="맑은 고딕" w:eastAsia="맑은 고딕" w:cs="맑은 고딕"/>
+                <w:rFonts w:ascii="Apple SD Gothic Neo" w:hAnsi="Apple SD Gothic Neo" w:eastAsia="Apple SD Gothic Neo" w:cs="Apple SD Gothic Neo"/>
                 <w:b w:val="0"/>
                 <w:sz w:val="20"/>
               </w:rPr>
@@ -3971,7 +3971,7 @@
             <w:r/>
             <w:r>
               <w:rPr>
-                <w:rFonts w:ascii="맑은 고딕" w:hAnsi="맑은 고딕" w:eastAsia="맑은 고딕" w:cs="맑은 고딕"/>
+                <w:rFonts w:ascii="Apple SD Gothic Neo" w:hAnsi="Apple SD Gothic Neo" w:eastAsia="Apple SD Gothic Neo" w:cs="Apple SD Gothic Neo"/>
                 <w:b w:val="0"/>
                 <w:sz w:val="20"/>
               </w:rPr>
@@ -3992,7 +3992,7 @@
             <w:r/>
             <w:r>
               <w:rPr>
-                <w:rFonts w:ascii="맑은 고딕" w:hAnsi="맑은 고딕" w:eastAsia="맑은 고딕" w:cs="맑은 고딕"/>
+                <w:rFonts w:ascii="Apple SD Gothic Neo" w:hAnsi="Apple SD Gothic Neo" w:eastAsia="Apple SD Gothic Neo" w:cs="Apple SD Gothic Neo"/>
                 <w:b w:val="0"/>
                 <w:sz w:val="20"/>
               </w:rPr>
@@ -4008,7 +4008,7 @@
       </w:pPr>
       <w:r>
         <w:rPr>
-          <w:rFonts w:ascii="맑은 고딕" w:hAnsi="맑은 고딕" w:eastAsia="맑은 고딕" w:cs="맑은 고딕"/>
+          <w:rFonts w:ascii="Apple SD Gothic Neo" w:hAnsi="Apple SD Gothic Neo" w:eastAsia="Apple SD Gothic Neo" w:cs="Apple SD Gothic Neo"/>
           <w:b w:val="0"/>
           <w:i w:val="0"/>
           <w:sz w:val="2"/>
@@ -4022,7 +4022,7 @@
       </w:pPr>
       <w:r>
         <w:rPr>
-          <w:rFonts w:ascii="맑은 고딕" w:hAnsi="맑은 고딕" w:eastAsia="맑은 고딕" w:cs="맑은 고딕"/>
+          <w:rFonts w:ascii="Apple SD Gothic Neo" w:hAnsi="Apple SD Gothic Neo" w:eastAsia="Apple SD Gothic Neo" w:cs="Apple SD Gothic Neo"/>
           <w:b/>
           <w:color w:val="2E75B6"/>
           <w:sz w:val="25"/>
@@ -4037,7 +4037,7 @@
       </w:pPr>
       <w:r>
         <w:rPr>
-          <w:rFonts w:ascii="맑은 고딕" w:hAnsi="맑은 고딕" w:eastAsia="맑은 고딕" w:cs="맑은 고딕"/>
+          <w:rFonts w:ascii="Apple SD Gothic Neo" w:hAnsi="Apple SD Gothic Neo" w:eastAsia="Apple SD Gothic Neo" w:cs="Apple SD Gothic Neo"/>
           <w:sz w:val="21"/>
         </w:rPr>
         <w:t>개인정보 보호법 및 정보통신망법 등 국내 관련 법령 준수.</w:t>
@@ -4050,7 +4050,7 @@
       </w:pPr>
       <w:r>
         <w:rPr>
-          <w:rFonts w:ascii="맑은 고딕" w:hAnsi="맑은 고딕" w:eastAsia="맑은 고딕" w:cs="맑은 고딕"/>
+          <w:rFonts w:ascii="Apple SD Gothic Neo" w:hAnsi="Apple SD Gothic Neo" w:eastAsia="Apple SD Gothic Neo" w:cs="Apple SD Gothic Neo"/>
           <w:sz w:val="21"/>
         </w:rPr>
         <w:t>개인정보는 저장 및 전송 시 모두 암호화 (저장 시 AES-256, 전송 시 TLS 1.2 이상).</w:t>
@@ -4063,7 +4063,7 @@
       </w:pPr>
       <w:r>
         <w:rPr>
-          <w:rFonts w:ascii="맑은 고딕" w:hAnsi="맑은 고딕" w:eastAsia="맑은 고딕" w:cs="맑은 고딕"/>
+          <w:rFonts w:ascii="Apple SD Gothic Neo" w:hAnsi="Apple SD Gothic Neo" w:eastAsia="Apple SD Gothic Neo" w:cs="Apple SD Gothic Neo"/>
           <w:sz w:val="21"/>
         </w:rPr>
         <w:t>기본적인 웹 보안 점검(OWASP Top 10 등) 검토.</w:t>
@@ -4076,7 +4076,7 @@
       </w:pPr>
       <w:r>
         <w:rPr>
-          <w:rFonts w:ascii="맑은 고딕" w:hAnsi="맑은 고딕" w:eastAsia="맑은 고딕" w:cs="맑은 고딕"/>
+          <w:rFonts w:ascii="Apple SD Gothic Neo" w:hAnsi="Apple SD Gothic Neo" w:eastAsia="Apple SD Gothic Neo" w:cs="Apple SD Gothic Neo"/>
           <w:sz w:val="21"/>
         </w:rPr>
         <w:t>결제 정보는 PG사를 통한 처리만 허용하며, 카드번호 등 민감 결제정보를 자체 저장하지 아니함 (PCI-DSS 회피).</w:t>
@@ -4089,7 +4089,7 @@
       </w:pPr>
       <w:r>
         <w:rPr>
-          <w:rFonts w:ascii="맑은 고딕" w:hAnsi="맑은 고딕" w:eastAsia="맑은 고딕" w:cs="맑은 고딕"/>
+          <w:rFonts w:ascii="Apple SD Gothic Neo" w:hAnsi="Apple SD Gothic Neo" w:eastAsia="Apple SD Gothic Neo" w:cs="Apple SD Gothic Neo"/>
           <w:sz w:val="21"/>
         </w:rPr>
         <w:t>BLE UUID는 회차별 암호화 회전(rotation)을 통해 재생 공격(replay attack) 방지.</w:t>
@@ -4102,7 +4102,7 @@
       </w:pPr>
       <w:r>
         <w:rPr>
-          <w:rFonts w:ascii="맑은 고딕" w:hAnsi="맑은 고딕" w:eastAsia="맑은 고딕" w:cs="맑은 고딕"/>
+          <w:rFonts w:ascii="Apple SD Gothic Neo" w:hAnsi="Apple SD Gothic Neo" w:eastAsia="Apple SD Gothic Neo" w:cs="Apple SD Gothic Neo"/>
           <w:sz w:val="21"/>
         </w:rPr>
         <w:t>관리자 주요 액션에 대한 감사로그 기록.</w:t>
@@ -4115,7 +4115,7 @@
       </w:pPr>
       <w:r>
         <w:rPr>
-          <w:rFonts w:ascii="맑은 고딕" w:hAnsi="맑은 고딕" w:eastAsia="맑은 고딕" w:cs="맑은 고딕"/>
+          <w:rFonts w:ascii="Apple SD Gothic Neo" w:hAnsi="Apple SD Gothic Neo" w:eastAsia="Apple SD Gothic Neo" w:cs="Apple SD Gothic Neo"/>
           <w:b/>
           <w:color w:val="2E75B6"/>
           <w:sz w:val="25"/>
@@ -4130,7 +4130,7 @@
       </w:pPr>
       <w:r>
         <w:rPr>
-          <w:rFonts w:ascii="맑은 고딕" w:hAnsi="맑은 고딕" w:eastAsia="맑은 고딕" w:cs="맑은 고딕"/>
+          <w:rFonts w:ascii="Apple SD Gothic Neo" w:hAnsi="Apple SD Gothic Neo" w:eastAsia="Apple SD Gothic Neo" w:cs="Apple SD Gothic Neo"/>
           <w:sz w:val="21"/>
         </w:rPr>
         <w:t>P2/P3 기능(채팅, AI 추천 등)이 본 아키텍처에서 모듈 추가 형태로 확장 가능해야 함.</w:t>
@@ -4143,7 +4143,7 @@
       </w:pPr>
       <w:r>
         <w:rPr>
-          <w:rFonts w:ascii="맑은 고딕" w:hAnsi="맑은 고딕" w:eastAsia="맑은 고딕" w:cs="맑은 고딕"/>
+          <w:rFonts w:ascii="Apple SD Gothic Neo" w:hAnsi="Apple SD Gothic Neo" w:eastAsia="Apple SD Gothic Neo" w:cs="Apple SD Gothic Neo"/>
           <w:sz w:val="21"/>
         </w:rPr>
         <w:t>코드 품질: 일반적인 코딩 표준 준수, 핵심 비즈니스 로직 동작 검증.</w:t>
@@ -4156,7 +4156,7 @@
       </w:pPr>
       <w:r>
         <w:rPr>
-          <w:rFonts w:ascii="맑은 고딕" w:hAnsi="맑은 고딕" w:eastAsia="맑은 고딕" w:cs="맑은 고딕"/>
+          <w:rFonts w:ascii="Apple SD Gothic Neo" w:hAnsi="Apple SD Gothic Neo" w:eastAsia="Apple SD Gothic Neo" w:cs="Apple SD Gothic Neo"/>
           <w:sz w:val="21"/>
         </w:rPr>
         <w:t>문서화: API 명세서(OpenAPI/Swagger), 운영 매뉴얼, 장애 대응 가이드 제공.</w:t>
@@ -4169,7 +4169,7 @@
       </w:pPr>
       <w:r>
         <w:rPr>
-          <w:rFonts w:ascii="맑은 고딕" w:hAnsi="맑은 고딕" w:eastAsia="맑은 고딕" w:cs="맑은 고딕"/>
+          <w:rFonts w:ascii="Apple SD Gothic Neo" w:hAnsi="Apple SD Gothic Neo" w:eastAsia="Apple SD Gothic Neo" w:cs="Apple SD Gothic Neo"/>
           <w:b/>
           <w:color w:val="2E75B6"/>
           <w:sz w:val="25"/>
@@ -4184,7 +4184,7 @@
       </w:pPr>
       <w:r>
         <w:rPr>
-          <w:rFonts w:ascii="맑은 고딕" w:hAnsi="맑은 고딕" w:eastAsia="맑은 고딕" w:cs="맑은 고딕"/>
+          <w:rFonts w:ascii="Apple SD Gothic Neo" w:hAnsi="Apple SD Gothic Neo" w:eastAsia="Apple SD Gothic Neo" w:cs="Apple SD Gothic Neo"/>
           <w:sz w:val="21"/>
         </w:rPr>
         <w:t>앱: iOS 14+ / Android 8.0+ 최신 2개 메이저 OS 버전 정상 동작 보장.</w:t>
@@ -4197,7 +4197,7 @@
       </w:pPr>
       <w:r>
         <w:rPr>
-          <w:rFonts w:ascii="맑은 고딕" w:hAnsi="맑은 고딕" w:eastAsia="맑은 고딕" w:cs="맑은 고딕"/>
+          <w:rFonts w:ascii="Apple SD Gothic Neo" w:hAnsi="Apple SD Gothic Neo" w:eastAsia="Apple SD Gothic Neo" w:cs="Apple SD Gothic Neo"/>
           <w:sz w:val="21"/>
         </w:rPr>
         <w:t>웹: Chrome, Safari 최신 2개 버전 정상 동작.</w:t>
@@ -4210,7 +4210,7 @@
       </w:pPr>
       <w:r>
         <w:rPr>
-          <w:rFonts w:ascii="맑은 고딕" w:hAnsi="맑은 고딕" w:eastAsia="맑은 고딕" w:cs="맑은 고딕"/>
+          <w:rFonts w:ascii="Apple SD Gothic Neo" w:hAnsi="Apple SD Gothic Neo" w:eastAsia="Apple SD Gothic Neo" w:cs="Apple SD Gothic Neo"/>
           <w:sz w:val="21"/>
         </w:rPr>
         <w:t>국내 KISA 보안 표준 권고사항 준수.</w:t>
@@ -4228,7 +4228,7 @@
       </w:pPr>
       <w:r>
         <w:rPr>
-          <w:rFonts w:ascii="맑은 고딕" w:hAnsi="맑은 고딕" w:eastAsia="맑은 고딕" w:cs="맑은 고딕"/>
+          <w:rFonts w:ascii="Apple SD Gothic Neo" w:hAnsi="Apple SD Gothic Neo" w:eastAsia="Apple SD Gothic Neo" w:cs="Apple SD Gothic Neo"/>
           <w:b/>
           <w:color w:val="1F4E78"/>
           <w:sz w:val="30"/>
@@ -4242,7 +4242,7 @@
       </w:pPr>
       <w:r>
         <w:rPr>
-          <w:rFonts w:ascii="맑은 고딕" w:hAnsi="맑은 고딕" w:eastAsia="맑은 고딕" w:cs="맑은 고딕"/>
+          <w:rFonts w:ascii="Apple SD Gothic Neo" w:hAnsi="Apple SD Gothic Neo" w:eastAsia="Apple SD Gothic Neo" w:cs="Apple SD Gothic Neo"/>
           <w:b w:val="0"/>
           <w:i w:val="0"/>
           <w:sz w:val="22"/>
@@ -4257,7 +4257,7 @@
       </w:pPr>
       <w:r>
         <w:rPr>
-          <w:rFonts w:ascii="맑은 고딕" w:hAnsi="맑은 고딕" w:eastAsia="맑은 고딕" w:cs="맑은 고딕"/>
+          <w:rFonts w:ascii="Apple SD Gothic Neo" w:hAnsi="Apple SD Gothic Neo" w:eastAsia="Apple SD Gothic Neo" w:cs="Apple SD Gothic Neo"/>
           <w:b/>
           <w:color w:val="2E75B6"/>
           <w:sz w:val="25"/>
@@ -4272,7 +4272,7 @@
       </w:pPr>
       <w:r>
         <w:rPr>
-          <w:rFonts w:ascii="맑은 고딕" w:hAnsi="맑은 고딕" w:eastAsia="맑은 고딕" w:cs="맑은 고딕"/>
+          <w:rFonts w:ascii="Apple SD Gothic Neo" w:hAnsi="Apple SD Gothic Neo" w:eastAsia="Apple SD Gothic Neo" w:cs="Apple SD Gothic Neo"/>
           <w:sz w:val="21"/>
         </w:rPr>
         <w:t>요구사항 정의서 (확정본)</w:t>
@@ -4285,7 +4285,7 @@
       </w:pPr>
       <w:r>
         <w:rPr>
-          <w:rFonts w:ascii="맑은 고딕" w:hAnsi="맑은 고딕" w:eastAsia="맑은 고딕" w:cs="맑은 고딕"/>
+          <w:rFonts w:ascii="Apple SD Gothic Neo" w:hAnsi="Apple SD Gothic Neo" w:eastAsia="Apple SD Gothic Neo" w:cs="Apple SD Gothic Neo"/>
           <w:sz w:val="21"/>
         </w:rPr>
         <w:t>화면 정의서 (Storyboard)</w:t>
@@ -4298,7 +4298,7 @@
       </w:pPr>
       <w:r>
         <w:rPr>
-          <w:rFonts w:ascii="맑은 고딕" w:hAnsi="맑은 고딕" w:eastAsia="맑은 고딕" w:cs="맑은 고딕"/>
+          <w:rFonts w:ascii="Apple SD Gothic Neo" w:hAnsi="Apple SD Gothic Neo" w:eastAsia="Apple SD Gothic Neo" w:cs="Apple SD Gothic Neo"/>
           <w:sz w:val="21"/>
         </w:rPr>
         <w:t>DB 설계서 (ERD 포함)</w:t>
@@ -4311,7 +4311,7 @@
       </w:pPr>
       <w:r>
         <w:rPr>
-          <w:rFonts w:ascii="맑은 고딕" w:hAnsi="맑은 고딕" w:eastAsia="맑은 고딕" w:cs="맑은 고딕"/>
+          <w:rFonts w:ascii="Apple SD Gothic Neo" w:hAnsi="Apple SD Gothic Neo" w:eastAsia="Apple SD Gothic Neo" w:cs="Apple SD Gothic Neo"/>
           <w:sz w:val="21"/>
         </w:rPr>
         <w:t>API 명세서 (OpenAPI/Swagger 형식)</w:t>
@@ -4324,7 +4324,7 @@
       </w:pPr>
       <w:r>
         <w:rPr>
-          <w:rFonts w:ascii="맑은 고딕" w:hAnsi="맑은 고딕" w:eastAsia="맑은 고딕" w:cs="맑은 고딕"/>
+          <w:rFonts w:ascii="Apple SD Gothic Neo" w:hAnsi="Apple SD Gothic Neo" w:eastAsia="Apple SD Gothic Neo" w:cs="Apple SD Gothic Neo"/>
           <w:sz w:val="21"/>
         </w:rPr>
         <w:t>BLE 핸드셰이크 프로토콜 설계서</w:t>
@@ -4337,7 +4337,7 @@
       </w:pPr>
       <w:r>
         <w:rPr>
-          <w:rFonts w:ascii="맑은 고딕" w:hAnsi="맑은 고딕" w:eastAsia="맑은 고딕" w:cs="맑은 고딕"/>
+          <w:rFonts w:ascii="Apple SD Gothic Neo" w:hAnsi="Apple SD Gothic Neo" w:eastAsia="Apple SD Gothic Neo" w:cs="Apple SD Gothic Neo"/>
           <w:sz w:val="21"/>
         </w:rPr>
         <w:t>시스템 아키텍처 설계서</w:t>
@@ -4350,7 +4350,7 @@
       </w:pPr>
       <w:r>
         <w:rPr>
-          <w:rFonts w:ascii="맑은 고딕" w:hAnsi="맑은 고딕" w:eastAsia="맑은 고딕" w:cs="맑은 고딕"/>
+          <w:rFonts w:ascii="Apple SD Gothic Neo" w:hAnsi="Apple SD Gothic Neo" w:eastAsia="Apple SD Gothic Neo" w:cs="Apple SD Gothic Neo"/>
           <w:b/>
           <w:color w:val="2E75B6"/>
           <w:sz w:val="25"/>
@@ -4365,7 +4365,7 @@
       </w:pPr>
       <w:r>
         <w:rPr>
-          <w:rFonts w:ascii="맑은 고딕" w:hAnsi="맑은 고딕" w:eastAsia="맑은 고딕" w:cs="맑은 고딕"/>
+          <w:rFonts w:ascii="Apple SD Gothic Neo" w:hAnsi="Apple SD Gothic Neo" w:eastAsia="Apple SD Gothic Neo" w:cs="Apple SD Gothic Neo"/>
           <w:sz w:val="21"/>
         </w:rPr>
         <w:t>UI 디자인 원본 (Figma 또는 동급, 발주처 계정으로 이관)</w:t>
@@ -4378,7 +4378,7 @@
       </w:pPr>
       <w:r>
         <w:rPr>
-          <w:rFonts w:ascii="맑은 고딕" w:hAnsi="맑은 고딕" w:eastAsia="맑은 고딕" w:cs="맑은 고딕"/>
+          <w:rFonts w:ascii="Apple SD Gothic Neo" w:hAnsi="Apple SD Gothic Neo" w:eastAsia="Apple SD Gothic Neo" w:cs="Apple SD Gothic Neo"/>
           <w:sz w:val="21"/>
         </w:rPr>
         <w:t>디자인 시스템(컴포넌트 라이브러리) 문서</w:t>
@@ -4391,7 +4391,7 @@
       </w:pPr>
       <w:r>
         <w:rPr>
-          <w:rFonts w:ascii="맑은 고딕" w:hAnsi="맑은 고딕" w:eastAsia="맑은 고딕" w:cs="맑은 고딕"/>
+          <w:rFonts w:ascii="Apple SD Gothic Neo" w:hAnsi="Apple SD Gothic Neo" w:eastAsia="Apple SD Gothic Neo" w:cs="Apple SD Gothic Neo"/>
           <w:sz w:val="21"/>
         </w:rPr>
         <w:t>앱 아이콘, 스플래시, 마케팅 키비주얼 (소스파일 포함)</w:t>
@@ -4404,7 +4404,7 @@
       </w:pPr>
       <w:r>
         <w:rPr>
-          <w:rFonts w:ascii="맑은 고딕" w:hAnsi="맑은 고딕" w:eastAsia="맑은 고딕" w:cs="맑은 고딕"/>
+          <w:rFonts w:ascii="Apple SD Gothic Neo" w:hAnsi="Apple SD Gothic Neo" w:eastAsia="Apple SD Gothic Neo" w:cs="Apple SD Gothic Neo"/>
           <w:b/>
           <w:color w:val="2E75B6"/>
           <w:sz w:val="25"/>
@@ -4419,7 +4419,7 @@
       </w:pPr>
       <w:r>
         <w:rPr>
-          <w:rFonts w:ascii="맑은 고딕" w:hAnsi="맑은 고딕" w:eastAsia="맑은 고딕" w:cs="맑은 고딕"/>
+          <w:rFonts w:ascii="Apple SD Gothic Neo" w:hAnsi="Apple SD Gothic Neo" w:eastAsia="Apple SD Gothic Neo" w:cs="Apple SD Gothic Neo"/>
           <w:sz w:val="21"/>
         </w:rPr>
         <w:t>전체 소스코드 (Git 저장소, 발주처 계정으로 이관)</w:t>
@@ -4432,7 +4432,7 @@
       </w:pPr>
       <w:r>
         <w:rPr>
-          <w:rFonts w:ascii="맑은 고딕" w:hAnsi="맑은 고딕" w:eastAsia="맑은 고딕" w:cs="맑은 고딕"/>
+          <w:rFonts w:ascii="Apple SD Gothic Neo" w:hAnsi="Apple SD Gothic Neo" w:eastAsia="Apple SD Gothic Neo" w:cs="Apple SD Gothic Neo"/>
           <w:sz w:val="21"/>
         </w:rPr>
         <w:t>빌드 가능한 형태의 프로젝트 (의존성 명세, 빌드 가이드 포함)</w:t>
@@ -4445,7 +4445,7 @@
       </w:pPr>
       <w:r>
         <w:rPr>
-          <w:rFonts w:ascii="맑은 고딕" w:hAnsi="맑은 고딕" w:eastAsia="맑은 고딕" w:cs="맑은 고딕"/>
+          <w:rFonts w:ascii="Apple SD Gothic Neo" w:hAnsi="Apple SD Gothic Neo" w:eastAsia="Apple SD Gothic Neo" w:cs="Apple SD Gothic Neo"/>
           <w:sz w:val="21"/>
         </w:rPr>
         <w:t>앱 설치파일 (iOS .ipa, Android .aab/.apk)</w:t>
@@ -4458,7 +4458,7 @@
       </w:pPr>
       <w:r>
         <w:rPr>
-          <w:rFonts w:ascii="맑은 고딕" w:hAnsi="맑은 고딕" w:eastAsia="맑은 고딕" w:cs="맑은 고딕"/>
+          <w:rFonts w:ascii="Apple SD Gothic Neo" w:hAnsi="Apple SD Gothic Neo" w:eastAsia="Apple SD Gothic Neo" w:cs="Apple SD Gothic Neo"/>
           <w:sz w:val="21"/>
         </w:rPr>
         <w:t>비콘 펌웨어 바이너리 및 소스코드</w:t>
@@ -4471,7 +4471,7 @@
       </w:pPr>
       <w:r>
         <w:rPr>
-          <w:rFonts w:ascii="맑은 고딕" w:hAnsi="맑은 고딕" w:eastAsia="맑은 고딕" w:cs="맑은 고딕"/>
+          <w:rFonts w:ascii="Apple SD Gothic Neo" w:hAnsi="Apple SD Gothic Neo" w:eastAsia="Apple SD Gothic Neo" w:cs="Apple SD Gothic Neo"/>
           <w:sz w:val="21"/>
         </w:rPr>
         <w:t>배포 스크립트 (CI/CD 파이프라인 정의)</w:t>
@@ -4484,7 +4484,7 @@
       </w:pPr>
       <w:r>
         <w:rPr>
-          <w:rFonts w:ascii="맑은 고딕" w:hAnsi="맑은 고딕" w:eastAsia="맑은 고딕" w:cs="맑은 고딕"/>
+          <w:rFonts w:ascii="Apple SD Gothic Neo" w:hAnsi="Apple SD Gothic Neo" w:eastAsia="Apple SD Gothic Neo" w:cs="Apple SD Gothic Neo"/>
           <w:b/>
           <w:color w:val="2E75B6"/>
           <w:sz w:val="25"/>
@@ -4499,7 +4499,7 @@
       </w:pPr>
       <w:r>
         <w:rPr>
-          <w:rFonts w:ascii="맑은 고딕" w:hAnsi="맑은 고딕" w:eastAsia="맑은 고딕" w:cs="맑은 고딕"/>
+          <w:rFonts w:ascii="Apple SD Gothic Neo" w:hAnsi="Apple SD Gothic Neo" w:eastAsia="Apple SD Gothic Neo" w:cs="Apple SD Gothic Neo"/>
           <w:sz w:val="21"/>
         </w:rPr>
         <w:t>운영 매뉴얼 (관리자용, SP용)</w:t>
@@ -4512,7 +4512,7 @@
       </w:pPr>
       <w:r>
         <w:rPr>
-          <w:rFonts w:ascii="맑은 고딕" w:hAnsi="맑은 고딕" w:eastAsia="맑은 고딕" w:cs="맑은 고딕"/>
+          <w:rFonts w:ascii="Apple SD Gothic Neo" w:hAnsi="Apple SD Gothic Neo" w:eastAsia="Apple SD Gothic Neo" w:cs="Apple SD Gothic Neo"/>
           <w:sz w:val="21"/>
         </w:rPr>
         <w:t>장애 대응 가이드</w:t>
@@ -4525,7 +4525,7 @@
       </w:pPr>
       <w:r>
         <w:rPr>
-          <w:rFonts w:ascii="맑은 고딕" w:hAnsi="맑은 고딕" w:eastAsia="맑은 고딕" w:cs="맑은 고딕"/>
+          <w:rFonts w:ascii="Apple SD Gothic Neo" w:hAnsi="Apple SD Gothic Neo" w:eastAsia="Apple SD Gothic Neo" w:cs="Apple SD Gothic Neo"/>
           <w:sz w:val="21"/>
         </w:rPr>
         <w:t>개인정보 처리방침 초안 및 약관 초안 (법무 검토는 발주처 책임)</w:t>
@@ -4538,7 +4538,7 @@
       </w:pPr>
       <w:r>
         <w:rPr>
-          <w:rFonts w:ascii="맑은 고딕" w:hAnsi="맑은 고딕" w:eastAsia="맑은 고딕" w:cs="맑은 고딕"/>
+          <w:rFonts w:ascii="Apple SD Gothic Neo" w:hAnsi="Apple SD Gothic Neo" w:eastAsia="Apple SD Gothic Neo" w:cs="Apple SD Gothic Neo"/>
           <w:sz w:val="21"/>
         </w:rPr>
         <w:t>최종 결과보고서</w:t>
@@ -4551,7 +4551,7 @@
       </w:pPr>
       <w:r>
         <w:rPr>
-          <w:rFonts w:ascii="맑은 고딕" w:hAnsi="맑은 고딕" w:eastAsia="맑은 고딕" w:cs="맑은 고딕"/>
+          <w:rFonts w:ascii="Apple SD Gothic Neo" w:hAnsi="Apple SD Gothic Neo" w:eastAsia="Apple SD Gothic Neo" w:cs="Apple SD Gothic Neo"/>
           <w:b/>
           <w:color w:val="2E75B6"/>
           <w:sz w:val="25"/>
@@ -4566,7 +4566,7 @@
       </w:pPr>
       <w:r>
         <w:rPr>
-          <w:rFonts w:ascii="맑은 고딕" w:hAnsi="맑은 고딕" w:eastAsia="맑은 고딕" w:cs="맑은 고딕"/>
+          <w:rFonts w:ascii="Apple SD Gothic Neo" w:hAnsi="Apple SD Gothic Neo" w:eastAsia="Apple SD Gothic Neo" w:cs="Apple SD Gothic Neo"/>
           <w:sz w:val="21"/>
         </w:rPr>
         <w:t>모든 산출물은 한국어로 작성 (국제표준 약어/용어는 영문 허용).</w:t>
@@ -4579,7 +4579,7 @@
       </w:pPr>
       <w:r>
         <w:rPr>
-          <w:rFonts w:ascii="맑은 고딕" w:hAnsi="맑은 고딕" w:eastAsia="맑은 고딕" w:cs="맑은 고딕"/>
+          <w:rFonts w:ascii="Apple SD Gothic Neo" w:hAnsi="Apple SD Gothic Neo" w:eastAsia="Apple SD Gothic Neo" w:cs="Apple SD Gothic Neo"/>
           <w:sz w:val="21"/>
         </w:rPr>
         <w:t>문서: PDF + 원본(Word, Excel, Figma 등) 동시 납품.</w:t>
@@ -4592,7 +4592,7 @@
       </w:pPr>
       <w:r>
         <w:rPr>
-          <w:rFonts w:ascii="맑은 고딕" w:hAnsi="맑은 고딕" w:eastAsia="맑은 고딕" w:cs="맑은 고딕"/>
+          <w:rFonts w:ascii="Apple SD Gothic Neo" w:hAnsi="Apple SD Gothic Neo" w:eastAsia="Apple SD Gothic Neo" w:cs="Apple SD Gothic Neo"/>
           <w:sz w:val="21"/>
         </w:rPr>
         <w:t>코드/디자인: 발주처 지정 저장소 계정으로 이관 완료한 시점을 인도일로 본다.</w:t>
@@ -4610,7 +4610,7 @@
       </w:pPr>
       <w:r>
         <w:rPr>
-          <w:rFonts w:ascii="맑은 고딕" w:hAnsi="맑은 고딕" w:eastAsia="맑은 고딕" w:cs="맑은 고딕"/>
+          <w:rFonts w:ascii="Apple SD Gothic Neo" w:hAnsi="Apple SD Gothic Neo" w:eastAsia="Apple SD Gothic Neo" w:cs="Apple SD Gothic Neo"/>
           <w:b/>
           <w:color w:val="1F4E78"/>
           <w:sz w:val="30"/>
@@ -4625,7 +4625,7 @@
       </w:pPr>
       <w:r>
         <w:rPr>
-          <w:rFonts w:ascii="맑은 고딕" w:hAnsi="맑은 고딕" w:eastAsia="맑은 고딕" w:cs="맑은 고딕"/>
+          <w:rFonts w:ascii="Apple SD Gothic Neo" w:hAnsi="Apple SD Gothic Neo" w:eastAsia="Apple SD Gothic Neo" w:cs="Apple SD Gothic Neo"/>
           <w:b/>
           <w:color w:val="2E75B6"/>
           <w:sz w:val="25"/>
@@ -4640,7 +4640,7 @@
       </w:pPr>
       <w:r>
         <w:rPr>
-          <w:rFonts w:ascii="맑은 고딕" w:hAnsi="맑은 고딕" w:eastAsia="맑은 고딕" w:cs="맑은 고딕"/>
+          <w:rFonts w:ascii="Apple SD Gothic Neo" w:hAnsi="Apple SD Gothic Neo" w:eastAsia="Apple SD Gothic Neo" w:cs="Apple SD Gothic Neo"/>
           <w:sz w:val="21"/>
         </w:rPr>
         <w:t>단계별 검수 + 최종 검수의 이중 검수 체계로 운영한다.</w:t>
@@ -4653,7 +4653,7 @@
       </w:pPr>
       <w:r>
         <w:rPr>
-          <w:rFonts w:ascii="맑은 고딕" w:hAnsi="맑은 고딕" w:eastAsia="맑은 고딕" w:cs="맑은 고딕"/>
+          <w:rFonts w:ascii="Apple SD Gothic Neo" w:hAnsi="Apple SD Gothic Neo" w:eastAsia="Apple SD Gothic Neo" w:cs="Apple SD Gothic Neo"/>
           <w:sz w:val="21"/>
         </w:rPr>
         <w:t>각 단계 종료 시 발주측 PM의 서면 승인을 받아야 다음 단계로 진행한다.</w:t>
@@ -4666,7 +4666,7 @@
       </w:pPr>
       <w:r>
         <w:rPr>
-          <w:rFonts w:ascii="맑은 고딕" w:hAnsi="맑은 고딕" w:eastAsia="맑은 고딕" w:cs="맑은 고딕"/>
+          <w:rFonts w:ascii="Apple SD Gothic Neo" w:hAnsi="Apple SD Gothic Neo" w:eastAsia="Apple SD Gothic Neo" w:cs="Apple SD Gothic Neo"/>
           <w:sz w:val="21"/>
         </w:rPr>
         <w:t>최종 검수는 발주처 인수테스트(UAT) 통과 시점을 기준으로 한다.</w:t>
@@ -4679,7 +4679,7 @@
       </w:pPr>
       <w:r>
         <w:rPr>
-          <w:rFonts w:ascii="맑은 고딕" w:hAnsi="맑은 고딕" w:eastAsia="맑은 고딕" w:cs="맑은 고딕"/>
+          <w:rFonts w:ascii="Apple SD Gothic Neo" w:hAnsi="Apple SD Gothic Neo" w:eastAsia="Apple SD Gothic Neo" w:cs="Apple SD Gothic Neo"/>
           <w:b/>
           <w:color w:val="2E75B6"/>
           <w:sz w:val="25"/>
@@ -4713,7 +4713,7 @@
             <w:r/>
             <w:r>
               <w:rPr>
-                <w:rFonts w:ascii="맑은 고딕" w:hAnsi="맑은 고딕" w:eastAsia="맑은 고딕" w:cs="맑은 고딕"/>
+                <w:rFonts w:ascii="Apple SD Gothic Neo" w:hAnsi="Apple SD Gothic Neo" w:eastAsia="Apple SD Gothic Neo" w:cs="Apple SD Gothic Neo"/>
                 <w:b/>
                 <w:color w:val="FFFFFF"/>
                 <w:sz w:val="21"/>
@@ -4736,7 +4736,7 @@
             <w:r/>
             <w:r>
               <w:rPr>
-                <w:rFonts w:ascii="맑은 고딕" w:hAnsi="맑은 고딕" w:eastAsia="맑은 고딕" w:cs="맑은 고딕"/>
+                <w:rFonts w:ascii="Apple SD Gothic Neo" w:hAnsi="Apple SD Gothic Neo" w:eastAsia="Apple SD Gothic Neo" w:cs="Apple SD Gothic Neo"/>
                 <w:b/>
                 <w:color w:val="FFFFFF"/>
                 <w:sz w:val="21"/>
@@ -4760,7 +4760,7 @@
             <w:r/>
             <w:r>
               <w:rPr>
-                <w:rFonts w:ascii="맑은 고딕" w:hAnsi="맑은 고딕" w:eastAsia="맑은 고딕" w:cs="맑은 고딕"/>
+                <w:rFonts w:ascii="Apple SD Gothic Neo" w:hAnsi="Apple SD Gothic Neo" w:eastAsia="Apple SD Gothic Neo" w:cs="Apple SD Gothic Neo"/>
                 <w:b w:val="0"/>
                 <w:sz w:val="20"/>
               </w:rPr>
@@ -4781,7 +4781,7 @@
             <w:r/>
             <w:r>
               <w:rPr>
-                <w:rFonts w:ascii="맑은 고딕" w:hAnsi="맑은 고딕" w:eastAsia="맑은 고딕" w:cs="맑은 고딕"/>
+                <w:rFonts w:ascii="Apple SD Gothic Neo" w:hAnsi="Apple SD Gothic Neo" w:eastAsia="Apple SD Gothic Neo" w:cs="Apple SD Gothic Neo"/>
                 <w:b w:val="0"/>
                 <w:sz w:val="20"/>
               </w:rPr>
@@ -4805,7 +4805,7 @@
             <w:r/>
             <w:r>
               <w:rPr>
-                <w:rFonts w:ascii="맑은 고딕" w:hAnsi="맑은 고딕" w:eastAsia="맑은 고딕" w:cs="맑은 고딕"/>
+                <w:rFonts w:ascii="Apple SD Gothic Neo" w:hAnsi="Apple SD Gothic Neo" w:eastAsia="Apple SD Gothic Neo" w:cs="Apple SD Gothic Neo"/>
                 <w:b w:val="0"/>
                 <w:sz w:val="20"/>
               </w:rPr>
@@ -4827,7 +4827,7 @@
             <w:r/>
             <w:r>
               <w:rPr>
-                <w:rFonts w:ascii="맑은 고딕" w:hAnsi="맑은 고딕" w:eastAsia="맑은 고딕" w:cs="맑은 고딕"/>
+                <w:rFonts w:ascii="Apple SD Gothic Neo" w:hAnsi="Apple SD Gothic Neo" w:eastAsia="Apple SD Gothic Neo" w:cs="Apple SD Gothic Neo"/>
                 <w:b w:val="0"/>
                 <w:sz w:val="20"/>
               </w:rPr>
@@ -4850,7 +4850,7 @@
             <w:r/>
             <w:r>
               <w:rPr>
-                <w:rFonts w:ascii="맑은 고딕" w:hAnsi="맑은 고딕" w:eastAsia="맑은 고딕" w:cs="맑은 고딕"/>
+                <w:rFonts w:ascii="Apple SD Gothic Neo" w:hAnsi="Apple SD Gothic Neo" w:eastAsia="Apple SD Gothic Neo" w:cs="Apple SD Gothic Neo"/>
                 <w:b w:val="0"/>
                 <w:sz w:val="20"/>
               </w:rPr>
@@ -4871,7 +4871,7 @@
             <w:r/>
             <w:r>
               <w:rPr>
-                <w:rFonts w:ascii="맑은 고딕" w:hAnsi="맑은 고딕" w:eastAsia="맑은 고딕" w:cs="맑은 고딕"/>
+                <w:rFonts w:ascii="Apple SD Gothic Neo" w:hAnsi="Apple SD Gothic Neo" w:eastAsia="Apple SD Gothic Neo" w:cs="Apple SD Gothic Neo"/>
                 <w:b w:val="0"/>
                 <w:sz w:val="20"/>
               </w:rPr>
@@ -4895,7 +4895,7 @@
             <w:r/>
             <w:r>
               <w:rPr>
-                <w:rFonts w:ascii="맑은 고딕" w:hAnsi="맑은 고딕" w:eastAsia="맑은 고딕" w:cs="맑은 고딕"/>
+                <w:rFonts w:ascii="Apple SD Gothic Neo" w:hAnsi="Apple SD Gothic Neo" w:eastAsia="Apple SD Gothic Neo" w:cs="Apple SD Gothic Neo"/>
                 <w:b w:val="0"/>
                 <w:sz w:val="20"/>
               </w:rPr>
@@ -4917,7 +4917,7 @@
             <w:r/>
             <w:r>
               <w:rPr>
-                <w:rFonts w:ascii="맑은 고딕" w:hAnsi="맑은 고딕" w:eastAsia="맑은 고딕" w:cs="맑은 고딕"/>
+                <w:rFonts w:ascii="Apple SD Gothic Neo" w:hAnsi="Apple SD Gothic Neo" w:eastAsia="Apple SD Gothic Neo" w:cs="Apple SD Gothic Neo"/>
                 <w:b w:val="0"/>
                 <w:sz w:val="20"/>
               </w:rPr>
@@ -4940,7 +4940,7 @@
             <w:r/>
             <w:r>
               <w:rPr>
-                <w:rFonts w:ascii="맑은 고딕" w:hAnsi="맑은 고딕" w:eastAsia="맑은 고딕" w:cs="맑은 고딕"/>
+                <w:rFonts w:ascii="Apple SD Gothic Neo" w:hAnsi="Apple SD Gothic Neo" w:eastAsia="Apple SD Gothic Neo" w:cs="Apple SD Gothic Neo"/>
                 <w:b w:val="0"/>
                 <w:sz w:val="20"/>
               </w:rPr>
@@ -4961,7 +4961,7 @@
             <w:r/>
             <w:r>
               <w:rPr>
-                <w:rFonts w:ascii="맑은 고딕" w:hAnsi="맑은 고딕" w:eastAsia="맑은 고딕" w:cs="맑은 고딕"/>
+                <w:rFonts w:ascii="Apple SD Gothic Neo" w:hAnsi="Apple SD Gothic Neo" w:eastAsia="Apple SD Gothic Neo" w:cs="Apple SD Gothic Neo"/>
                 <w:b w:val="0"/>
                 <w:sz w:val="20"/>
               </w:rPr>
@@ -4977,7 +4977,7 @@
       </w:pPr>
       <w:r>
         <w:rPr>
-          <w:rFonts w:ascii="맑은 고딕" w:hAnsi="맑은 고딕" w:eastAsia="맑은 고딕" w:cs="맑은 고딕"/>
+          <w:rFonts w:ascii="Apple SD Gothic Neo" w:hAnsi="Apple SD Gothic Neo" w:eastAsia="Apple SD Gothic Neo" w:cs="Apple SD Gothic Neo"/>
           <w:b w:val="0"/>
           <w:i w:val="0"/>
           <w:sz w:val="2"/>
@@ -4991,7 +4991,7 @@
       </w:pPr>
       <w:r>
         <w:rPr>
-          <w:rFonts w:ascii="맑은 고딕" w:hAnsi="맑은 고딕" w:eastAsia="맑은 고딕" w:cs="맑은 고딕"/>
+          <w:rFonts w:ascii="Apple SD Gothic Neo" w:hAnsi="Apple SD Gothic Neo" w:eastAsia="Apple SD Gothic Neo" w:cs="Apple SD Gothic Neo"/>
           <w:b/>
           <w:color w:val="2E75B6"/>
           <w:sz w:val="25"/>
@@ -5025,7 +5025,7 @@
             <w:r/>
             <w:r>
               <w:rPr>
-                <w:rFonts w:ascii="맑은 고딕" w:hAnsi="맑은 고딕" w:eastAsia="맑은 고딕" w:cs="맑은 고딕"/>
+                <w:rFonts w:ascii="Apple SD Gothic Neo" w:hAnsi="Apple SD Gothic Neo" w:eastAsia="Apple SD Gothic Neo" w:cs="Apple SD Gothic Neo"/>
                 <w:b/>
                 <w:color w:val="FFFFFF"/>
                 <w:sz w:val="21"/>
@@ -5048,7 +5048,7 @@
             <w:r/>
             <w:r>
               <w:rPr>
-                <w:rFonts w:ascii="맑은 고딕" w:hAnsi="맑은 고딕" w:eastAsia="맑은 고딕" w:cs="맑은 고딕"/>
+                <w:rFonts w:ascii="Apple SD Gothic Neo" w:hAnsi="Apple SD Gothic Neo" w:eastAsia="Apple SD Gothic Neo" w:cs="Apple SD Gothic Neo"/>
                 <w:b/>
                 <w:color w:val="FFFFFF"/>
                 <w:sz w:val="21"/>
@@ -5072,7 +5072,7 @@
             <w:r/>
             <w:r>
               <w:rPr>
-                <w:rFonts w:ascii="맑은 고딕" w:hAnsi="맑은 고딕" w:eastAsia="맑은 고딕" w:cs="맑은 고딕"/>
+                <w:rFonts w:ascii="Apple SD Gothic Neo" w:hAnsi="Apple SD Gothic Neo" w:eastAsia="Apple SD Gothic Neo" w:cs="Apple SD Gothic Neo"/>
                 <w:b w:val="0"/>
                 <w:sz w:val="20"/>
               </w:rPr>
@@ -5093,7 +5093,7 @@
             <w:r/>
             <w:r>
               <w:rPr>
-                <w:rFonts w:ascii="맑은 고딕" w:hAnsi="맑은 고딕" w:eastAsia="맑은 고딕" w:cs="맑은 고딕"/>
+                <w:rFonts w:ascii="Apple SD Gothic Neo" w:hAnsi="Apple SD Gothic Neo" w:eastAsia="Apple SD Gothic Neo" w:cs="Apple SD Gothic Neo"/>
                 <w:b w:val="0"/>
                 <w:sz w:val="20"/>
               </w:rPr>
@@ -5117,7 +5117,7 @@
             <w:r/>
             <w:r>
               <w:rPr>
-                <w:rFonts w:ascii="맑은 고딕" w:hAnsi="맑은 고딕" w:eastAsia="맑은 고딕" w:cs="맑은 고딕"/>
+                <w:rFonts w:ascii="Apple SD Gothic Neo" w:hAnsi="Apple SD Gothic Neo" w:eastAsia="Apple SD Gothic Neo" w:cs="Apple SD Gothic Neo"/>
                 <w:b w:val="0"/>
                 <w:sz w:val="20"/>
               </w:rPr>
@@ -5139,7 +5139,7 @@
             <w:r/>
             <w:r>
               <w:rPr>
-                <w:rFonts w:ascii="맑은 고딕" w:hAnsi="맑은 고딕" w:eastAsia="맑은 고딕" w:cs="맑은 고딕"/>
+                <w:rFonts w:ascii="Apple SD Gothic Neo" w:hAnsi="Apple SD Gothic Neo" w:eastAsia="Apple SD Gothic Neo" w:cs="Apple SD Gothic Neo"/>
                 <w:b w:val="0"/>
                 <w:sz w:val="20"/>
               </w:rPr>
@@ -5162,7 +5162,7 @@
             <w:r/>
             <w:r>
               <w:rPr>
-                <w:rFonts w:ascii="맑은 고딕" w:hAnsi="맑은 고딕" w:eastAsia="맑은 고딕" w:cs="맑은 고딕"/>
+                <w:rFonts w:ascii="Apple SD Gothic Neo" w:hAnsi="Apple SD Gothic Neo" w:eastAsia="Apple SD Gothic Neo" w:cs="Apple SD Gothic Neo"/>
                 <w:b w:val="0"/>
                 <w:sz w:val="20"/>
               </w:rPr>
@@ -5183,7 +5183,7 @@
             <w:r/>
             <w:r>
               <w:rPr>
-                <w:rFonts w:ascii="맑은 고딕" w:hAnsi="맑은 고딕" w:eastAsia="맑은 고딕" w:cs="맑은 고딕"/>
+                <w:rFonts w:ascii="Apple SD Gothic Neo" w:hAnsi="Apple SD Gothic Neo" w:eastAsia="Apple SD Gothic Neo" w:cs="Apple SD Gothic Neo"/>
                 <w:b w:val="0"/>
                 <w:sz w:val="20"/>
               </w:rPr>
@@ -5207,7 +5207,7 @@
             <w:r/>
             <w:r>
               <w:rPr>
-                <w:rFonts w:ascii="맑은 고딕" w:hAnsi="맑은 고딕" w:eastAsia="맑은 고딕" w:cs="맑은 고딕"/>
+                <w:rFonts w:ascii="Apple SD Gothic Neo" w:hAnsi="Apple SD Gothic Neo" w:eastAsia="Apple SD Gothic Neo" w:cs="Apple SD Gothic Neo"/>
                 <w:b w:val="0"/>
                 <w:sz w:val="20"/>
               </w:rPr>
@@ -5229,7 +5229,7 @@
             <w:r/>
             <w:r>
               <w:rPr>
-                <w:rFonts w:ascii="맑은 고딕" w:hAnsi="맑은 고딕" w:eastAsia="맑은 고딕" w:cs="맑은 고딕"/>
+                <w:rFonts w:ascii="Apple SD Gothic Neo" w:hAnsi="Apple SD Gothic Neo" w:eastAsia="Apple SD Gothic Neo" w:cs="Apple SD Gothic Neo"/>
                 <w:b w:val="0"/>
                 <w:sz w:val="20"/>
               </w:rPr>
@@ -5245,7 +5245,7 @@
       </w:pPr>
       <w:r>
         <w:rPr>
-          <w:rFonts w:ascii="맑은 고딕" w:hAnsi="맑은 고딕" w:eastAsia="맑은 고딕" w:cs="맑은 고딕"/>
+          <w:rFonts w:ascii="Apple SD Gothic Neo" w:hAnsi="Apple SD Gothic Neo" w:eastAsia="Apple SD Gothic Neo" w:cs="Apple SD Gothic Neo"/>
           <w:b w:val="0"/>
           <w:i w:val="0"/>
           <w:sz w:val="2"/>
@@ -5259,7 +5259,7 @@
       </w:pPr>
       <w:r>
         <w:rPr>
-          <w:rFonts w:ascii="맑은 고딕" w:hAnsi="맑은 고딕" w:eastAsia="맑은 고딕" w:cs="맑은 고딕"/>
+          <w:rFonts w:ascii="Apple SD Gothic Neo" w:hAnsi="Apple SD Gothic Neo" w:eastAsia="Apple SD Gothic Neo" w:cs="Apple SD Gothic Neo"/>
           <w:b/>
           <w:color w:val="2E75B6"/>
           <w:sz w:val="25"/>
@@ -5274,7 +5274,7 @@
       </w:pPr>
       <w:r>
         <w:rPr>
-          <w:rFonts w:ascii="맑은 고딕" w:hAnsi="맑은 고딕" w:eastAsia="맑은 고딕" w:cs="맑은 고딕"/>
+          <w:rFonts w:ascii="Apple SD Gothic Neo" w:hAnsi="Apple SD Gothic Neo" w:eastAsia="Apple SD Gothic Neo" w:cs="Apple SD Gothic Neo"/>
           <w:sz w:val="21"/>
         </w:rPr>
         <w:t>수행사가 단계 완료 보고서 및 산출물을 발주처에 제출</w:t>
@@ -5287,7 +5287,7 @@
       </w:pPr>
       <w:r>
         <w:rPr>
-          <w:rFonts w:ascii="맑은 고딕" w:hAnsi="맑은 고딕" w:eastAsia="맑은 고딕" w:cs="맑은 고딕"/>
+          <w:rFonts w:ascii="Apple SD Gothic Neo" w:hAnsi="Apple SD Gothic Neo" w:eastAsia="Apple SD Gothic Neo" w:cs="Apple SD Gothic Neo"/>
           <w:sz w:val="21"/>
         </w:rPr>
         <w:t>발주처는 영업일 기준 7일 이내 1차 검토 후 보완 요청 또는 검수 합격 통지</w:t>
@@ -5300,7 +5300,7 @@
       </w:pPr>
       <w:r>
         <w:rPr>
-          <w:rFonts w:ascii="맑은 고딕" w:hAnsi="맑은 고딕" w:eastAsia="맑은 고딕" w:cs="맑은 고딕"/>
+          <w:rFonts w:ascii="Apple SD Gothic Neo" w:hAnsi="Apple SD Gothic Neo" w:eastAsia="Apple SD Gothic Neo" w:cs="Apple SD Gothic Neo"/>
           <w:sz w:val="21"/>
         </w:rPr>
         <w:t>보완 요청 시, 수행사는 영업일 기준 5일 이내 보완 결과 제출 (반복 가능)</w:t>
@@ -5313,7 +5313,7 @@
       </w:pPr>
       <w:r>
         <w:rPr>
-          <w:rFonts w:ascii="맑은 고딕" w:hAnsi="맑은 고딕" w:eastAsia="맑은 고딕" w:cs="맑은 고딕"/>
+          <w:rFonts w:ascii="Apple SD Gothic Neo" w:hAnsi="Apple SD Gothic Neo" w:eastAsia="Apple SD Gothic Neo" w:cs="Apple SD Gothic Neo"/>
           <w:sz w:val="21"/>
         </w:rPr>
         <w:t>최종 검수 합격 시, 발주측 PM이 검수확인서에 서명함으로써 해당 단계 완료를 확정</w:t>
@@ -5326,7 +5326,7 @@
       </w:pPr>
       <w:r>
         <w:rPr>
-          <w:rFonts w:ascii="맑은 고딕" w:hAnsi="맑은 고딕" w:eastAsia="맑은 고딕" w:cs="맑은 고딕"/>
+          <w:rFonts w:ascii="Apple SD Gothic Neo" w:hAnsi="Apple SD Gothic Neo" w:eastAsia="Apple SD Gothic Neo" w:cs="Apple SD Gothic Neo"/>
           <w:sz w:val="21"/>
         </w:rPr>
         <w:t>UAT 기간은 최종 검수 단계에서 영업일 기준 10일을 기본으로 하며 협의 가능</w:t>
@@ -5344,7 +5344,7 @@
       </w:pPr>
       <w:r>
         <w:rPr>
-          <w:rFonts w:ascii="맑은 고딕" w:hAnsi="맑은 고딕" w:eastAsia="맑은 고딕" w:cs="맑은 고딕"/>
+          <w:rFonts w:ascii="Apple SD Gothic Neo" w:hAnsi="Apple SD Gothic Neo" w:eastAsia="Apple SD Gothic Neo" w:cs="Apple SD Gothic Neo"/>
           <w:b/>
           <w:color w:val="1F4E78"/>
           <w:sz w:val="30"/>
@@ -5359,7 +5359,7 @@
       </w:pPr>
       <w:r>
         <w:rPr>
-          <w:rFonts w:ascii="맑은 고딕" w:hAnsi="맑은 고딕" w:eastAsia="맑은 고딕" w:cs="맑은 고딕"/>
+          <w:rFonts w:ascii="Apple SD Gothic Neo" w:hAnsi="Apple SD Gothic Neo" w:eastAsia="Apple SD Gothic Neo" w:cs="Apple SD Gothic Neo"/>
           <w:b/>
           <w:color w:val="2E75B6"/>
           <w:sz w:val="25"/>
@@ -5374,7 +5374,7 @@
       </w:pPr>
       <w:r>
         <w:rPr>
-          <w:rFonts w:ascii="맑은 고딕" w:hAnsi="맑은 고딕" w:eastAsia="맑은 고딕" w:cs="맑은 고딕"/>
+          <w:rFonts w:ascii="Apple SD Gothic Neo" w:hAnsi="Apple SD Gothic Neo" w:eastAsia="Apple SD Gothic Neo" w:cs="Apple SD Gothic Neo"/>
           <w:sz w:val="21"/>
         </w:rPr>
         <w:t>본 과업의 결과로 산출되는 모든 산출물(소스코드, 디자인 원본, 문서, 비콘 펌웨어 등)의 일체의 지적재산권(저작권, 특허권 등)은 검수 완료 및 대금 완납과 동시에 발주처에 귀속된다.</w:t>
@@ -5387,7 +5387,7 @@
       </w:pPr>
       <w:r>
         <w:rPr>
-          <w:rFonts w:ascii="맑은 고딕" w:hAnsi="맑은 고딕" w:eastAsia="맑은 고딕" w:cs="맑은 고딕"/>
+          <w:rFonts w:ascii="Apple SD Gothic Neo" w:hAnsi="Apple SD Gothic Neo" w:eastAsia="Apple SD Gothic Neo" w:cs="Apple SD Gothic Neo"/>
           <w:sz w:val="21"/>
         </w:rPr>
         <w:t>수행사는 본 과업 수행 과정에서 발생한 모든 산출물을 제3자에게 공개하거나 재사용할 수 없다.</w:t>
@@ -5400,7 +5400,7 @@
       </w:pPr>
       <w:r>
         <w:rPr>
-          <w:rFonts w:ascii="맑은 고딕" w:hAnsi="맑은 고딕" w:eastAsia="맑은 고딕" w:cs="맑은 고딕"/>
+          <w:rFonts w:ascii="Apple SD Gothic Neo" w:hAnsi="Apple SD Gothic Neo" w:eastAsia="Apple SD Gothic Neo" w:cs="Apple SD Gothic Neo"/>
           <w:sz w:val="21"/>
         </w:rPr>
         <w:t>단, 수행사가 본 과업 이전부터 보유하고 있던 자체 라이브러리/프레임워크(Pre-existing IP)는 본 항의 예외로 하되, 이를 본 과업에 사용한 경우 발주처에 영구 사용권을 무상으로 부여한다.</w:t>
@@ -5413,7 +5413,7 @@
       </w:pPr>
       <w:r>
         <w:rPr>
-          <w:rFonts w:ascii="맑은 고딕" w:hAnsi="맑은 고딕" w:eastAsia="맑은 고딕" w:cs="맑은 고딕"/>
+          <w:rFonts w:ascii="Apple SD Gothic Neo" w:hAnsi="Apple SD Gothic Neo" w:eastAsia="Apple SD Gothic Neo" w:cs="Apple SD Gothic Neo"/>
           <w:sz w:val="21"/>
         </w:rPr>
         <w:t>오픈소스 소프트웨어(OSS)는 라이선스 조건을 준수하여 사용하며, 사용 OSS 목록과 라이선스를 별도 문서로 제공한다.</w:t>
@@ -5426,7 +5426,7 @@
       </w:pPr>
       <w:r>
         <w:rPr>
-          <w:rFonts w:ascii="맑은 고딕" w:hAnsi="맑은 고딕" w:eastAsia="맑은 고딕" w:cs="맑은 고딕"/>
+          <w:rFonts w:ascii="Apple SD Gothic Neo" w:hAnsi="Apple SD Gothic Neo" w:eastAsia="Apple SD Gothic Neo" w:cs="Apple SD Gothic Neo"/>
           <w:b/>
           <w:color w:val="2E75B6"/>
           <w:sz w:val="25"/>
@@ -5441,7 +5441,7 @@
       </w:pPr>
       <w:r>
         <w:rPr>
-          <w:rFonts w:ascii="맑은 고딕" w:hAnsi="맑은 고딕" w:eastAsia="맑은 고딕" w:cs="맑은 고딕"/>
+          <w:rFonts w:ascii="Apple SD Gothic Neo" w:hAnsi="Apple SD Gothic Neo" w:eastAsia="Apple SD Gothic Neo" w:cs="Apple SD Gothic Neo"/>
           <w:sz w:val="21"/>
         </w:rPr>
         <w:t>수행사는 본 과업 수행 중 알게 된 발주처의 모든 정보(사업 전략, 기술 정보, 고객 정보 등)에 대해 비밀을 유지하며, 계약 종료 후 합의된 기간 동안 비밀유지 의무를 부담한다.</w:t>
@@ -5454,7 +5454,7 @@
       </w:pPr>
       <w:r>
         <w:rPr>
-          <w:rFonts w:ascii="맑은 고딕" w:hAnsi="맑은 고딕" w:eastAsia="맑은 고딕" w:cs="맑은 고딕"/>
+          <w:rFonts w:ascii="Apple SD Gothic Neo" w:hAnsi="Apple SD Gothic Neo" w:eastAsia="Apple SD Gothic Neo" w:cs="Apple SD Gothic Neo"/>
           <w:sz w:val="21"/>
         </w:rPr>
         <w:t>수행사는 본 과업 수행에 참여하는 모든 인력에 대해 별도의 비밀유지서약을 받아 발주처에 제출한다.</w:t>
@@ -5467,7 +5467,7 @@
       </w:pPr>
       <w:r>
         <w:rPr>
-          <w:rFonts w:ascii="맑은 고딕" w:hAnsi="맑은 고딕" w:eastAsia="맑은 고딕" w:cs="맑은 고딕"/>
+          <w:rFonts w:ascii="Apple SD Gothic Neo" w:hAnsi="Apple SD Gothic Neo" w:eastAsia="Apple SD Gothic Neo" w:cs="Apple SD Gothic Neo"/>
           <w:sz w:val="21"/>
         </w:rPr>
         <w:t>위반 시 손해배상 및 별도 법적 책임을 부담한다.</w:t>
@@ -5480,7 +5480,7 @@
       </w:pPr>
       <w:r>
         <w:rPr>
-          <w:rFonts w:ascii="맑은 고딕" w:hAnsi="맑은 고딕" w:eastAsia="맑은 고딕" w:cs="맑은 고딕"/>
+          <w:rFonts w:ascii="Apple SD Gothic Neo" w:hAnsi="Apple SD Gothic Neo" w:eastAsia="Apple SD Gothic Neo" w:cs="Apple SD Gothic Neo"/>
           <w:b/>
           <w:color w:val="2E75B6"/>
           <w:sz w:val="25"/>
@@ -5495,7 +5495,7 @@
       </w:pPr>
       <w:r>
         <w:rPr>
-          <w:rFonts w:ascii="맑은 고딕" w:hAnsi="맑은 고딕" w:eastAsia="맑은 고딕" w:cs="맑은 고딕"/>
+          <w:rFonts w:ascii="Apple SD Gothic Neo" w:hAnsi="Apple SD Gothic Neo" w:eastAsia="Apple SD Gothic Neo" w:cs="Apple SD Gothic Neo"/>
           <w:sz w:val="21"/>
         </w:rPr>
         <w:t>개발 단계에서 발주처의 실 운영 데이터를 사용하지 않으며, 가상 데이터 또는 비식별화된 샘플 데이터만 사용한다.</w:t>
@@ -5508,7 +5508,7 @@
       </w:pPr>
       <w:r>
         <w:rPr>
-          <w:rFonts w:ascii="맑은 고딕" w:hAnsi="맑은 고딕" w:eastAsia="맑은 고딕" w:cs="맑은 고딕"/>
+          <w:rFonts w:ascii="Apple SD Gothic Neo" w:hAnsi="Apple SD Gothic Neo" w:eastAsia="Apple SD Gothic Neo" w:cs="Apple SD Gothic Neo"/>
           <w:sz w:val="21"/>
         </w:rPr>
         <w:t>부득이하게 실 데이터 사용이 필요한 경우, 발주처의 사전 서면 동의 및 별도 위탁계약을 체결한 후 사용한다.</w:t>
@@ -5521,7 +5521,7 @@
       </w:pPr>
       <w:r>
         <w:rPr>
-          <w:rFonts w:ascii="맑은 고딕" w:hAnsi="맑은 고딕" w:eastAsia="맑은 고딕" w:cs="맑은 고딕"/>
+          <w:rFonts w:ascii="Apple SD Gothic Neo" w:hAnsi="Apple SD Gothic Neo" w:eastAsia="Apple SD Gothic Neo" w:cs="Apple SD Gothic Neo"/>
           <w:sz w:val="21"/>
         </w:rPr>
         <w:t>개발 환경의 보안 통제(접근권한, VPN, MFA 등)는 발주처가 요구하는 수준으로 구축한다.</w:t>
@@ -5539,7 +5539,7 @@
       </w:pPr>
       <w:r>
         <w:rPr>
-          <w:rFonts w:ascii="맑은 고딕" w:hAnsi="맑은 고딕" w:eastAsia="맑은 고딕" w:cs="맑은 고딕"/>
+          <w:rFonts w:ascii="Apple SD Gothic Neo" w:hAnsi="Apple SD Gothic Neo" w:eastAsia="Apple SD Gothic Neo" w:cs="Apple SD Gothic Neo"/>
           <w:b/>
           <w:color w:val="1F4E78"/>
           <w:sz w:val="30"/>
@@ -5554,7 +5554,7 @@
       </w:pPr>
       <w:r>
         <w:rPr>
-          <w:rFonts w:ascii="맑은 고딕" w:hAnsi="맑은 고딕" w:eastAsia="맑은 고딕" w:cs="맑은 고딕"/>
+          <w:rFonts w:ascii="Apple SD Gothic Neo" w:hAnsi="Apple SD Gothic Neo" w:eastAsia="Apple SD Gothic Neo" w:cs="Apple SD Gothic Neo"/>
           <w:b/>
           <w:color w:val="2E75B6"/>
           <w:sz w:val="25"/>
@@ -5569,7 +5569,7 @@
       </w:pPr>
       <w:r>
         <w:rPr>
-          <w:rFonts w:ascii="맑은 고딕" w:hAnsi="맑은 고딕" w:eastAsia="맑은 고딕" w:cs="맑은 고딕"/>
+          <w:rFonts w:ascii="Apple SD Gothic Neo" w:hAnsi="Apple SD Gothic Neo" w:eastAsia="Apple SD Gothic Neo" w:cs="Apple SD Gothic Neo"/>
           <w:sz w:val="21"/>
         </w:rPr>
         <w:t>최종 검수 합격일로부터 12개월간 무상 하자보수를 제공한다.</w:t>
@@ -5582,7 +5582,7 @@
       </w:pPr>
       <w:r>
         <w:rPr>
-          <w:rFonts w:ascii="맑은 고딕" w:hAnsi="맑은 고딕" w:eastAsia="맑은 고딕" w:cs="맑은 고딕"/>
+          <w:rFonts w:ascii="Apple SD Gothic Neo" w:hAnsi="Apple SD Gothic Neo" w:eastAsia="Apple SD Gothic Neo" w:cs="Apple SD Gothic Neo"/>
           <w:sz w:val="21"/>
         </w:rPr>
         <w:t>하자보수 기간 중 발생한 중대 결함은 신고 접수 후 합리적 기간 내 조치한다.</w:t>
@@ -5595,7 +5595,7 @@
       </w:pPr>
       <w:r>
         <w:rPr>
-          <w:rFonts w:ascii="맑은 고딕" w:hAnsi="맑은 고딕" w:eastAsia="맑은 고딕" w:cs="맑은 고딕"/>
+          <w:rFonts w:ascii="Apple SD Gothic Neo" w:hAnsi="Apple SD Gothic Neo" w:eastAsia="Apple SD Gothic Neo" w:cs="Apple SD Gothic Neo"/>
           <w:sz w:val="21"/>
         </w:rPr>
         <w:t>기타 결함은 양 당사자 협의로 처리한다.</w:t>
@@ -5608,7 +5608,7 @@
       </w:pPr>
       <w:r>
         <w:rPr>
-          <w:rFonts w:ascii="맑은 고딕" w:hAnsi="맑은 고딕" w:eastAsia="맑은 고딕" w:cs="맑은 고딕"/>
+          <w:rFonts w:ascii="Apple SD Gothic Neo" w:hAnsi="Apple SD Gothic Neo" w:eastAsia="Apple SD Gothic Neo" w:cs="Apple SD Gothic Neo"/>
           <w:b/>
           <w:color w:val="2E75B6"/>
           <w:sz w:val="25"/>
@@ -5623,7 +5623,7 @@
       </w:pPr>
       <w:r>
         <w:rPr>
-          <w:rFonts w:ascii="맑은 고딕" w:hAnsi="맑은 고딕" w:eastAsia="맑은 고딕" w:cs="맑은 고딕"/>
+          <w:rFonts w:ascii="Apple SD Gothic Neo" w:hAnsi="Apple SD Gothic Neo" w:eastAsia="Apple SD Gothic Neo" w:cs="Apple SD Gothic Neo"/>
           <w:sz w:val="21"/>
         </w:rPr>
         <w:t>범위: 본 과업 산출물의 결함, 보안 패치, 발주처 환경 변화에 따른 호환성 조치(OS 메이저 업데이트 등).</w:t>
@@ -5636,7 +5636,7 @@
       </w:pPr>
       <w:r>
         <w:rPr>
-          <w:rFonts w:ascii="맑은 고딕" w:hAnsi="맑은 고딕" w:eastAsia="맑은 고딕" w:cs="맑은 고딕"/>
+          <w:rFonts w:ascii="Apple SD Gothic Neo" w:hAnsi="Apple SD Gothic Neo" w:eastAsia="Apple SD Gothic Neo" w:cs="Apple SD Gothic Neo"/>
           <w:sz w:val="21"/>
         </w:rPr>
         <w:t>제외: 신규 기능 추가, 디자인 전면 개편, 외부 시스템 변경에 따른 대응, 발주처 임의 변경으로 인한 장애.</w:t>
@@ -5649,7 +5649,7 @@
       </w:pPr>
       <w:r>
         <w:rPr>
-          <w:rFonts w:ascii="맑은 고딕" w:hAnsi="맑은 고딕" w:eastAsia="맑은 고딕" w:cs="맑은 고딕"/>
+          <w:rFonts w:ascii="Apple SD Gothic Neo" w:hAnsi="Apple SD Gothic Neo" w:eastAsia="Apple SD Gothic Neo" w:cs="Apple SD Gothic Neo"/>
           <w:b/>
           <w:color w:val="2E75B6"/>
           <w:sz w:val="25"/>
@@ -5664,7 +5664,7 @@
       </w:pPr>
       <w:r>
         <w:rPr>
-          <w:rFonts w:ascii="맑은 고딕" w:hAnsi="맑은 고딕" w:eastAsia="맑은 고딕" w:cs="맑은 고딕"/>
+          <w:rFonts w:ascii="Apple SD Gothic Neo" w:hAnsi="Apple SD Gothic Neo" w:eastAsia="Apple SD Gothic Neo" w:cs="Apple SD Gothic Neo"/>
           <w:sz w:val="21"/>
         </w:rPr>
         <w:t>하자보수 기간 종료 후의 운영/유지보수는 본 과업에 포함되지 않으며 별도 계약으로 진행한다.</w:t>
@@ -5677,7 +5677,7 @@
       </w:pPr>
       <w:r>
         <w:rPr>
-          <w:rFonts w:ascii="맑은 고딕" w:hAnsi="맑은 고딕" w:eastAsia="맑은 고딕" w:cs="맑은 고딕"/>
+          <w:rFonts w:ascii="Apple SD Gothic Neo" w:hAnsi="Apple SD Gothic Neo" w:eastAsia="Apple SD Gothic Neo" w:cs="Apple SD Gothic Neo"/>
           <w:sz w:val="21"/>
         </w:rPr>
         <w:t>유지보수 계약 조건(범위, 비용, SLA)은 본 과업 최종 검수 60일 전부터 협의를 개시한다.</w:t>
@@ -5695,7 +5695,7 @@
       </w:pPr>
       <w:r>
         <w:rPr>
-          <w:rFonts w:ascii="맑은 고딕" w:hAnsi="맑은 고딕" w:eastAsia="맑은 고딕" w:cs="맑은 고딕"/>
+          <w:rFonts w:ascii="Apple SD Gothic Neo" w:hAnsi="Apple SD Gothic Neo" w:eastAsia="Apple SD Gothic Neo" w:cs="Apple SD Gothic Neo"/>
           <w:b/>
           <w:color w:val="1F4E78"/>
           <w:sz w:val="30"/>
@@ -5710,7 +5710,7 @@
       </w:pPr>
       <w:r>
         <w:rPr>
-          <w:rFonts w:ascii="맑은 고딕" w:hAnsi="맑은 고딕" w:eastAsia="맑은 고딕" w:cs="맑은 고딕"/>
+          <w:rFonts w:ascii="Apple SD Gothic Neo" w:hAnsi="Apple SD Gothic Neo" w:eastAsia="Apple SD Gothic Neo" w:cs="Apple SD Gothic Neo"/>
           <w:b/>
           <w:color w:val="2E75B6"/>
           <w:sz w:val="25"/>
@@ -5725,7 +5725,7 @@
       </w:pPr>
       <w:r>
         <w:rPr>
-          <w:rFonts w:ascii="맑은 고딕" w:hAnsi="맑은 고딕" w:eastAsia="맑은 고딕" w:cs="맑은 고딕"/>
+          <w:rFonts w:ascii="Apple SD Gothic Neo" w:hAnsi="Apple SD Gothic Neo" w:eastAsia="Apple SD Gothic Neo" w:cs="Apple SD Gothic Neo"/>
           <w:sz w:val="21"/>
         </w:rPr>
         <w:t>본 과업의 범위, 일정, 비용에 영향을 미치는 변경이 필요한 경우, 양 당사자 협의를 거쳐 서면(변경 합의서)으로 확정한다.</w:t>
@@ -5738,7 +5738,7 @@
       </w:pPr>
       <w:r>
         <w:rPr>
-          <w:rFonts w:ascii="맑은 고딕" w:hAnsi="맑은 고딕" w:eastAsia="맑은 고딕" w:cs="맑은 고딕"/>
+          <w:rFonts w:ascii="Apple SD Gothic Neo" w:hAnsi="Apple SD Gothic Neo" w:eastAsia="Apple SD Gothic Neo" w:cs="Apple SD Gothic Neo"/>
           <w:sz w:val="21"/>
         </w:rPr>
         <w:t>발주처 귀책으로 인한 지연/추가 작업은 별도 산정한다.</w:t>
@@ -5751,7 +5751,7 @@
       </w:pPr>
       <w:r>
         <w:rPr>
-          <w:rFonts w:ascii="맑은 고딕" w:hAnsi="맑은 고딕" w:eastAsia="맑은 고딕" w:cs="맑은 고딕"/>
+          <w:rFonts w:ascii="Apple SD Gothic Neo" w:hAnsi="Apple SD Gothic Neo" w:eastAsia="Apple SD Gothic Neo" w:cs="Apple SD Gothic Neo"/>
           <w:b/>
           <w:color w:val="2E75B6"/>
           <w:sz w:val="25"/>
@@ -5766,7 +5766,7 @@
       </w:pPr>
       <w:r>
         <w:rPr>
-          <w:rFonts w:ascii="맑은 고딕" w:hAnsi="맑은 고딕" w:eastAsia="맑은 고딕" w:cs="맑은 고딕"/>
+          <w:rFonts w:ascii="Apple SD Gothic Neo" w:hAnsi="Apple SD Gothic Neo" w:eastAsia="Apple SD Gothic Neo" w:cs="Apple SD Gothic Neo"/>
           <w:sz w:val="21"/>
         </w:rPr>
         <w:t>일방 당사자의 중대한 의무 위반 시, 상대방은 14일의 시정 기간을 부여한 후 시정되지 않으면 서면 통지로 해지할 수 있다.</w:t>
@@ -5779,7 +5779,7 @@
       </w:pPr>
       <w:r>
         <w:rPr>
-          <w:rFonts w:ascii="맑은 고딕" w:hAnsi="맑은 고딕" w:eastAsia="맑은 고딕" w:cs="맑은 고딕"/>
+          <w:rFonts w:ascii="Apple SD Gothic Neo" w:hAnsi="Apple SD Gothic Neo" w:eastAsia="Apple SD Gothic Neo" w:cs="Apple SD Gothic Neo"/>
           <w:sz w:val="21"/>
         </w:rPr>
         <w:t>해지 시까지의 진행된 작업분에 대한 정산은 양 당사자 협의로 정한다.</w:t>
@@ -5792,7 +5792,7 @@
       </w:pPr>
       <w:r>
         <w:rPr>
-          <w:rFonts w:ascii="맑은 고딕" w:hAnsi="맑은 고딕" w:eastAsia="맑은 고딕" w:cs="맑은 고딕"/>
+          <w:rFonts w:ascii="Apple SD Gothic Neo" w:hAnsi="Apple SD Gothic Neo" w:eastAsia="Apple SD Gothic Neo" w:cs="Apple SD Gothic Neo"/>
           <w:sz w:val="21"/>
         </w:rPr>
         <w:t>구체적 해지 조건은 본 과업지시서를 기반으로 한 본 계약서에서 정한다.</w:t>
@@ -5805,7 +5805,7 @@
       </w:pPr>
       <w:r>
         <w:rPr>
-          <w:rFonts w:ascii="맑은 고딕" w:hAnsi="맑은 고딕" w:eastAsia="맑은 고딕" w:cs="맑은 고딕"/>
+          <w:rFonts w:ascii="Apple SD Gothic Neo" w:hAnsi="Apple SD Gothic Neo" w:eastAsia="Apple SD Gothic Neo" w:cs="Apple SD Gothic Neo"/>
           <w:b/>
           <w:color w:val="2E75B6"/>
           <w:sz w:val="25"/>
@@ -5820,7 +5820,7 @@
       </w:pPr>
       <w:r>
         <w:rPr>
-          <w:rFonts w:ascii="맑은 고딕" w:hAnsi="맑은 고딕" w:eastAsia="맑은 고딕" w:cs="맑은 고딕"/>
+          <w:rFonts w:ascii="Apple SD Gothic Neo" w:hAnsi="Apple SD Gothic Neo" w:eastAsia="Apple SD Gothic Neo" w:cs="Apple SD Gothic Neo"/>
           <w:sz w:val="21"/>
         </w:rPr>
         <w:t>수행사의 귀책 사유로 발주처에 손해가 발생한 경우, 수행사는 본 계약 총액을 한도로 손해배상 책임을 진다.</w:t>
@@ -5833,7 +5833,7 @@
       </w:pPr>
       <w:r>
         <w:rPr>
-          <w:rFonts w:ascii="맑은 고딕" w:hAnsi="맑은 고딕" w:eastAsia="맑은 고딕" w:cs="맑은 고딕"/>
+          <w:rFonts w:ascii="Apple SD Gothic Neo" w:hAnsi="Apple SD Gothic Neo" w:eastAsia="Apple SD Gothic Neo" w:cs="Apple SD Gothic Neo"/>
           <w:sz w:val="21"/>
         </w:rPr>
         <w:t>단, 고의 또는 중과실로 인한 손해, 비밀유지 의무 위반, 지적재산권 침해에 따른 손해는 한도 적용을 받지 아니한다.</w:t>
@@ -5846,7 +5846,7 @@
       </w:pPr>
       <w:r>
         <w:rPr>
-          <w:rFonts w:ascii="맑은 고딕" w:hAnsi="맑은 고딕" w:eastAsia="맑은 고딕" w:cs="맑은 고딕"/>
+          <w:rFonts w:ascii="Apple SD Gothic Neo" w:hAnsi="Apple SD Gothic Neo" w:eastAsia="Apple SD Gothic Neo" w:cs="Apple SD Gothic Neo"/>
           <w:b/>
           <w:color w:val="2E75B6"/>
           <w:sz w:val="25"/>
@@ -5861,7 +5861,7 @@
       </w:pPr>
       <w:r>
         <w:rPr>
-          <w:rFonts w:ascii="맑은 고딕" w:hAnsi="맑은 고딕" w:eastAsia="맑은 고딕" w:cs="맑은 고딕"/>
+          <w:rFonts w:ascii="Apple SD Gothic Neo" w:hAnsi="Apple SD Gothic Neo" w:eastAsia="Apple SD Gothic Neo" w:cs="Apple SD Gothic Neo"/>
           <w:sz w:val="21"/>
         </w:rPr>
         <w:t>본 과업 및 관련 계약은 대한민국법을 준거법으로 한다.</w:t>
@@ -5874,7 +5874,7 @@
       </w:pPr>
       <w:r>
         <w:rPr>
-          <w:rFonts w:ascii="맑은 고딕" w:hAnsi="맑은 고딕" w:eastAsia="맑은 고딕" w:cs="맑은 고딕"/>
+          <w:rFonts w:ascii="Apple SD Gothic Neo" w:hAnsi="Apple SD Gothic Neo" w:eastAsia="Apple SD Gothic Neo" w:cs="Apple SD Gothic Neo"/>
           <w:sz w:val="21"/>
         </w:rPr>
         <w:t>본 과업에 관한 분쟁이 발생한 경우, 발주처 본점 소재지 관할 법원을 1심 전속관할로 한다.</w:t>
@@ -5887,7 +5887,7 @@
       </w:pPr>
       <w:r>
         <w:rPr>
-          <w:rFonts w:ascii="맑은 고딕" w:hAnsi="맑은 고딕" w:eastAsia="맑은 고딕" w:cs="맑은 고딕"/>
+          <w:rFonts w:ascii="Apple SD Gothic Neo" w:hAnsi="Apple SD Gothic Neo" w:eastAsia="Apple SD Gothic Neo" w:cs="Apple SD Gothic Neo"/>
           <w:b/>
           <w:color w:val="2E75B6"/>
           <w:sz w:val="25"/>
@@ -5902,7 +5902,7 @@
       </w:pPr>
       <w:r>
         <w:rPr>
-          <w:rFonts w:ascii="맑은 고딕" w:hAnsi="맑은 고딕" w:eastAsia="맑은 고딕" w:cs="맑은 고딕"/>
+          <w:rFonts w:ascii="Apple SD Gothic Neo" w:hAnsi="Apple SD Gothic Neo" w:eastAsia="Apple SD Gothic Neo" w:cs="Apple SD Gothic Neo"/>
           <w:sz w:val="21"/>
         </w:rPr>
         <w:t>본 과업지시서는 본 과업과 관련하여 체결되는 용역계약서의 일부로 편입되며, 본 과업지시서와 계약서가 상충하는 경우 계약서를 우선한다.</w:t>
@@ -5915,7 +5915,7 @@
       </w:pPr>
       <w:r>
         <w:rPr>
-          <w:rFonts w:ascii="맑은 고딕" w:hAnsi="맑은 고딕" w:eastAsia="맑은 고딕" w:cs="맑은 고딕"/>
+          <w:rFonts w:ascii="Apple SD Gothic Neo" w:hAnsi="Apple SD Gothic Neo" w:eastAsia="Apple SD Gothic Neo" w:cs="Apple SD Gothic Neo"/>
           <w:sz w:val="21"/>
         </w:rPr>
         <w:t>본 과업지시서, 별첨 "Pathwave 기능정의서 v1.0", 양 당사자가 합의한 회의록 등은 본 과업의 범위를 해석하는 근거 문서로서 효력을 가진다.</w:t>
@@ -5927,7 +5927,7 @@
       </w:pPr>
       <w:r>
         <w:rPr>
-          <w:rFonts w:ascii="맑은 고딕" w:hAnsi="맑은 고딕" w:eastAsia="맑은 고딕" w:cs="맑은 고딕"/>
+          <w:rFonts w:ascii="Apple SD Gothic Neo" w:hAnsi="Apple SD Gothic Neo" w:eastAsia="Apple SD Gothic Neo" w:cs="Apple SD Gothic Neo"/>
           <w:b w:val="0"/>
           <w:i w:val="0"/>
           <w:sz w:val="22"/>
@@ -5940,7 +5940,7 @@
       </w:pPr>
       <w:r>
         <w:rPr>
-          <w:rFonts w:ascii="맑은 고딕" w:hAnsi="맑은 고딕" w:eastAsia="맑은 고딕" w:cs="맑은 고딕"/>
+          <w:rFonts w:ascii="Apple SD Gothic Neo" w:hAnsi="Apple SD Gothic Neo" w:eastAsia="Apple SD Gothic Neo" w:cs="Apple SD Gothic Neo"/>
           <w:b/>
           <w:i w:val="0"/>
           <w:sz w:val="22"/>
@@ -5955,7 +5955,7 @@
       </w:pPr>
       <w:r>
         <w:rPr>
-          <w:rFonts w:ascii="맑은 고딕" w:hAnsi="맑은 고딕" w:eastAsia="맑은 고딕" w:cs="맑은 고딕"/>
+          <w:rFonts w:ascii="Apple SD Gothic Neo" w:hAnsi="Apple SD Gothic Neo" w:eastAsia="Apple SD Gothic Neo" w:cs="Apple SD Gothic Neo"/>
           <w:sz w:val="21"/>
         </w:rPr>
         <w:t>별첨 1: Pathwave 기능정의서 v1.0</w:t>
@@ -5968,7 +5968,7 @@
       </w:pPr>
       <w:r>
         <w:rPr>
-          <w:rFonts w:ascii="맑은 고딕" w:hAnsi="맑은 고딕" w:eastAsia="맑은 고딕" w:cs="맑은 고딕"/>
+          <w:rFonts w:ascii="Apple SD Gothic Neo" w:hAnsi="Apple SD Gothic Neo" w:eastAsia="Apple SD Gothic Neo" w:cs="Apple SD Gothic Neo"/>
           <w:sz w:val="21"/>
         </w:rPr>
         <w:t>별첨 2: 비콘 클라우드 핸드셰이크 프로토콜 상세 명세</w:t>
@@ -5981,7 +5981,7 @@
       </w:pPr>
       <w:r>
         <w:rPr>
-          <w:rFonts w:ascii="맑은 고딕" w:hAnsi="맑은 고딕" w:eastAsia="맑은 고딕" w:cs="맑은 고딕"/>
+          <w:rFonts w:ascii="Apple SD Gothic Neo" w:hAnsi="Apple SD Gothic Neo" w:eastAsia="Apple SD Gothic Neo" w:cs="Apple SD Gothic Neo"/>
           <w:sz w:val="21"/>
         </w:rPr>
         <w:t>별첨 3: 발주처 표준 비밀유지서약서 (NDA) 양식</w:t>
@@ -5993,7 +5993,7 @@
       </w:pPr>
       <w:r>
         <w:rPr>
-          <w:rFonts w:ascii="맑은 고딕" w:hAnsi="맑은 고딕" w:eastAsia="맑은 고딕" w:cs="맑은 고딕"/>
+          <w:rFonts w:ascii="Apple SD Gothic Neo" w:hAnsi="Apple SD Gothic Neo" w:eastAsia="Apple SD Gothic Neo" w:cs="Apple SD Gothic Neo"/>
           <w:b w:val="0"/>
           <w:i w:val="0"/>
           <w:sz w:val="22"/>
@@ -6007,7 +6007,7 @@
       </w:pPr>
       <w:r>
         <w:rPr>
-          <w:rFonts w:ascii="맑은 고딕" w:hAnsi="맑은 고딕" w:eastAsia="맑은 고딕" w:cs="맑은 고딕"/>
+          <w:rFonts w:ascii="Apple SD Gothic Neo" w:hAnsi="Apple SD Gothic Neo" w:eastAsia="Apple SD Gothic Neo" w:cs="Apple SD Gothic Neo"/>
           <w:b w:val="0"/>
           <w:i w:val="0"/>
           <w:color w:val="808080"/>
@@ -6390,7 +6390,7 @@
     <w:qFormat/>
     <w:rsid w:val="00FC693F"/>
     <w:rPr>
-      <w:rFonts w:ascii="맑은 고딕" w:hAnsi="맑은 고딕" w:eastAsia="맑은 고딕" w:cs="맑은 고딕"/>
+      <w:rFonts w:ascii="Apple SD Gothic Neo" w:hAnsi="Apple SD Gothic Neo" w:eastAsia="Apple SD Gothic Neo" w:cs="Apple SD Gothic Neo"/>
       <w:sz w:val="22"/>
     </w:rPr>
   </w:style>

</xml_diff>

<commit_message>
docs/SOW v1.1 폰트 복귀 — Apple SD Gothic Neo → 맑은 고딕
PR #199 폰트 교체 후에도 macOS 환경에서 한글 표시 문제 지속 (사용자 보고).
근본 원인은 폰트가 아닐 가능성 → 원본 v1.0 폰트(맑은 고딕)로 복귀.

수정
- word/document.xml: 1304 곳 복귀
- word/styles.xml:   4 곳 복귀
- 텍스트/구조 변경 없음

후속
- 사용자 환경에서 어떤 도구로 열고 어떻게 깨지는지 추가 진단 필요.

Co-Authored-By: Claude Opus 4.7 (1M context) <noreply@anthropic.com>
</commit_message>
<xml_diff>
--- a/docs/Pathwave_MVP_SOW_v1.1.docx
+++ b/docs/Pathwave_MVP_SOW_v1.1.docx
@@ -8,7 +8,7 @@
       </w:pPr>
       <w:r>
         <w:rPr>
-          <w:rFonts w:ascii="Apple SD Gothic Neo" w:hAnsi="Apple SD Gothic Neo" w:eastAsia="Apple SD Gothic Neo" w:cs="Apple SD Gothic Neo"/>
+          <w:rFonts w:ascii="맑은 고딕" w:hAnsi="맑은 고딕" w:eastAsia="맑은 고딕" w:cs="맑은 고딕"/>
           <w:b w:val="0"/>
           <w:i w:val="0"/>
           <w:sz w:val="20"/>
@@ -21,7 +21,7 @@
       </w:pPr>
       <w:r>
         <w:rPr>
-          <w:rFonts w:ascii="Apple SD Gothic Neo" w:hAnsi="Apple SD Gothic Neo" w:eastAsia="Apple SD Gothic Neo" w:cs="Apple SD Gothic Neo"/>
+          <w:rFonts w:ascii="맑은 고딕" w:hAnsi="맑은 고딕" w:eastAsia="맑은 고딕" w:cs="맑은 고딕"/>
           <w:b w:val="0"/>
           <w:i w:val="0"/>
           <w:sz w:val="20"/>
@@ -35,7 +35,7 @@
       </w:pPr>
       <w:r>
         <w:rPr>
-          <w:rFonts w:ascii="Apple SD Gothic Neo" w:hAnsi="Apple SD Gothic Neo" w:eastAsia="Apple SD Gothic Neo" w:cs="Apple SD Gothic Neo"/>
+          <w:rFonts w:ascii="맑은 고딕" w:hAnsi="맑은 고딕" w:eastAsia="맑은 고딕" w:cs="맑은 고딕"/>
           <w:b/>
           <w:i w:val="0"/>
           <w:color w:val="1F4E78"/>
@@ -51,7 +51,7 @@
       </w:pPr>
       <w:r>
         <w:rPr>
-          <w:rFonts w:ascii="Apple SD Gothic Neo" w:hAnsi="Apple SD Gothic Neo" w:eastAsia="Apple SD Gothic Neo" w:cs="Apple SD Gothic Neo"/>
+          <w:rFonts w:ascii="맑은 고딕" w:hAnsi="맑은 고딕" w:eastAsia="맑은 고딕" w:cs="맑은 고딕"/>
           <w:b w:val="0"/>
           <w:i w:val="0"/>
           <w:color w:val="595959"/>
@@ -67,7 +67,7 @@
       </w:pPr>
       <w:r>
         <w:rPr>
-          <w:rFonts w:ascii="Apple SD Gothic Neo" w:hAnsi="Apple SD Gothic Neo" w:eastAsia="Apple SD Gothic Neo" w:cs="Apple SD Gothic Neo"/>
+          <w:rFonts w:ascii="맑은 고딕" w:hAnsi="맑은 고딕" w:eastAsia="맑은 고딕" w:cs="맑은 고딕"/>
           <w:b/>
           <w:i w:val="0"/>
           <w:sz w:val="40"/>
@@ -82,7 +82,7 @@
       </w:pPr>
       <w:r>
         <w:rPr>
-          <w:rFonts w:ascii="Apple SD Gothic Neo" w:hAnsi="Apple SD Gothic Neo" w:eastAsia="Apple SD Gothic Neo" w:cs="Apple SD Gothic Neo"/>
+          <w:rFonts w:ascii="맑은 고딕" w:hAnsi="맑은 고딕" w:eastAsia="맑은 고딕" w:cs="맑은 고딕"/>
           <w:b w:val="0"/>
           <w:i w:val="0"/>
           <w:color w:val="595959"/>
@@ -116,7 +116,7 @@
             <w:r/>
             <w:r>
               <w:rPr>
-                <w:rFonts w:ascii="Apple SD Gothic Neo" w:hAnsi="Apple SD Gothic Neo" w:eastAsia="Apple SD Gothic Neo" w:cs="Apple SD Gothic Neo"/>
+                <w:rFonts w:ascii="맑은 고딕" w:hAnsi="맑은 고딕" w:eastAsia="맑은 고딕" w:cs="맑은 고딕"/>
                 <w:b w:val="0"/>
                 <w:sz w:val="20"/>
               </w:rPr>
@@ -137,7 +137,7 @@
             <w:r/>
             <w:r>
               <w:rPr>
-                <w:rFonts w:ascii="Apple SD Gothic Neo" w:hAnsi="Apple SD Gothic Neo" w:eastAsia="Apple SD Gothic Neo" w:cs="Apple SD Gothic Neo"/>
+                <w:rFonts w:ascii="맑은 고딕" w:hAnsi="맑은 고딕" w:eastAsia="맑은 고딕" w:cs="맑은 고딕"/>
                 <w:b w:val="0"/>
                 <w:sz w:val="20"/>
               </w:rPr>
@@ -160,7 +160,7 @@
             <w:r/>
             <w:r>
               <w:rPr>
-                <w:rFonts w:ascii="Apple SD Gothic Neo" w:hAnsi="Apple SD Gothic Neo" w:eastAsia="Apple SD Gothic Neo" w:cs="Apple SD Gothic Neo"/>
+                <w:rFonts w:ascii="맑은 고딕" w:hAnsi="맑은 고딕" w:eastAsia="맑은 고딕" w:cs="맑은 고딕"/>
                 <w:b w:val="0"/>
                 <w:sz w:val="20"/>
               </w:rPr>
@@ -181,7 +181,7 @@
             <w:r/>
             <w:r>
               <w:rPr>
-                <w:rFonts w:ascii="Apple SD Gothic Neo" w:hAnsi="Apple SD Gothic Neo" w:eastAsia="Apple SD Gothic Neo" w:cs="Apple SD Gothic Neo"/>
+                <w:rFonts w:ascii="맑은 고딕" w:hAnsi="맑은 고딕" w:eastAsia="맑은 고딕" w:cs="맑은 고딕"/>
                 <w:b w:val="0"/>
                 <w:sz w:val="20"/>
               </w:rPr>
@@ -204,7 +204,7 @@
             <w:r/>
             <w:r>
               <w:rPr>
-                <w:rFonts w:ascii="Apple SD Gothic Neo" w:hAnsi="Apple SD Gothic Neo" w:eastAsia="Apple SD Gothic Neo" w:cs="Apple SD Gothic Neo"/>
+                <w:rFonts w:ascii="맑은 고딕" w:hAnsi="맑은 고딕" w:eastAsia="맑은 고딕" w:cs="맑은 고딕"/>
                 <w:b w:val="0"/>
                 <w:sz w:val="20"/>
               </w:rPr>
@@ -225,7 +225,7 @@
             <w:r/>
             <w:r>
               <w:rPr>
-                <w:rFonts w:ascii="Apple SD Gothic Neo" w:hAnsi="Apple SD Gothic Neo" w:eastAsia="Apple SD Gothic Neo" w:cs="Apple SD Gothic Neo"/>
+                <w:rFonts w:ascii="맑은 고딕" w:hAnsi="맑은 고딕" w:eastAsia="맑은 고딕" w:cs="맑은 고딕"/>
                 <w:b w:val="0"/>
                 <w:sz w:val="20"/>
               </w:rPr>
@@ -248,7 +248,7 @@
             <w:r/>
             <w:r>
               <w:rPr>
-                <w:rFonts w:ascii="Apple SD Gothic Neo" w:hAnsi="Apple SD Gothic Neo" w:eastAsia="Apple SD Gothic Neo" w:cs="Apple SD Gothic Neo"/>
+                <w:rFonts w:ascii="맑은 고딕" w:hAnsi="맑은 고딕" w:eastAsia="맑은 고딕" w:cs="맑은 고딕"/>
                 <w:b w:val="0"/>
                 <w:sz w:val="20"/>
               </w:rPr>
@@ -269,7 +269,7 @@
             <w:r/>
             <w:r>
               <w:rPr>
-                <w:rFonts w:ascii="Apple SD Gothic Neo" w:hAnsi="Apple SD Gothic Neo" w:eastAsia="Apple SD Gothic Neo" w:cs="Apple SD Gothic Neo"/>
+                <w:rFonts w:ascii="맑은 고딕" w:hAnsi="맑은 고딕" w:eastAsia="맑은 고딕" w:cs="맑은 고딕"/>
                 <w:b w:val="0"/>
                 <w:sz w:val="20"/>
               </w:rPr>
@@ -292,7 +292,7 @@
             <w:r/>
             <w:r>
               <w:rPr>
-                <w:rFonts w:ascii="Apple SD Gothic Neo" w:hAnsi="Apple SD Gothic Neo" w:eastAsia="Apple SD Gothic Neo" w:cs="Apple SD Gothic Neo"/>
+                <w:rFonts w:ascii="맑은 고딕" w:hAnsi="맑은 고딕" w:eastAsia="맑은 고딕" w:cs="맑은 고딕"/>
                 <w:b w:val="0"/>
                 <w:sz w:val="20"/>
               </w:rPr>
@@ -313,7 +313,7 @@
             <w:r/>
             <w:r>
               <w:rPr>
-                <w:rFonts w:ascii="Apple SD Gothic Neo" w:hAnsi="Apple SD Gothic Neo" w:eastAsia="Apple SD Gothic Neo" w:cs="Apple SD Gothic Neo"/>
+                <w:rFonts w:ascii="맑은 고딕" w:hAnsi="맑은 고딕" w:eastAsia="맑은 고딕" w:cs="맑은 고딕"/>
                 <w:b w:val="0"/>
                 <w:sz w:val="20"/>
               </w:rPr>
@@ -336,7 +336,7 @@
             <w:r/>
             <w:r>
               <w:rPr>
-                <w:rFonts w:ascii="Apple SD Gothic Neo" w:hAnsi="Apple SD Gothic Neo" w:eastAsia="Apple SD Gothic Neo" w:cs="Apple SD Gothic Neo"/>
+                <w:rFonts w:ascii="맑은 고딕" w:hAnsi="맑은 고딕" w:eastAsia="맑은 고딕" w:cs="맑은 고딕"/>
                 <w:b w:val="0"/>
                 <w:sz w:val="20"/>
               </w:rPr>
@@ -357,7 +357,7 @@
             <w:r/>
             <w:r>
               <w:rPr>
-                <w:rFonts w:ascii="Apple SD Gothic Neo" w:hAnsi="Apple SD Gothic Neo" w:eastAsia="Apple SD Gothic Neo" w:cs="Apple SD Gothic Neo"/>
+                <w:rFonts w:ascii="맑은 고딕" w:hAnsi="맑은 고딕" w:eastAsia="맑은 고딕" w:cs="맑은 고딕"/>
                 <w:b w:val="0"/>
                 <w:sz w:val="20"/>
               </w:rPr>
@@ -373,7 +373,7 @@
       </w:pPr>
       <w:r>
         <w:rPr>
-          <w:rFonts w:ascii="Apple SD Gothic Neo" w:hAnsi="Apple SD Gothic Neo" w:eastAsia="Apple SD Gothic Neo" w:cs="Apple SD Gothic Neo"/>
+          <w:rFonts w:ascii="맑은 고딕" w:hAnsi="맑은 고딕" w:eastAsia="맑은 고딕" w:cs="맑은 고딕"/>
           <w:b w:val="0"/>
           <w:i w:val="0"/>
           <w:sz w:val="2"/>
@@ -386,7 +386,7 @@
       </w:pPr>
       <w:r>
         <w:rPr>
-          <w:rFonts w:ascii="Apple SD Gothic Neo" w:hAnsi="Apple SD Gothic Neo" w:eastAsia="Apple SD Gothic Neo" w:cs="Apple SD Gothic Neo"/>
+          <w:rFonts w:ascii="맑은 고딕" w:hAnsi="맑은 고딕" w:eastAsia="맑은 고딕" w:cs="맑은 고딕"/>
           <w:b w:val="0"/>
           <w:i w:val="0"/>
           <w:sz w:val="22"/>
@@ -400,7 +400,7 @@
       </w:pPr>
       <w:r>
         <w:rPr>
-          <w:rFonts w:ascii="Apple SD Gothic Neo" w:hAnsi="Apple SD Gothic Neo" w:eastAsia="Apple SD Gothic Neo" w:cs="Apple SD Gothic Neo"/>
+          <w:rFonts w:ascii="맑은 고딕" w:hAnsi="맑은 고딕" w:eastAsia="맑은 고딕" w:cs="맑은 고딕"/>
           <w:b w:val="0"/>
           <w:i/>
           <w:color w:val="808080"/>
@@ -421,7 +421,7 @@
       </w:pPr>
       <w:r>
         <w:rPr>
-          <w:rFonts w:ascii="Apple SD Gothic Neo" w:hAnsi="Apple SD Gothic Neo" w:eastAsia="Apple SD Gothic Neo" w:cs="Apple SD Gothic Neo"/>
+          <w:rFonts w:ascii="맑은 고딕" w:hAnsi="맑은 고딕" w:eastAsia="맑은 고딕" w:cs="맑은 고딕"/>
           <w:b/>
           <w:color w:val="1F4E78"/>
           <w:sz w:val="30"/>
@@ -436,7 +436,7 @@
       </w:pPr>
       <w:r>
         <w:rPr>
-          <w:rFonts w:ascii="Apple SD Gothic Neo" w:hAnsi="Apple SD Gothic Neo" w:eastAsia="Apple SD Gothic Neo" w:cs="Apple SD Gothic Neo"/>
+          <w:rFonts w:ascii="맑은 고딕" w:hAnsi="맑은 고딕" w:eastAsia="맑은 고딕" w:cs="맑은 고딕"/>
           <w:b/>
           <w:color w:val="2E75B6"/>
           <w:sz w:val="25"/>
@@ -450,7 +450,7 @@
       </w:pPr>
       <w:r>
         <w:rPr>
-          <w:rFonts w:ascii="Apple SD Gothic Neo" w:hAnsi="Apple SD Gothic Neo" w:eastAsia="Apple SD Gothic Neo" w:cs="Apple SD Gothic Neo"/>
+          <w:rFonts w:ascii="맑은 고딕" w:hAnsi="맑은 고딕" w:eastAsia="맑은 고딕" w:cs="맑은 고딕"/>
           <w:b w:val="0"/>
           <w:i w:val="0"/>
           <w:sz w:val="22"/>
@@ -465,7 +465,7 @@
       </w:pPr>
       <w:r>
         <w:rPr>
-          <w:rFonts w:ascii="Apple SD Gothic Neo" w:hAnsi="Apple SD Gothic Neo" w:eastAsia="Apple SD Gothic Neo" w:cs="Apple SD Gothic Neo"/>
+          <w:rFonts w:ascii="맑은 고딕" w:hAnsi="맑은 고딕" w:eastAsia="맑은 고딕" w:cs="맑은 고딕"/>
           <w:b/>
           <w:color w:val="2E75B6"/>
           <w:sz w:val="25"/>
@@ -499,7 +499,7 @@
             <w:r/>
             <w:r>
               <w:rPr>
-                <w:rFonts w:ascii="Apple SD Gothic Neo" w:hAnsi="Apple SD Gothic Neo" w:eastAsia="Apple SD Gothic Neo" w:cs="Apple SD Gothic Neo"/>
+                <w:rFonts w:ascii="맑은 고딕" w:hAnsi="맑은 고딕" w:eastAsia="맑은 고딕" w:cs="맑은 고딕"/>
                 <w:b/>
                 <w:color w:val="FFFFFF"/>
                 <w:sz w:val="21"/>
@@ -522,7 +522,7 @@
             <w:r/>
             <w:r>
               <w:rPr>
-                <w:rFonts w:ascii="Apple SD Gothic Neo" w:hAnsi="Apple SD Gothic Neo" w:eastAsia="Apple SD Gothic Neo" w:cs="Apple SD Gothic Neo"/>
+                <w:rFonts w:ascii="맑은 고딕" w:hAnsi="맑은 고딕" w:eastAsia="맑은 고딕" w:cs="맑은 고딕"/>
                 <w:b/>
                 <w:color w:val="FFFFFF"/>
                 <w:sz w:val="21"/>
@@ -546,7 +546,7 @@
             <w:r/>
             <w:r>
               <w:rPr>
-                <w:rFonts w:ascii="Apple SD Gothic Neo" w:hAnsi="Apple SD Gothic Neo" w:eastAsia="Apple SD Gothic Neo" w:cs="Apple SD Gothic Neo"/>
+                <w:rFonts w:ascii="맑은 고딕" w:hAnsi="맑은 고딕" w:eastAsia="맑은 고딕" w:cs="맑은 고딕"/>
                 <w:b w:val="0"/>
                 <w:sz w:val="20"/>
               </w:rPr>
@@ -567,7 +567,7 @@
             <w:r/>
             <w:r>
               <w:rPr>
-                <w:rFonts w:ascii="Apple SD Gothic Neo" w:hAnsi="Apple SD Gothic Neo" w:eastAsia="Apple SD Gothic Neo" w:cs="Apple SD Gothic Neo"/>
+                <w:rFonts w:ascii="맑은 고딕" w:hAnsi="맑은 고딕" w:eastAsia="맑은 고딕" w:cs="맑은 고딕"/>
                 <w:b w:val="0"/>
                 <w:sz w:val="20"/>
               </w:rPr>
@@ -591,7 +591,7 @@
             <w:r/>
             <w:r>
               <w:rPr>
-                <w:rFonts w:ascii="Apple SD Gothic Neo" w:hAnsi="Apple SD Gothic Neo" w:eastAsia="Apple SD Gothic Neo" w:cs="Apple SD Gothic Neo"/>
+                <w:rFonts w:ascii="맑은 고딕" w:hAnsi="맑은 고딕" w:eastAsia="맑은 고딕" w:cs="맑은 고딕"/>
                 <w:b w:val="0"/>
                 <w:sz w:val="20"/>
               </w:rPr>
@@ -613,7 +613,7 @@
             <w:r/>
             <w:r>
               <w:rPr>
-                <w:rFonts w:ascii="Apple SD Gothic Neo" w:hAnsi="Apple SD Gothic Neo" w:eastAsia="Apple SD Gothic Neo" w:cs="Apple SD Gothic Neo"/>
+                <w:rFonts w:ascii="맑은 고딕" w:hAnsi="맑은 고딕" w:eastAsia="맑은 고딕" w:cs="맑은 고딕"/>
                 <w:b w:val="0"/>
                 <w:sz w:val="20"/>
               </w:rPr>
@@ -636,7 +636,7 @@
             <w:r/>
             <w:r>
               <w:rPr>
-                <w:rFonts w:ascii="Apple SD Gothic Neo" w:hAnsi="Apple SD Gothic Neo" w:eastAsia="Apple SD Gothic Neo" w:cs="Apple SD Gothic Neo"/>
+                <w:rFonts w:ascii="맑은 고딕" w:hAnsi="맑은 고딕" w:eastAsia="맑은 고딕" w:cs="맑은 고딕"/>
                 <w:b w:val="0"/>
                 <w:sz w:val="20"/>
               </w:rPr>
@@ -657,7 +657,7 @@
             <w:r/>
             <w:r>
               <w:rPr>
-                <w:rFonts w:ascii="Apple SD Gothic Neo" w:hAnsi="Apple SD Gothic Neo" w:eastAsia="Apple SD Gothic Neo" w:cs="Apple SD Gothic Neo"/>
+                <w:rFonts w:ascii="맑은 고딕" w:hAnsi="맑은 고딕" w:eastAsia="맑은 고딕" w:cs="맑은 고딕"/>
                 <w:b w:val="0"/>
                 <w:sz w:val="20"/>
               </w:rPr>
@@ -681,7 +681,7 @@
             <w:r/>
             <w:r>
               <w:rPr>
-                <w:rFonts w:ascii="Apple SD Gothic Neo" w:hAnsi="Apple SD Gothic Neo" w:eastAsia="Apple SD Gothic Neo" w:cs="Apple SD Gothic Neo"/>
+                <w:rFonts w:ascii="맑은 고딕" w:hAnsi="맑은 고딕" w:eastAsia="맑은 고딕" w:cs="맑은 고딕"/>
                 <w:b w:val="0"/>
                 <w:sz w:val="20"/>
               </w:rPr>
@@ -703,7 +703,7 @@
             <w:r/>
             <w:r>
               <w:rPr>
-                <w:rFonts w:ascii="Apple SD Gothic Neo" w:hAnsi="Apple SD Gothic Neo" w:eastAsia="Apple SD Gothic Neo" w:cs="Apple SD Gothic Neo"/>
+                <w:rFonts w:ascii="맑은 고딕" w:hAnsi="맑은 고딕" w:eastAsia="맑은 고딕" w:cs="맑은 고딕"/>
                 <w:b w:val="0"/>
                 <w:sz w:val="20"/>
               </w:rPr>
@@ -719,7 +719,7 @@
       </w:pPr>
       <w:r>
         <w:rPr>
-          <w:rFonts w:ascii="Apple SD Gothic Neo" w:hAnsi="Apple SD Gothic Neo" w:eastAsia="Apple SD Gothic Neo" w:cs="Apple SD Gothic Neo"/>
+          <w:rFonts w:ascii="맑은 고딕" w:hAnsi="맑은 고딕" w:eastAsia="맑은 고딕" w:cs="맑은 고딕"/>
           <w:b w:val="0"/>
           <w:i w:val="0"/>
           <w:sz w:val="2"/>
@@ -733,7 +733,7 @@
       </w:pPr>
       <w:r>
         <w:rPr>
-          <w:rFonts w:ascii="Apple SD Gothic Neo" w:hAnsi="Apple SD Gothic Neo" w:eastAsia="Apple SD Gothic Neo" w:cs="Apple SD Gothic Neo"/>
+          <w:rFonts w:ascii="맑은 고딕" w:hAnsi="맑은 고딕" w:eastAsia="맑은 고딕" w:cs="맑은 고딕"/>
           <w:b/>
           <w:color w:val="2E75B6"/>
           <w:sz w:val="25"/>
@@ -748,7 +748,7 @@
       </w:pPr>
       <w:r>
         <w:rPr>
-          <w:rFonts w:ascii="Apple SD Gothic Neo" w:hAnsi="Apple SD Gothic Neo" w:eastAsia="Apple SD Gothic Neo" w:cs="Apple SD Gothic Neo"/>
+          <w:rFonts w:ascii="맑은 고딕" w:hAnsi="맑은 고딕" w:eastAsia="맑은 고딕" w:cs="맑은 고딕"/>
           <w:sz w:val="21"/>
         </w:rPr>
         <w:t>국내 서비스 시설(매장, 카페, 공공장소 등)에서 고객이 별도 비밀번호 입력 없이 1회 사용자 확인으로 매장 WiFi에 자동 연결되는 신규 플랫폼 구축.</w:t>
@@ -761,7 +761,7 @@
       </w:pPr>
       <w:r>
         <w:rPr>
-          <w:rFonts w:ascii="Apple SD Gothic Neo" w:hAnsi="Apple SD Gothic Neo" w:eastAsia="Apple SD Gothic Neo" w:cs="Apple SD Gothic Neo"/>
+          <w:rFonts w:ascii="맑은 고딕" w:hAnsi="맑은 고딕" w:eastAsia="맑은 고딕" w:cs="맑은 고딕"/>
           <w:sz w:val="21"/>
         </w:rPr>
         <w:t>기존 WiFi 접속 페인포인트 제거 및 매장-고객 간 디지털 접점 형성을 통해 충성도 프로그램(스탬프, 쿠폰), 다국어 채팅 등 부가가치 서비스의 기반 확보.</w:t>
@@ -774,7 +774,7 @@
       </w:pPr>
       <w:r>
         <w:rPr>
-          <w:rFonts w:ascii="Apple SD Gothic Neo" w:hAnsi="Apple SD Gothic Neo" w:eastAsia="Apple SD Gothic Neo" w:cs="Apple SD Gothic Neo"/>
+          <w:rFonts w:ascii="맑은 고딕" w:hAnsi="맑은 고딕" w:eastAsia="맑은 고딕" w:cs="맑은 고딕"/>
           <w:sz w:val="21"/>
         </w:rPr>
         <w:t>MVP(P1) 단계에서 핵심 기능을 안정적으로 출시하여 시장 검증 및 2차 확장 기반을 마련함.</w:t>
@@ -787,7 +787,7 @@
       </w:pPr>
       <w:r>
         <w:rPr>
-          <w:rFonts w:ascii="Apple SD Gothic Neo" w:hAnsi="Apple SD Gothic Neo" w:eastAsia="Apple SD Gothic Neo" w:cs="Apple SD Gothic Neo"/>
+          <w:rFonts w:ascii="맑은 고딕" w:hAnsi="맑은 고딕" w:eastAsia="맑은 고딕" w:cs="맑은 고딕"/>
           <w:b/>
           <w:color w:val="2E75B6"/>
           <w:sz w:val="25"/>
@@ -802,7 +802,7 @@
       </w:pPr>
       <w:r>
         <w:rPr>
-          <w:rFonts w:ascii="Apple SD Gothic Neo" w:hAnsi="Apple SD Gothic Neo" w:eastAsia="Apple SD Gothic Neo" w:cs="Apple SD Gothic Neo"/>
+          <w:rFonts w:ascii="맑은 고딕" w:hAnsi="맑은 고딕" w:eastAsia="맑은 고딕" w:cs="맑은 고딕"/>
           <w:sz w:val="21"/>
         </w:rPr>
         <w:t>WiFi 접속을 위한 비밀번호 노출 및 입력 절차가 사용자 경험(UX)을 크게 저해함.</w:t>
@@ -815,7 +815,7 @@
       </w:pPr>
       <w:r>
         <w:rPr>
-          <w:rFonts w:ascii="Apple SD Gothic Neo" w:hAnsi="Apple SD Gothic Neo" w:eastAsia="Apple SD Gothic Neo" w:cs="Apple SD Gothic Neo"/>
+          <w:rFonts w:ascii="맑은 고딕" w:hAnsi="맑은 고딕" w:eastAsia="맑은 고딕" w:cs="맑은 고딕"/>
           <w:sz w:val="21"/>
         </w:rPr>
         <w:t>매장 운영자는 고객의 첫 디지털 접점을 확보할 수단이 부재하여 마케팅 채널 다각화의 한계가 존재함.</w:t>
@@ -828,7 +828,7 @@
       </w:pPr>
       <w:r>
         <w:rPr>
-          <w:rFonts w:ascii="Apple SD Gothic Neo" w:hAnsi="Apple SD Gothic Neo" w:eastAsia="Apple SD Gothic Neo" w:cs="Apple SD Gothic Neo"/>
+          <w:rFonts w:ascii="맑은 고딕" w:hAnsi="맑은 고딕" w:eastAsia="맑은 고딕" w:cs="맑은 고딕"/>
           <w:sz w:val="21"/>
         </w:rPr>
         <w:t>BLE 비콘 기반 핸드셰이크 방식으로 보안성과 UX를 동시에 확보할 수 있음을 사전 기술 검증을 통해 확인함.</w:t>
@@ -846,7 +846,7 @@
       </w:pPr>
       <w:r>
         <w:rPr>
-          <w:rFonts w:ascii="Apple SD Gothic Neo" w:hAnsi="Apple SD Gothic Neo" w:eastAsia="Apple SD Gothic Neo" w:cs="Apple SD Gothic Neo"/>
+          <w:rFonts w:ascii="맑은 고딕" w:hAnsi="맑은 고딕" w:eastAsia="맑은 고딕" w:cs="맑은 고딕"/>
           <w:b/>
           <w:color w:val="1F4E78"/>
           <w:sz w:val="30"/>
@@ -861,7 +861,7 @@
       </w:pPr>
       <w:r>
         <w:rPr>
-          <w:rFonts w:ascii="Apple SD Gothic Neo" w:hAnsi="Apple SD Gothic Neo" w:eastAsia="Apple SD Gothic Neo" w:cs="Apple SD Gothic Neo"/>
+          <w:rFonts w:ascii="맑은 고딕" w:hAnsi="맑은 고딕" w:eastAsia="맑은 고딕" w:cs="맑은 고딕"/>
           <w:b/>
           <w:color w:val="2E75B6"/>
           <w:sz w:val="25"/>
@@ -896,7 +896,7 @@
             <w:r/>
             <w:r>
               <w:rPr>
-                <w:rFonts w:ascii="Apple SD Gothic Neo" w:hAnsi="Apple SD Gothic Neo" w:eastAsia="Apple SD Gothic Neo" w:cs="Apple SD Gothic Neo"/>
+                <w:rFonts w:ascii="맑은 고딕" w:hAnsi="맑은 고딕" w:eastAsia="맑은 고딕" w:cs="맑은 고딕"/>
                 <w:b/>
                 <w:color w:val="FFFFFF"/>
                 <w:sz w:val="21"/>
@@ -919,7 +919,7 @@
             <w:r/>
             <w:r>
               <w:rPr>
-                <w:rFonts w:ascii="Apple SD Gothic Neo" w:hAnsi="Apple SD Gothic Neo" w:eastAsia="Apple SD Gothic Neo" w:cs="Apple SD Gothic Neo"/>
+                <w:rFonts w:ascii="맑은 고딕" w:hAnsi="맑은 고딕" w:eastAsia="맑은 고딕" w:cs="맑은 고딕"/>
                 <w:b/>
                 <w:color w:val="FFFFFF"/>
                 <w:sz w:val="21"/>
@@ -942,7 +942,7 @@
             <w:r/>
             <w:r>
               <w:rPr>
-                <w:rFonts w:ascii="Apple SD Gothic Neo" w:hAnsi="Apple SD Gothic Neo" w:eastAsia="Apple SD Gothic Neo" w:cs="Apple SD Gothic Neo"/>
+                <w:rFonts w:ascii="맑은 고딕" w:hAnsi="맑은 고딕" w:eastAsia="맑은 고딕" w:cs="맑은 고딕"/>
                 <w:b/>
                 <w:color w:val="FFFFFF"/>
                 <w:sz w:val="21"/>
@@ -966,7 +966,7 @@
             <w:r/>
             <w:r>
               <w:rPr>
-                <w:rFonts w:ascii="Apple SD Gothic Neo" w:hAnsi="Apple SD Gothic Neo" w:eastAsia="Apple SD Gothic Neo" w:cs="Apple SD Gothic Neo"/>
+                <w:rFonts w:ascii="맑은 고딕" w:hAnsi="맑은 고딕" w:eastAsia="맑은 고딕" w:cs="맑은 고딕"/>
                 <w:b w:val="0"/>
                 <w:sz w:val="20"/>
               </w:rPr>
@@ -987,7 +987,7 @@
             <w:r/>
             <w:r>
               <w:rPr>
-                <w:rFonts w:ascii="Apple SD Gothic Neo" w:hAnsi="Apple SD Gothic Neo" w:eastAsia="Apple SD Gothic Neo" w:cs="Apple SD Gothic Neo"/>
+                <w:rFonts w:ascii="맑은 고딕" w:hAnsi="맑은 고딕" w:eastAsia="맑은 고딕" w:cs="맑은 고딕"/>
                 <w:b w:val="0"/>
                 <w:sz w:val="20"/>
               </w:rPr>
@@ -1008,7 +1008,7 @@
             <w:r/>
             <w:r>
               <w:rPr>
-                <w:rFonts w:ascii="Apple SD Gothic Neo" w:hAnsi="Apple SD Gothic Neo" w:eastAsia="Apple SD Gothic Neo" w:cs="Apple SD Gothic Neo"/>
+                <w:rFonts w:ascii="맑은 고딕" w:hAnsi="맑은 고딕" w:eastAsia="맑은 고딕" w:cs="맑은 고딕"/>
                 <w:b w:val="0"/>
                 <w:sz w:val="20"/>
               </w:rPr>
@@ -1032,7 +1032,7 @@
             <w:r/>
             <w:r>
               <w:rPr>
-                <w:rFonts w:ascii="Apple SD Gothic Neo" w:hAnsi="Apple SD Gothic Neo" w:eastAsia="Apple SD Gothic Neo" w:cs="Apple SD Gothic Neo"/>
+                <w:rFonts w:ascii="맑은 고딕" w:hAnsi="맑은 고딕" w:eastAsia="맑은 고딕" w:cs="맑은 고딕"/>
                 <w:b w:val="0"/>
                 <w:sz w:val="20"/>
               </w:rPr>
@@ -1054,7 +1054,7 @@
             <w:r/>
             <w:r>
               <w:rPr>
-                <w:rFonts w:ascii="Apple SD Gothic Neo" w:hAnsi="Apple SD Gothic Neo" w:eastAsia="Apple SD Gothic Neo" w:cs="Apple SD Gothic Neo"/>
+                <w:rFonts w:ascii="맑은 고딕" w:hAnsi="맑은 고딕" w:eastAsia="맑은 고딕" w:cs="맑은 고딕"/>
                 <w:b w:val="0"/>
                 <w:sz w:val="20"/>
               </w:rPr>
@@ -1076,7 +1076,7 @@
             <w:r/>
             <w:r>
               <w:rPr>
-                <w:rFonts w:ascii="Apple SD Gothic Neo" w:hAnsi="Apple SD Gothic Neo" w:eastAsia="Apple SD Gothic Neo" w:cs="Apple SD Gothic Neo"/>
+                <w:rFonts w:ascii="맑은 고딕" w:hAnsi="맑은 고딕" w:eastAsia="맑은 고딕" w:cs="맑은 고딕"/>
                 <w:b w:val="0"/>
                 <w:sz w:val="20"/>
               </w:rPr>
@@ -1099,7 +1099,7 @@
             <w:r/>
             <w:r>
               <w:rPr>
-                <w:rFonts w:ascii="Apple SD Gothic Neo" w:hAnsi="Apple SD Gothic Neo" w:eastAsia="Apple SD Gothic Neo" w:cs="Apple SD Gothic Neo"/>
+                <w:rFonts w:ascii="맑은 고딕" w:hAnsi="맑은 고딕" w:eastAsia="맑은 고딕" w:cs="맑은 고딕"/>
                 <w:b w:val="0"/>
                 <w:sz w:val="20"/>
               </w:rPr>
@@ -1120,7 +1120,7 @@
             <w:r/>
             <w:r>
               <w:rPr>
-                <w:rFonts w:ascii="Apple SD Gothic Neo" w:hAnsi="Apple SD Gothic Neo" w:eastAsia="Apple SD Gothic Neo" w:cs="Apple SD Gothic Neo"/>
+                <w:rFonts w:ascii="맑은 고딕" w:hAnsi="맑은 고딕" w:eastAsia="맑은 고딕" w:cs="맑은 고딕"/>
                 <w:b w:val="0"/>
                 <w:sz w:val="20"/>
               </w:rPr>
@@ -1141,7 +1141,7 @@
             <w:r/>
             <w:r>
               <w:rPr>
-                <w:rFonts w:ascii="Apple SD Gothic Neo" w:hAnsi="Apple SD Gothic Neo" w:eastAsia="Apple SD Gothic Neo" w:cs="Apple SD Gothic Neo"/>
+                <w:rFonts w:ascii="맑은 고딕" w:hAnsi="맑은 고딕" w:eastAsia="맑은 고딕" w:cs="맑은 고딕"/>
                 <w:b w:val="0"/>
                 <w:sz w:val="20"/>
               </w:rPr>
@@ -1165,7 +1165,7 @@
             <w:r/>
             <w:r>
               <w:rPr>
-                <w:rFonts w:ascii="Apple SD Gothic Neo" w:hAnsi="Apple SD Gothic Neo" w:eastAsia="Apple SD Gothic Neo" w:cs="Apple SD Gothic Neo"/>
+                <w:rFonts w:ascii="맑은 고딕" w:hAnsi="맑은 고딕" w:eastAsia="맑은 고딕" w:cs="맑은 고딕"/>
                 <w:b w:val="0"/>
                 <w:sz w:val="20"/>
               </w:rPr>
@@ -1187,7 +1187,7 @@
             <w:r/>
             <w:r>
               <w:rPr>
-                <w:rFonts w:ascii="Apple SD Gothic Neo" w:hAnsi="Apple SD Gothic Neo" w:eastAsia="Apple SD Gothic Neo" w:cs="Apple SD Gothic Neo"/>
+                <w:rFonts w:ascii="맑은 고딕" w:hAnsi="맑은 고딕" w:eastAsia="맑은 고딕" w:cs="맑은 고딕"/>
                 <w:b w:val="0"/>
                 <w:sz w:val="20"/>
               </w:rPr>
@@ -1209,7 +1209,7 @@
             <w:r/>
             <w:r>
               <w:rPr>
-                <w:rFonts w:ascii="Apple SD Gothic Neo" w:hAnsi="Apple SD Gothic Neo" w:eastAsia="Apple SD Gothic Neo" w:cs="Apple SD Gothic Neo"/>
+                <w:rFonts w:ascii="맑은 고딕" w:hAnsi="맑은 고딕" w:eastAsia="맑은 고딕" w:cs="맑은 고딕"/>
                 <w:b w:val="0"/>
                 <w:sz w:val="20"/>
               </w:rPr>
@@ -1225,7 +1225,7 @@
       </w:pPr>
       <w:r>
         <w:rPr>
-          <w:rFonts w:ascii="Apple SD Gothic Neo" w:hAnsi="Apple SD Gothic Neo" w:eastAsia="Apple SD Gothic Neo" w:cs="Apple SD Gothic Neo"/>
+          <w:rFonts w:ascii="맑은 고딕" w:hAnsi="맑은 고딕" w:eastAsia="맑은 고딕" w:cs="맑은 고딕"/>
           <w:b w:val="0"/>
           <w:i w:val="0"/>
           <w:sz w:val="2"/>
@@ -1238,7 +1238,7 @@
       </w:pPr>
       <w:r>
         <w:rPr>
-          <w:rFonts w:ascii="Apple SD Gothic Neo" w:hAnsi="Apple SD Gothic Neo" w:eastAsia="Apple SD Gothic Neo" w:cs="Apple SD Gothic Neo"/>
+          <w:rFonts w:ascii="맑은 고딕" w:hAnsi="맑은 고딕" w:eastAsia="맑은 고딕" w:cs="맑은 고딕"/>
           <w:b w:val="0"/>
           <w:i w:val="0"/>
           <w:color w:val="595959"/>
@@ -1254,7 +1254,7 @@
       </w:pPr>
       <w:r>
         <w:rPr>
-          <w:rFonts w:ascii="Apple SD Gothic Neo" w:hAnsi="Apple SD Gothic Neo" w:eastAsia="Apple SD Gothic Neo" w:cs="Apple SD Gothic Neo"/>
+          <w:rFonts w:ascii="맑은 고딕" w:hAnsi="맑은 고딕" w:eastAsia="맑은 고딕" w:cs="맑은 고딕"/>
           <w:b/>
           <w:color w:val="2E75B6"/>
           <w:sz w:val="25"/>
@@ -1269,7 +1269,7 @@
       </w:pPr>
       <w:r>
         <w:rPr>
-          <w:rFonts w:ascii="Apple SD Gothic Neo" w:hAnsi="Apple SD Gothic Neo" w:eastAsia="Apple SD Gothic Neo" w:cs="Apple SD Gothic Neo"/>
+          <w:rFonts w:ascii="맑은 고딕" w:hAnsi="맑은 고딕" w:eastAsia="맑은 고딕" w:cs="맑은 고딕"/>
           <w:sz w:val="21"/>
         </w:rPr>
         <w:t>본 과업은 기능정의서에서 "P1"로 분류된 기능에 한정함.</w:t>
@@ -1282,7 +1282,7 @@
       </w:pPr>
       <w:r>
         <w:rPr>
-          <w:rFonts w:ascii="Apple SD Gothic Neo" w:hAnsi="Apple SD Gothic Neo" w:eastAsia="Apple SD Gothic Neo" w:cs="Apple SD Gothic Neo"/>
+          <w:rFonts w:ascii="맑은 고딕" w:hAnsi="맑은 고딕" w:eastAsia="맑은 고딕" w:cs="맑은 고딕"/>
           <w:sz w:val="21"/>
         </w:rPr>
         <w:t>P2(2차) 및 P3(향후) 기능은 본 과업에서 명시적으로 제외하며, 별도 계약을 통해 추가 발주함.</w:t>
@@ -1295,7 +1295,7 @@
       </w:pPr>
       <w:r>
         <w:rPr>
-          <w:rFonts w:ascii="Apple SD Gothic Neo" w:hAnsi="Apple SD Gothic Neo" w:eastAsia="Apple SD Gothic Neo" w:cs="Apple SD Gothic Neo"/>
+          <w:rFonts w:ascii="맑은 고딕" w:hAnsi="맑은 고딕" w:eastAsia="맑은 고딕" w:cs="맑은 고딕"/>
           <w:sz w:val="21"/>
         </w:rPr>
         <w:t>MVP 핵심 가치 검증을 위한 최소 기능 셋이며, 향후 확장을 고려한 아키텍처 설계는 본 과업의 의무 사항임.</w:t>
@@ -1308,7 +1308,7 @@
       </w:pPr>
       <w:r>
         <w:rPr>
-          <w:rFonts w:ascii="Apple SD Gothic Neo" w:hAnsi="Apple SD Gothic Neo" w:eastAsia="Apple SD Gothic Neo" w:cs="Apple SD Gothic Neo"/>
+          <w:rFonts w:ascii="맑은 고딕" w:hAnsi="맑은 고딕" w:eastAsia="맑은 고딕" w:cs="맑은 고딕"/>
           <w:b/>
           <w:color w:val="2E75B6"/>
           <w:sz w:val="25"/>
@@ -1323,7 +1323,7 @@
       </w:pPr>
       <w:r>
         <w:rPr>
-          <w:rFonts w:ascii="Apple SD Gothic Neo" w:hAnsi="Apple SD Gothic Neo" w:eastAsia="Apple SD Gothic Neo" w:cs="Apple SD Gothic Neo"/>
+          <w:rFonts w:ascii="맑은 고딕" w:hAnsi="맑은 고딕" w:eastAsia="맑은 고딕" w:cs="맑은 고딕"/>
           <w:sz w:val="21"/>
         </w:rPr>
         <w:t>다국어 실시간 채팅 (P2 이관)</w:t>
@@ -1336,7 +1336,7 @@
       </w:pPr>
       <w:r>
         <w:rPr>
-          <w:rFonts w:ascii="Apple SD Gothic Neo" w:hAnsi="Apple SD Gothic Neo" w:eastAsia="Apple SD Gothic Neo" w:cs="Apple SD Gothic Neo"/>
+          <w:rFonts w:ascii="맑은 고딕" w:hAnsi="맑은 고딕" w:eastAsia="맑은 고딕" w:cs="맑은 고딕"/>
           <w:sz w:val="21"/>
         </w:rPr>
         <w:t>고급 분석 대시보드 및 AI 추천 (P3 이관)</w:t>
@@ -1349,7 +1349,7 @@
       </w:pPr>
       <w:r>
         <w:rPr>
-          <w:rFonts w:ascii="Apple SD Gothic Neo" w:hAnsi="Apple SD Gothic Neo" w:eastAsia="Apple SD Gothic Neo" w:cs="Apple SD Gothic Neo"/>
+          <w:rFonts w:ascii="맑은 고딕" w:hAnsi="맑은 고딕" w:eastAsia="맑은 고딕" w:cs="맑은 고딕"/>
           <w:sz w:val="21"/>
         </w:rPr>
         <w:t>타사 POS/CRM/ERP 연동 (별도 발주)</w:t>
@@ -1362,7 +1362,7 @@
       </w:pPr>
       <w:r>
         <w:rPr>
-          <w:rFonts w:ascii="Apple SD Gothic Neo" w:hAnsi="Apple SD Gothic Neo" w:eastAsia="Apple SD Gothic Neo" w:cs="Apple SD Gothic Neo"/>
+          <w:rFonts w:ascii="맑은 고딕" w:hAnsi="맑은 고딕" w:eastAsia="맑은 고딕" w:cs="맑은 고딕"/>
           <w:sz w:val="21"/>
         </w:rPr>
         <w:t>앱스토어/플레이스토어 심사 계정 및 비콘 양산 비용 (발주처 부담)</w:t>
@@ -1375,7 +1375,7 @@
       </w:pPr>
       <w:r>
         <w:rPr>
-          <w:rFonts w:ascii="Apple SD Gothic Neo" w:hAnsi="Apple SD Gothic Neo" w:eastAsia="Apple SD Gothic Neo" w:cs="Apple SD Gothic Neo"/>
+          <w:rFonts w:ascii="맑은 고딕" w:hAnsi="맑은 고딕" w:eastAsia="맑은 고딕" w:cs="맑은 고딕"/>
           <w:sz w:val="21"/>
         </w:rPr>
         <w:t>운영 단계의 서버 인프라 비용 및 운영 인력 (발주처 부담)</w:t>
@@ -1388,7 +1388,7 @@
       </w:pPr>
       <w:r>
         <w:rPr>
-          <w:rFonts w:ascii="Apple SD Gothic Neo" w:hAnsi="Apple SD Gothic Neo" w:eastAsia="Apple SD Gothic Neo" w:cs="Apple SD Gothic Neo"/>
+          <w:rFonts w:ascii="맑은 고딕" w:hAnsi="맑은 고딕" w:eastAsia="맑은 고딕" w:cs="맑은 고딕"/>
           <w:sz w:val="21"/>
         </w:rPr>
         <w:t>개시 후 유지보수 (본 과업의 하자보수 기간 이후는 별도 계약)</w:t>
@@ -1422,7 +1422,7 @@
       </w:pPr>
       <w:r>
         <w:rPr>
-          <w:rFonts w:ascii="Apple SD Gothic Neo" w:hAnsi="Apple SD Gothic Neo" w:eastAsia="Apple SD Gothic Neo" w:cs="Apple SD Gothic Neo"/>
+          <w:rFonts w:ascii="맑은 고딕" w:hAnsi="맑은 고딕" w:eastAsia="맑은 고딕" w:cs="맑은 고딕"/>
           <w:b/>
           <w:color w:val="1F4E78"/>
           <w:sz w:val="30"/>
@@ -1437,7 +1437,7 @@
       </w:pPr>
       <w:r>
         <w:rPr>
-          <w:rFonts w:ascii="Apple SD Gothic Neo" w:hAnsi="Apple SD Gothic Neo" w:eastAsia="Apple SD Gothic Neo" w:cs="Apple SD Gothic Neo"/>
+          <w:rFonts w:ascii="맑은 고딕" w:hAnsi="맑은 고딕" w:eastAsia="맑은 고딕" w:cs="맑은 고딕"/>
           <w:b/>
           <w:color w:val="2E75B6"/>
           <w:sz w:val="25"/>
@@ -1451,7 +1451,7 @@
       </w:pPr>
       <w:r>
         <w:rPr>
-          <w:rFonts w:ascii="Apple SD Gothic Neo" w:hAnsi="Apple SD Gothic Neo" w:eastAsia="Apple SD Gothic Neo" w:cs="Apple SD Gothic Neo"/>
+          <w:rFonts w:ascii="맑은 고딕" w:hAnsi="맑은 고딕" w:eastAsia="맑은 고딕" w:cs="맑은 고딕"/>
           <w:b w:val="0"/>
           <w:i w:val="0"/>
           <w:sz w:val="22"/>
@@ -1487,7 +1487,7 @@
             <w:r/>
             <w:r>
               <w:rPr>
-                <w:rFonts w:ascii="Apple SD Gothic Neo" w:hAnsi="Apple SD Gothic Neo" w:eastAsia="Apple SD Gothic Neo" w:cs="Apple SD Gothic Neo"/>
+                <w:rFonts w:ascii="맑은 고딕" w:hAnsi="맑은 고딕" w:eastAsia="맑은 고딕" w:cs="맑은 고딕"/>
                 <w:b/>
                 <w:color w:val="FFFFFF"/>
                 <w:sz w:val="21"/>
@@ -1510,7 +1510,7 @@
             <w:r/>
             <w:r>
               <w:rPr>
-                <w:rFonts w:ascii="Apple SD Gothic Neo" w:hAnsi="Apple SD Gothic Neo" w:eastAsia="Apple SD Gothic Neo" w:cs="Apple SD Gothic Neo"/>
+                <w:rFonts w:ascii="맑은 고딕" w:hAnsi="맑은 고딕" w:eastAsia="맑은 고딕" w:cs="맑은 고딕"/>
                 <w:b/>
                 <w:color w:val="FFFFFF"/>
                 <w:sz w:val="21"/>
@@ -1533,7 +1533,7 @@
             <w:r/>
             <w:r>
               <w:rPr>
-                <w:rFonts w:ascii="Apple SD Gothic Neo" w:hAnsi="Apple SD Gothic Neo" w:eastAsia="Apple SD Gothic Neo" w:cs="Apple SD Gothic Neo"/>
+                <w:rFonts w:ascii="맑은 고딕" w:hAnsi="맑은 고딕" w:eastAsia="맑은 고딕" w:cs="맑은 고딕"/>
                 <w:b/>
                 <w:color w:val="FFFFFF"/>
                 <w:sz w:val="21"/>
@@ -1556,7 +1556,7 @@
             <w:r/>
             <w:r>
               <w:rPr>
-                <w:rFonts w:ascii="Apple SD Gothic Neo" w:hAnsi="Apple SD Gothic Neo" w:eastAsia="Apple SD Gothic Neo" w:cs="Apple SD Gothic Neo"/>
+                <w:rFonts w:ascii="맑은 고딕" w:hAnsi="맑은 고딕" w:eastAsia="맑은 고딕" w:cs="맑은 고딕"/>
                 <w:b/>
                 <w:color w:val="FFFFFF"/>
                 <w:sz w:val="21"/>
@@ -1580,7 +1580,7 @@
             <w:r/>
             <w:r>
               <w:rPr>
-                <w:rFonts w:ascii="Apple SD Gothic Neo" w:hAnsi="Apple SD Gothic Neo" w:eastAsia="Apple SD Gothic Neo" w:cs="Apple SD Gothic Neo"/>
+                <w:rFonts w:ascii="맑은 고딕" w:hAnsi="맑은 고딕" w:eastAsia="맑은 고딕" w:cs="맑은 고딕"/>
                 <w:b w:val="0"/>
                 <w:sz w:val="20"/>
               </w:rPr>
@@ -1601,7 +1601,7 @@
             <w:r/>
             <w:r>
               <w:rPr>
-                <w:rFonts w:ascii="Apple SD Gothic Neo" w:hAnsi="Apple SD Gothic Neo" w:eastAsia="Apple SD Gothic Neo" w:cs="Apple SD Gothic Neo"/>
+                <w:rFonts w:ascii="맑은 고딕" w:hAnsi="맑은 고딕" w:eastAsia="맑은 고딕" w:cs="맑은 고딕"/>
                 <w:b w:val="0"/>
                 <w:sz w:val="20"/>
               </w:rPr>
@@ -1622,7 +1622,7 @@
             <w:r/>
             <w:r>
               <w:rPr>
-                <w:rFonts w:ascii="Apple SD Gothic Neo" w:hAnsi="Apple SD Gothic Neo" w:eastAsia="Apple SD Gothic Neo" w:cs="Apple SD Gothic Neo"/>
+                <w:rFonts w:ascii="맑은 고딕" w:hAnsi="맑은 고딕" w:eastAsia="맑은 고딕" w:cs="맑은 고딕"/>
                 <w:b w:val="0"/>
                 <w:sz w:val="20"/>
               </w:rPr>
@@ -1643,7 +1643,7 @@
             <w:r/>
             <w:r>
               <w:rPr>
-                <w:rFonts w:ascii="Apple SD Gothic Neo" w:hAnsi="Apple SD Gothic Neo" w:eastAsia="Apple SD Gothic Neo" w:cs="Apple SD Gothic Neo"/>
+                <w:rFonts w:ascii="맑은 고딕" w:hAnsi="맑은 고딕" w:eastAsia="맑은 고딕" w:cs="맑은 고딕"/>
                 <w:b w:val="0"/>
                 <w:sz w:val="20"/>
               </w:rPr>
@@ -1667,7 +1667,7 @@
             <w:r/>
             <w:r>
               <w:rPr>
-                <w:rFonts w:ascii="Apple SD Gothic Neo" w:hAnsi="Apple SD Gothic Neo" w:eastAsia="Apple SD Gothic Neo" w:cs="Apple SD Gothic Neo"/>
+                <w:rFonts w:ascii="맑은 고딕" w:hAnsi="맑은 고딕" w:eastAsia="맑은 고딕" w:cs="맑은 고딕"/>
                 <w:b w:val="0"/>
                 <w:sz w:val="20"/>
               </w:rPr>
@@ -1689,7 +1689,7 @@
             <w:r/>
             <w:r>
               <w:rPr>
-                <w:rFonts w:ascii="Apple SD Gothic Neo" w:hAnsi="Apple SD Gothic Neo" w:eastAsia="Apple SD Gothic Neo" w:cs="Apple SD Gothic Neo"/>
+                <w:rFonts w:ascii="맑은 고딕" w:hAnsi="맑은 고딕" w:eastAsia="맑은 고딕" w:cs="맑은 고딕"/>
                 <w:b w:val="0"/>
                 <w:sz w:val="20"/>
               </w:rPr>
@@ -1711,7 +1711,7 @@
             <w:r/>
             <w:r>
               <w:rPr>
-                <w:rFonts w:ascii="Apple SD Gothic Neo" w:hAnsi="Apple SD Gothic Neo" w:eastAsia="Apple SD Gothic Neo" w:cs="Apple SD Gothic Neo"/>
+                <w:rFonts w:ascii="맑은 고딕" w:hAnsi="맑은 고딕" w:eastAsia="맑은 고딕" w:cs="맑은 고딕"/>
                 <w:b w:val="0"/>
                 <w:sz w:val="20"/>
               </w:rPr>
@@ -1733,7 +1733,7 @@
             <w:r/>
             <w:r>
               <w:rPr>
-                <w:rFonts w:ascii="Apple SD Gothic Neo" w:hAnsi="Apple SD Gothic Neo" w:eastAsia="Apple SD Gothic Neo" w:cs="Apple SD Gothic Neo"/>
+                <w:rFonts w:ascii="맑은 고딕" w:hAnsi="맑은 고딕" w:eastAsia="맑은 고딕" w:cs="맑은 고딕"/>
                 <w:b w:val="0"/>
                 <w:sz w:val="20"/>
               </w:rPr>
@@ -1756,7 +1756,7 @@
             <w:r/>
             <w:r>
               <w:rPr>
-                <w:rFonts w:ascii="Apple SD Gothic Neo" w:hAnsi="Apple SD Gothic Neo" w:eastAsia="Apple SD Gothic Neo" w:cs="Apple SD Gothic Neo"/>
+                <w:rFonts w:ascii="맑은 고딕" w:hAnsi="맑은 고딕" w:eastAsia="맑은 고딕" w:cs="맑은 고딕"/>
                 <w:b w:val="0"/>
                 <w:sz w:val="20"/>
               </w:rPr>
@@ -1777,7 +1777,7 @@
             <w:r/>
             <w:r>
               <w:rPr>
-                <w:rFonts w:ascii="Apple SD Gothic Neo" w:hAnsi="Apple SD Gothic Neo" w:eastAsia="Apple SD Gothic Neo" w:cs="Apple SD Gothic Neo"/>
+                <w:rFonts w:ascii="맑은 고딕" w:hAnsi="맑은 고딕" w:eastAsia="맑은 고딕" w:cs="맑은 고딕"/>
                 <w:b w:val="0"/>
                 <w:sz w:val="20"/>
               </w:rPr>
@@ -1798,7 +1798,7 @@
             <w:r/>
             <w:r>
               <w:rPr>
-                <w:rFonts w:ascii="Apple SD Gothic Neo" w:hAnsi="Apple SD Gothic Neo" w:eastAsia="Apple SD Gothic Neo" w:cs="Apple SD Gothic Neo"/>
+                <w:rFonts w:ascii="맑은 고딕" w:hAnsi="맑은 고딕" w:eastAsia="맑은 고딕" w:cs="맑은 고딕"/>
                 <w:b w:val="0"/>
                 <w:sz w:val="20"/>
               </w:rPr>
@@ -1819,7 +1819,7 @@
             <w:r/>
             <w:r>
               <w:rPr>
-                <w:rFonts w:ascii="Apple SD Gothic Neo" w:hAnsi="Apple SD Gothic Neo" w:eastAsia="Apple SD Gothic Neo" w:cs="Apple SD Gothic Neo"/>
+                <w:rFonts w:ascii="맑은 고딕" w:hAnsi="맑은 고딕" w:eastAsia="맑은 고딕" w:cs="맑은 고딕"/>
                 <w:b w:val="0"/>
                 <w:sz w:val="20"/>
               </w:rPr>
@@ -1843,7 +1843,7 @@
             <w:r/>
             <w:r>
               <w:rPr>
-                <w:rFonts w:ascii="Apple SD Gothic Neo" w:hAnsi="Apple SD Gothic Neo" w:eastAsia="Apple SD Gothic Neo" w:cs="Apple SD Gothic Neo"/>
+                <w:rFonts w:ascii="맑은 고딕" w:hAnsi="맑은 고딕" w:eastAsia="맑은 고딕" w:cs="맑은 고딕"/>
                 <w:b w:val="0"/>
                 <w:sz w:val="20"/>
               </w:rPr>
@@ -1865,7 +1865,7 @@
             <w:r/>
             <w:r>
               <w:rPr>
-                <w:rFonts w:ascii="Apple SD Gothic Neo" w:hAnsi="Apple SD Gothic Neo" w:eastAsia="Apple SD Gothic Neo" w:cs="Apple SD Gothic Neo"/>
+                <w:rFonts w:ascii="맑은 고딕" w:hAnsi="맑은 고딕" w:eastAsia="맑은 고딕" w:cs="맑은 고딕"/>
                 <w:b w:val="0"/>
                 <w:sz w:val="20"/>
               </w:rPr>
@@ -1887,7 +1887,7 @@
             <w:r/>
             <w:r>
               <w:rPr>
-                <w:rFonts w:ascii="Apple SD Gothic Neo" w:hAnsi="Apple SD Gothic Neo" w:eastAsia="Apple SD Gothic Neo" w:cs="Apple SD Gothic Neo"/>
+                <w:rFonts w:ascii="맑은 고딕" w:hAnsi="맑은 고딕" w:eastAsia="맑은 고딕" w:cs="맑은 고딕"/>
                 <w:b w:val="0"/>
                 <w:sz w:val="20"/>
               </w:rPr>
@@ -1909,7 +1909,7 @@
             <w:r/>
             <w:r>
               <w:rPr>
-                <w:rFonts w:ascii="Apple SD Gothic Neo" w:hAnsi="Apple SD Gothic Neo" w:eastAsia="Apple SD Gothic Neo" w:cs="Apple SD Gothic Neo"/>
+                <w:rFonts w:ascii="맑은 고딕" w:hAnsi="맑은 고딕" w:eastAsia="맑은 고딕" w:cs="맑은 고딕"/>
                 <w:b w:val="0"/>
                 <w:sz w:val="20"/>
               </w:rPr>
@@ -1932,7 +1932,7 @@
             <w:r/>
             <w:r>
               <w:rPr>
-                <w:rFonts w:ascii="Apple SD Gothic Neo" w:hAnsi="Apple SD Gothic Neo" w:eastAsia="Apple SD Gothic Neo" w:cs="Apple SD Gothic Neo"/>
+                <w:rFonts w:ascii="맑은 고딕" w:hAnsi="맑은 고딕" w:eastAsia="맑은 고딕" w:cs="맑은 고딕"/>
                 <w:b w:val="0"/>
                 <w:sz w:val="20"/>
               </w:rPr>
@@ -1953,7 +1953,7 @@
             <w:r/>
             <w:r>
               <w:rPr>
-                <w:rFonts w:ascii="Apple SD Gothic Neo" w:hAnsi="Apple SD Gothic Neo" w:eastAsia="Apple SD Gothic Neo" w:cs="Apple SD Gothic Neo"/>
+                <w:rFonts w:ascii="맑은 고딕" w:hAnsi="맑은 고딕" w:eastAsia="맑은 고딕" w:cs="맑은 고딕"/>
                 <w:b w:val="0"/>
                 <w:sz w:val="20"/>
               </w:rPr>
@@ -1974,7 +1974,7 @@
             <w:r/>
             <w:r>
               <w:rPr>
-                <w:rFonts w:ascii="Apple SD Gothic Neo" w:hAnsi="Apple SD Gothic Neo" w:eastAsia="Apple SD Gothic Neo" w:cs="Apple SD Gothic Neo"/>
+                <w:rFonts w:ascii="맑은 고딕" w:hAnsi="맑은 고딕" w:eastAsia="맑은 고딕" w:cs="맑은 고딕"/>
                 <w:b w:val="0"/>
                 <w:sz w:val="20"/>
               </w:rPr>
@@ -1995,7 +1995,7 @@
             <w:r/>
             <w:r>
               <w:rPr>
-                <w:rFonts w:ascii="Apple SD Gothic Neo" w:hAnsi="Apple SD Gothic Neo" w:eastAsia="Apple SD Gothic Neo" w:cs="Apple SD Gothic Neo"/>
+                <w:rFonts w:ascii="맑은 고딕" w:hAnsi="맑은 고딕" w:eastAsia="맑은 고딕" w:cs="맑은 고딕"/>
                 <w:b w:val="0"/>
                 <w:sz w:val="20"/>
               </w:rPr>
@@ -2019,7 +2019,7 @@
             <w:r/>
             <w:r>
               <w:rPr>
-                <w:rFonts w:ascii="Apple SD Gothic Neo" w:hAnsi="Apple SD Gothic Neo" w:eastAsia="Apple SD Gothic Neo" w:cs="Apple SD Gothic Neo"/>
+                <w:rFonts w:ascii="맑은 고딕" w:hAnsi="맑은 고딕" w:eastAsia="맑은 고딕" w:cs="맑은 고딕"/>
                 <w:b w:val="0"/>
                 <w:sz w:val="20"/>
               </w:rPr>
@@ -2041,7 +2041,7 @@
             <w:r/>
             <w:r>
               <w:rPr>
-                <w:rFonts w:ascii="Apple SD Gothic Neo" w:hAnsi="Apple SD Gothic Neo" w:eastAsia="Apple SD Gothic Neo" w:cs="Apple SD Gothic Neo"/>
+                <w:rFonts w:ascii="맑은 고딕" w:hAnsi="맑은 고딕" w:eastAsia="맑은 고딕" w:cs="맑은 고딕"/>
                 <w:b w:val="0"/>
                 <w:sz w:val="20"/>
               </w:rPr>
@@ -2063,7 +2063,7 @@
             <w:r/>
             <w:r>
               <w:rPr>
-                <w:rFonts w:ascii="Apple SD Gothic Neo" w:hAnsi="Apple SD Gothic Neo" w:eastAsia="Apple SD Gothic Neo" w:cs="Apple SD Gothic Neo"/>
+                <w:rFonts w:ascii="맑은 고딕" w:hAnsi="맑은 고딕" w:eastAsia="맑은 고딕" w:cs="맑은 고딕"/>
                 <w:b w:val="0"/>
                 <w:sz w:val="20"/>
               </w:rPr>
@@ -2085,7 +2085,7 @@
             <w:r/>
             <w:r>
               <w:rPr>
-                <w:rFonts w:ascii="Apple SD Gothic Neo" w:hAnsi="Apple SD Gothic Neo" w:eastAsia="Apple SD Gothic Neo" w:cs="Apple SD Gothic Neo"/>
+                <w:rFonts w:ascii="맑은 고딕" w:hAnsi="맑은 고딕" w:eastAsia="맑은 고딕" w:cs="맑은 고딕"/>
                 <w:b w:val="0"/>
                 <w:sz w:val="20"/>
               </w:rPr>
@@ -2101,7 +2101,7 @@
       </w:pPr>
       <w:r>
         <w:rPr>
-          <w:rFonts w:ascii="Apple SD Gothic Neo" w:hAnsi="Apple SD Gothic Neo" w:eastAsia="Apple SD Gothic Neo" w:cs="Apple SD Gothic Neo"/>
+          <w:rFonts w:ascii="맑은 고딕" w:hAnsi="맑은 고딕" w:eastAsia="맑은 고딕" w:cs="맑은 고딕"/>
           <w:b w:val="0"/>
           <w:i w:val="0"/>
           <w:sz w:val="2"/>
@@ -2114,7 +2114,7 @@
       </w:pPr>
       <w:r>
         <w:rPr>
-          <w:rFonts w:ascii="Apple SD Gothic Neo" w:hAnsi="Apple SD Gothic Neo" w:eastAsia="Apple SD Gothic Neo" w:cs="Apple SD Gothic Neo"/>
+          <w:rFonts w:ascii="맑은 고딕" w:hAnsi="맑은 고딕" w:eastAsia="맑은 고딕" w:cs="맑은 고딕"/>
           <w:b w:val="0"/>
           <w:i w:val="0"/>
           <w:color w:val="595959"/>
@@ -2130,7 +2130,7 @@
       </w:pPr>
       <w:r>
         <w:rPr>
-          <w:rFonts w:ascii="Apple SD Gothic Neo" w:hAnsi="Apple SD Gothic Neo" w:eastAsia="Apple SD Gothic Neo" w:cs="Apple SD Gothic Neo"/>
+          <w:rFonts w:ascii="맑은 고딕" w:hAnsi="맑은 고딕" w:eastAsia="맑은 고딕" w:cs="맑은 고딕"/>
           <w:b/>
           <w:color w:val="2E75B6"/>
           <w:sz w:val="25"/>
@@ -2145,7 +2145,7 @@
       </w:pPr>
       <w:r>
         <w:rPr>
-          <w:rFonts w:ascii="Apple SD Gothic Neo" w:hAnsi="Apple SD Gothic Neo" w:eastAsia="Apple SD Gothic Neo" w:cs="Apple SD Gothic Neo"/>
+          <w:rFonts w:ascii="맑은 고딕" w:hAnsi="맑은 고딕" w:eastAsia="맑은 고딕" w:cs="맑은 고딕"/>
           <w:sz w:val="21"/>
         </w:rPr>
         <w:t>정기 회의: 별도 운영 안 함 (필요 시 비정기 소집)</w:t>
@@ -2158,7 +2158,7 @@
       </w:pPr>
       <w:r>
         <w:rPr>
-          <w:rFonts w:ascii="Apple SD Gothic Neo" w:hAnsi="Apple SD Gothic Neo" w:eastAsia="Apple SD Gothic Neo" w:cs="Apple SD Gothic Neo"/>
+          <w:rFonts w:ascii="맑은 고딕" w:hAnsi="맑은 고딕" w:eastAsia="맑은 고딕" w:cs="맑은 고딕"/>
           <w:sz w:val="21"/>
         </w:rPr>
         <w:t>비정기 회의: 주요 의사결정/이슈 발생 시 발주측 PM 요청에 따라 24시간 내 회의 가능 상태 유지</w:t>
@@ -2171,7 +2171,7 @@
       </w:pPr>
       <w:r>
         <w:rPr>
-          <w:rFonts w:ascii="Apple SD Gothic Neo" w:hAnsi="Apple SD Gothic Neo" w:eastAsia="Apple SD Gothic Neo" w:cs="Apple SD Gothic Neo"/>
+          <w:rFonts w:ascii="맑은 고딕" w:hAnsi="맑은 고딕" w:eastAsia="맑은 고딕" w:cs="맑은 고딕"/>
           <w:sz w:val="21"/>
         </w:rPr>
         <w:t>이슈 관리: 발주처에서 직접 관리 (협업 도구 선택은 발주처 재량)</w:t>
@@ -2184,7 +2184,7 @@
       </w:pPr>
       <w:r>
         <w:rPr>
-          <w:rFonts w:ascii="Apple SD Gothic Neo" w:hAnsi="Apple SD Gothic Neo" w:eastAsia="Apple SD Gothic Neo" w:cs="Apple SD Gothic Neo"/>
+          <w:rFonts w:ascii="맑은 고딕" w:hAnsi="맑은 고딕" w:eastAsia="맑은 고딕" w:cs="맑은 고딕"/>
           <w:sz w:val="21"/>
         </w:rPr>
         <w:t>진척률 보고: 발주처 필요 시점에 확인 (정기 보고서 제출 의무 없음)</w:t>
@@ -2202,7 +2202,7 @@
       </w:pPr>
       <w:r>
         <w:rPr>
-          <w:rFonts w:ascii="Apple SD Gothic Neo" w:hAnsi="Apple SD Gothic Neo" w:eastAsia="Apple SD Gothic Neo" w:cs="Apple SD Gothic Neo"/>
+          <w:rFonts w:ascii="맑은 고딕" w:hAnsi="맑은 고딕" w:eastAsia="맑은 고딕" w:cs="맑은 고딕"/>
           <w:b/>
           <w:color w:val="1F4E78"/>
           <w:sz w:val="30"/>
@@ -2216,7 +2216,7 @@
       </w:pPr>
       <w:r>
         <w:rPr>
-          <w:rFonts w:ascii="Apple SD Gothic Neo" w:hAnsi="Apple SD Gothic Neo" w:eastAsia="Apple SD Gothic Neo" w:cs="Apple SD Gothic Neo"/>
+          <w:rFonts w:ascii="맑은 고딕" w:hAnsi="맑은 고딕" w:eastAsia="맑은 고딕" w:cs="맑은 고딕"/>
           <w:b w:val="0"/>
           <w:i w:val="0"/>
           <w:sz w:val="22"/>
@@ -2231,7 +2231,7 @@
       </w:pPr>
       <w:r>
         <w:rPr>
-          <w:rFonts w:ascii="Apple SD Gothic Neo" w:hAnsi="Apple SD Gothic Neo" w:eastAsia="Apple SD Gothic Neo" w:cs="Apple SD Gothic Neo"/>
+          <w:rFonts w:ascii="맑은 고딕" w:hAnsi="맑은 고딕" w:eastAsia="맑은 고딕" w:cs="맑은 고딕"/>
           <w:b/>
           <w:color w:val="2E75B6"/>
           <w:sz w:val="25"/>
@@ -2265,7 +2265,7 @@
             <w:r/>
             <w:r>
               <w:rPr>
-                <w:rFonts w:ascii="Apple SD Gothic Neo" w:hAnsi="Apple SD Gothic Neo" w:eastAsia="Apple SD Gothic Neo" w:cs="Apple SD Gothic Neo"/>
+                <w:rFonts w:ascii="맑은 고딕" w:hAnsi="맑은 고딕" w:eastAsia="맑은 고딕" w:cs="맑은 고딕"/>
                 <w:b/>
                 <w:color w:val="FFFFFF"/>
                 <w:sz w:val="21"/>
@@ -2288,7 +2288,7 @@
             <w:r/>
             <w:r>
               <w:rPr>
-                <w:rFonts w:ascii="Apple SD Gothic Neo" w:hAnsi="Apple SD Gothic Neo" w:eastAsia="Apple SD Gothic Neo" w:cs="Apple SD Gothic Neo"/>
+                <w:rFonts w:ascii="맑은 고딕" w:hAnsi="맑은 고딕" w:eastAsia="맑은 고딕" w:cs="맑은 고딕"/>
                 <w:b/>
                 <w:color w:val="FFFFFF"/>
                 <w:sz w:val="21"/>
@@ -2312,7 +2312,7 @@
             <w:r/>
             <w:r>
               <w:rPr>
-                <w:rFonts w:ascii="Apple SD Gothic Neo" w:hAnsi="Apple SD Gothic Neo" w:eastAsia="Apple SD Gothic Neo" w:cs="Apple SD Gothic Neo"/>
+                <w:rFonts w:ascii="맑은 고딕" w:hAnsi="맑은 고딕" w:eastAsia="맑은 고딕" w:cs="맑은 고딕"/>
                 <w:b w:val="0"/>
                 <w:sz w:val="20"/>
               </w:rPr>
@@ -2333,7 +2333,7 @@
             <w:r/>
             <w:r>
               <w:rPr>
-                <w:rFonts w:ascii="Apple SD Gothic Neo" w:hAnsi="Apple SD Gothic Neo" w:eastAsia="Apple SD Gothic Neo" w:cs="Apple SD Gothic Neo"/>
+                <w:rFonts w:ascii="맑은 고딕" w:hAnsi="맑은 고딕" w:eastAsia="맑은 고딕" w:cs="맑은 고딕"/>
                 <w:b w:val="0"/>
                 <w:sz w:val="20"/>
               </w:rPr>
@@ -2357,7 +2357,7 @@
             <w:r/>
             <w:r>
               <w:rPr>
-                <w:rFonts w:ascii="Apple SD Gothic Neo" w:hAnsi="Apple SD Gothic Neo" w:eastAsia="Apple SD Gothic Neo" w:cs="Apple SD Gothic Neo"/>
+                <w:rFonts w:ascii="맑은 고딕" w:hAnsi="맑은 고딕" w:eastAsia="맑은 고딕" w:cs="맑은 고딕"/>
                 <w:b w:val="0"/>
                 <w:sz w:val="20"/>
               </w:rPr>
@@ -2379,7 +2379,7 @@
             <w:r/>
             <w:r>
               <w:rPr>
-                <w:rFonts w:ascii="Apple SD Gothic Neo" w:hAnsi="Apple SD Gothic Neo" w:eastAsia="Apple SD Gothic Neo" w:cs="Apple SD Gothic Neo"/>
+                <w:rFonts w:ascii="맑은 고딕" w:hAnsi="맑은 고딕" w:eastAsia="맑은 고딕" w:cs="맑은 고딕"/>
                 <w:b w:val="0"/>
                 <w:sz w:val="20"/>
               </w:rPr>
@@ -2402,7 +2402,7 @@
             <w:r/>
             <w:r>
               <w:rPr>
-                <w:rFonts w:ascii="Apple SD Gothic Neo" w:hAnsi="Apple SD Gothic Neo" w:eastAsia="Apple SD Gothic Neo" w:cs="Apple SD Gothic Neo"/>
+                <w:rFonts w:ascii="맑은 고딕" w:hAnsi="맑은 고딕" w:eastAsia="맑은 고딕" w:cs="맑은 고딕"/>
                 <w:b w:val="0"/>
                 <w:sz w:val="20"/>
               </w:rPr>
@@ -2423,7 +2423,7 @@
             <w:r/>
             <w:r>
               <w:rPr>
-                <w:rFonts w:ascii="Apple SD Gothic Neo" w:hAnsi="Apple SD Gothic Neo" w:eastAsia="Apple SD Gothic Neo" w:cs="Apple SD Gothic Neo"/>
+                <w:rFonts w:ascii="맑은 고딕" w:hAnsi="맑은 고딕" w:eastAsia="맑은 고딕" w:cs="맑은 고딕"/>
                 <w:b w:val="0"/>
                 <w:sz w:val="20"/>
               </w:rPr>
@@ -2447,7 +2447,7 @@
             <w:r/>
             <w:r>
               <w:rPr>
-                <w:rFonts w:ascii="Apple SD Gothic Neo" w:hAnsi="Apple SD Gothic Neo" w:eastAsia="Apple SD Gothic Neo" w:cs="Apple SD Gothic Neo"/>
+                <w:rFonts w:ascii="맑은 고딕" w:hAnsi="맑은 고딕" w:eastAsia="맑은 고딕" w:cs="맑은 고딕"/>
                 <w:b w:val="0"/>
                 <w:sz w:val="20"/>
               </w:rPr>
@@ -2469,7 +2469,7 @@
             <w:r/>
             <w:r>
               <w:rPr>
-                <w:rFonts w:ascii="Apple SD Gothic Neo" w:hAnsi="Apple SD Gothic Neo" w:eastAsia="Apple SD Gothic Neo" w:cs="Apple SD Gothic Neo"/>
+                <w:rFonts w:ascii="맑은 고딕" w:hAnsi="맑은 고딕" w:eastAsia="맑은 고딕" w:cs="맑은 고딕"/>
                 <w:b w:val="0"/>
                 <w:sz w:val="20"/>
               </w:rPr>
@@ -2492,7 +2492,7 @@
             <w:r/>
             <w:r>
               <w:rPr>
-                <w:rFonts w:ascii="Apple SD Gothic Neo" w:hAnsi="Apple SD Gothic Neo" w:eastAsia="Apple SD Gothic Neo" w:cs="Apple SD Gothic Neo"/>
+                <w:rFonts w:ascii="맑은 고딕" w:hAnsi="맑은 고딕" w:eastAsia="맑은 고딕" w:cs="맑은 고딕"/>
                 <w:b w:val="0"/>
                 <w:sz w:val="20"/>
               </w:rPr>
@@ -2513,7 +2513,7 @@
             <w:r/>
             <w:r>
               <w:rPr>
-                <w:rFonts w:ascii="Apple SD Gothic Neo" w:hAnsi="Apple SD Gothic Neo" w:eastAsia="Apple SD Gothic Neo" w:cs="Apple SD Gothic Neo"/>
+                <w:rFonts w:ascii="맑은 고딕" w:hAnsi="맑은 고딕" w:eastAsia="맑은 고딕" w:cs="맑은 고딕"/>
                 <w:b w:val="0"/>
                 <w:sz w:val="20"/>
               </w:rPr>
@@ -2537,7 +2537,7 @@
             <w:r/>
             <w:r>
               <w:rPr>
-                <w:rFonts w:ascii="Apple SD Gothic Neo" w:hAnsi="Apple SD Gothic Neo" w:eastAsia="Apple SD Gothic Neo" w:cs="Apple SD Gothic Neo"/>
+                <w:rFonts w:ascii="맑은 고딕" w:hAnsi="맑은 고딕" w:eastAsia="맑은 고딕" w:cs="맑은 고딕"/>
                 <w:b w:val="0"/>
                 <w:sz w:val="20"/>
               </w:rPr>
@@ -2559,7 +2559,7 @@
             <w:r/>
             <w:r>
               <w:rPr>
-                <w:rFonts w:ascii="Apple SD Gothic Neo" w:hAnsi="Apple SD Gothic Neo" w:eastAsia="Apple SD Gothic Neo" w:cs="Apple SD Gothic Neo"/>
+                <w:rFonts w:ascii="맑은 고딕" w:hAnsi="맑은 고딕" w:eastAsia="맑은 고딕" w:cs="맑은 고딕"/>
                 <w:b w:val="0"/>
                 <w:sz w:val="20"/>
               </w:rPr>
@@ -2582,7 +2582,7 @@
             <w:r/>
             <w:r>
               <w:rPr>
-                <w:rFonts w:ascii="Apple SD Gothic Neo" w:hAnsi="Apple SD Gothic Neo" w:eastAsia="Apple SD Gothic Neo" w:cs="Apple SD Gothic Neo"/>
+                <w:rFonts w:ascii="맑은 고딕" w:hAnsi="맑은 고딕" w:eastAsia="맑은 고딕" w:cs="맑은 고딕"/>
                 <w:b w:val="0"/>
                 <w:sz w:val="20"/>
               </w:rPr>
@@ -2603,7 +2603,7 @@
             <w:r/>
             <w:r>
               <w:rPr>
-                <w:rFonts w:ascii="Apple SD Gothic Neo" w:hAnsi="Apple SD Gothic Neo" w:eastAsia="Apple SD Gothic Neo" w:cs="Apple SD Gothic Neo"/>
+                <w:rFonts w:ascii="맑은 고딕" w:hAnsi="맑은 고딕" w:eastAsia="맑은 고딕" w:cs="맑은 고딕"/>
                 <w:b w:val="0"/>
                 <w:sz w:val="20"/>
               </w:rPr>
@@ -2619,7 +2619,7 @@
       </w:pPr>
       <w:r>
         <w:rPr>
-          <w:rFonts w:ascii="Apple SD Gothic Neo" w:hAnsi="Apple SD Gothic Neo" w:eastAsia="Apple SD Gothic Neo" w:cs="Apple SD Gothic Neo"/>
+          <w:rFonts w:ascii="맑은 고딕" w:hAnsi="맑은 고딕" w:eastAsia="맑은 고딕" w:cs="맑은 고딕"/>
           <w:b w:val="0"/>
           <w:i w:val="0"/>
           <w:sz w:val="2"/>
@@ -2633,7 +2633,7 @@
       </w:pPr>
       <w:r>
         <w:rPr>
-          <w:rFonts w:ascii="Apple SD Gothic Neo" w:hAnsi="Apple SD Gothic Neo" w:eastAsia="Apple SD Gothic Neo" w:cs="Apple SD Gothic Neo"/>
+          <w:rFonts w:ascii="맑은 고딕" w:hAnsi="맑은 고딕" w:eastAsia="맑은 고딕" w:cs="맑은 고딕"/>
           <w:b/>
           <w:color w:val="2E75B6"/>
           <w:sz w:val="25"/>
@@ -2667,7 +2667,7 @@
             <w:r/>
             <w:r>
               <w:rPr>
-                <w:rFonts w:ascii="Apple SD Gothic Neo" w:hAnsi="Apple SD Gothic Neo" w:eastAsia="Apple SD Gothic Neo" w:cs="Apple SD Gothic Neo"/>
+                <w:rFonts w:ascii="맑은 고딕" w:hAnsi="맑은 고딕" w:eastAsia="맑은 고딕" w:cs="맑은 고딕"/>
                 <w:b/>
                 <w:color w:val="FFFFFF"/>
                 <w:sz w:val="21"/>
@@ -2690,7 +2690,7 @@
             <w:r/>
             <w:r>
               <w:rPr>
-                <w:rFonts w:ascii="Apple SD Gothic Neo" w:hAnsi="Apple SD Gothic Neo" w:eastAsia="Apple SD Gothic Neo" w:cs="Apple SD Gothic Neo"/>
+                <w:rFonts w:ascii="맑은 고딕" w:hAnsi="맑은 고딕" w:eastAsia="맑은 고딕" w:cs="맑은 고딕"/>
                 <w:b/>
                 <w:color w:val="FFFFFF"/>
                 <w:sz w:val="21"/>
@@ -2714,7 +2714,7 @@
             <w:r/>
             <w:r>
               <w:rPr>
-                <w:rFonts w:ascii="Apple SD Gothic Neo" w:hAnsi="Apple SD Gothic Neo" w:eastAsia="Apple SD Gothic Neo" w:cs="Apple SD Gothic Neo"/>
+                <w:rFonts w:ascii="맑은 고딕" w:hAnsi="맑은 고딕" w:eastAsia="맑은 고딕" w:cs="맑은 고딕"/>
                 <w:b w:val="0"/>
                 <w:sz w:val="20"/>
               </w:rPr>
@@ -2735,7 +2735,7 @@
             <w:r/>
             <w:r>
               <w:rPr>
-                <w:rFonts w:ascii="Apple SD Gothic Neo" w:hAnsi="Apple SD Gothic Neo" w:eastAsia="Apple SD Gothic Neo" w:cs="Apple SD Gothic Neo"/>
+                <w:rFonts w:ascii="맑은 고딕" w:hAnsi="맑은 고딕" w:eastAsia="맑은 고딕" w:cs="맑은 고딕"/>
                 <w:b w:val="0"/>
                 <w:sz w:val="20"/>
               </w:rPr>
@@ -2759,7 +2759,7 @@
             <w:r/>
             <w:r>
               <w:rPr>
-                <w:rFonts w:ascii="Apple SD Gothic Neo" w:hAnsi="Apple SD Gothic Neo" w:eastAsia="Apple SD Gothic Neo" w:cs="Apple SD Gothic Neo"/>
+                <w:rFonts w:ascii="맑은 고딕" w:hAnsi="맑은 고딕" w:eastAsia="맑은 고딕" w:cs="맑은 고딕"/>
                 <w:b w:val="0"/>
                 <w:sz w:val="20"/>
               </w:rPr>
@@ -2781,7 +2781,7 @@
             <w:r/>
             <w:r>
               <w:rPr>
-                <w:rFonts w:ascii="Apple SD Gothic Neo" w:hAnsi="Apple SD Gothic Neo" w:eastAsia="Apple SD Gothic Neo" w:cs="Apple SD Gothic Neo"/>
+                <w:rFonts w:ascii="맑은 고딕" w:hAnsi="맑은 고딕" w:eastAsia="맑은 고딕" w:cs="맑은 고딕"/>
                 <w:b w:val="0"/>
                 <w:sz w:val="20"/>
               </w:rPr>
@@ -2804,7 +2804,7 @@
             <w:r/>
             <w:r>
               <w:rPr>
-                <w:rFonts w:ascii="Apple SD Gothic Neo" w:hAnsi="Apple SD Gothic Neo" w:eastAsia="Apple SD Gothic Neo" w:cs="Apple SD Gothic Neo"/>
+                <w:rFonts w:ascii="맑은 고딕" w:hAnsi="맑은 고딕" w:eastAsia="맑은 고딕" w:cs="맑은 고딕"/>
                 <w:b w:val="0"/>
                 <w:sz w:val="20"/>
               </w:rPr>
@@ -2825,7 +2825,7 @@
             <w:r/>
             <w:r>
               <w:rPr>
-                <w:rFonts w:ascii="Apple SD Gothic Neo" w:hAnsi="Apple SD Gothic Neo" w:eastAsia="Apple SD Gothic Neo" w:cs="Apple SD Gothic Neo"/>
+                <w:rFonts w:ascii="맑은 고딕" w:hAnsi="맑은 고딕" w:eastAsia="맑은 고딕" w:cs="맑은 고딕"/>
                 <w:b w:val="0"/>
                 <w:sz w:val="20"/>
               </w:rPr>
@@ -2849,7 +2849,7 @@
             <w:r/>
             <w:r>
               <w:rPr>
-                <w:rFonts w:ascii="Apple SD Gothic Neo" w:hAnsi="Apple SD Gothic Neo" w:eastAsia="Apple SD Gothic Neo" w:cs="Apple SD Gothic Neo"/>
+                <w:rFonts w:ascii="맑은 고딕" w:hAnsi="맑은 고딕" w:eastAsia="맑은 고딕" w:cs="맑은 고딕"/>
                 <w:b w:val="0"/>
                 <w:sz w:val="20"/>
               </w:rPr>
@@ -2871,7 +2871,7 @@
             <w:r/>
             <w:r>
               <w:rPr>
-                <w:rFonts w:ascii="Apple SD Gothic Neo" w:hAnsi="Apple SD Gothic Neo" w:eastAsia="Apple SD Gothic Neo" w:cs="Apple SD Gothic Neo"/>
+                <w:rFonts w:ascii="맑은 고딕" w:hAnsi="맑은 고딕" w:eastAsia="맑은 고딕" w:cs="맑은 고딕"/>
                 <w:b w:val="0"/>
                 <w:sz w:val="20"/>
               </w:rPr>
@@ -2894,7 +2894,7 @@
             <w:r/>
             <w:r>
               <w:rPr>
-                <w:rFonts w:ascii="Apple SD Gothic Neo" w:hAnsi="Apple SD Gothic Neo" w:eastAsia="Apple SD Gothic Neo" w:cs="Apple SD Gothic Neo"/>
+                <w:rFonts w:ascii="맑은 고딕" w:hAnsi="맑은 고딕" w:eastAsia="맑은 고딕" w:cs="맑은 고딕"/>
                 <w:b w:val="0"/>
                 <w:sz w:val="20"/>
               </w:rPr>
@@ -2915,7 +2915,7 @@
             <w:r/>
             <w:r>
               <w:rPr>
-                <w:rFonts w:ascii="Apple SD Gothic Neo" w:hAnsi="Apple SD Gothic Neo" w:eastAsia="Apple SD Gothic Neo" w:cs="Apple SD Gothic Neo"/>
+                <w:rFonts w:ascii="맑은 고딕" w:hAnsi="맑은 고딕" w:eastAsia="맑은 고딕" w:cs="맑은 고딕"/>
                 <w:b w:val="0"/>
                 <w:sz w:val="20"/>
               </w:rPr>
@@ -2931,7 +2931,7 @@
       </w:pPr>
       <w:r>
         <w:rPr>
-          <w:rFonts w:ascii="Apple SD Gothic Neo" w:hAnsi="Apple SD Gothic Neo" w:eastAsia="Apple SD Gothic Neo" w:cs="Apple SD Gothic Neo"/>
+          <w:rFonts w:ascii="맑은 고딕" w:hAnsi="맑은 고딕" w:eastAsia="맑은 고딕" w:cs="맑은 고딕"/>
           <w:b w:val="0"/>
           <w:i w:val="0"/>
           <w:sz w:val="2"/>
@@ -2945,7 +2945,7 @@
       </w:pPr>
       <w:r>
         <w:rPr>
-          <w:rFonts w:ascii="Apple SD Gothic Neo" w:hAnsi="Apple SD Gothic Neo" w:eastAsia="Apple SD Gothic Neo" w:cs="Apple SD Gothic Neo"/>
+          <w:rFonts w:ascii="맑은 고딕" w:hAnsi="맑은 고딕" w:eastAsia="맑은 고딕" w:cs="맑은 고딕"/>
           <w:b/>
           <w:color w:val="2E75B6"/>
           <w:sz w:val="25"/>
@@ -2979,7 +2979,7 @@
             <w:r/>
             <w:r>
               <w:rPr>
-                <w:rFonts w:ascii="Apple SD Gothic Neo" w:hAnsi="Apple SD Gothic Neo" w:eastAsia="Apple SD Gothic Neo" w:cs="Apple SD Gothic Neo"/>
+                <w:rFonts w:ascii="맑은 고딕" w:hAnsi="맑은 고딕" w:eastAsia="맑은 고딕" w:cs="맑은 고딕"/>
                 <w:b/>
                 <w:color w:val="FFFFFF"/>
                 <w:sz w:val="21"/>
@@ -3002,7 +3002,7 @@
             <w:r/>
             <w:r>
               <w:rPr>
-                <w:rFonts w:ascii="Apple SD Gothic Neo" w:hAnsi="Apple SD Gothic Neo" w:eastAsia="Apple SD Gothic Neo" w:cs="Apple SD Gothic Neo"/>
+                <w:rFonts w:ascii="맑은 고딕" w:hAnsi="맑은 고딕" w:eastAsia="맑은 고딕" w:cs="맑은 고딕"/>
                 <w:b/>
                 <w:color w:val="FFFFFF"/>
                 <w:sz w:val="21"/>
@@ -3026,7 +3026,7 @@
             <w:r/>
             <w:r>
               <w:rPr>
-                <w:rFonts w:ascii="Apple SD Gothic Neo" w:hAnsi="Apple SD Gothic Neo" w:eastAsia="Apple SD Gothic Neo" w:cs="Apple SD Gothic Neo"/>
+                <w:rFonts w:ascii="맑은 고딕" w:hAnsi="맑은 고딕" w:eastAsia="맑은 고딕" w:cs="맑은 고딕"/>
                 <w:b w:val="0"/>
                 <w:sz w:val="20"/>
               </w:rPr>
@@ -3047,7 +3047,7 @@
             <w:r/>
             <w:r>
               <w:rPr>
-                <w:rFonts w:ascii="Apple SD Gothic Neo" w:hAnsi="Apple SD Gothic Neo" w:eastAsia="Apple SD Gothic Neo" w:cs="Apple SD Gothic Neo"/>
+                <w:rFonts w:ascii="맑은 고딕" w:hAnsi="맑은 고딕" w:eastAsia="맑은 고딕" w:cs="맑은 고딕"/>
                 <w:b w:val="0"/>
                 <w:sz w:val="20"/>
               </w:rPr>
@@ -3071,7 +3071,7 @@
             <w:r/>
             <w:r>
               <w:rPr>
-                <w:rFonts w:ascii="Apple SD Gothic Neo" w:hAnsi="Apple SD Gothic Neo" w:eastAsia="Apple SD Gothic Neo" w:cs="Apple SD Gothic Neo"/>
+                <w:rFonts w:ascii="맑은 고딕" w:hAnsi="맑은 고딕" w:eastAsia="맑은 고딕" w:cs="맑은 고딕"/>
                 <w:b w:val="0"/>
                 <w:sz w:val="20"/>
               </w:rPr>
@@ -3093,7 +3093,7 @@
             <w:r/>
             <w:r>
               <w:rPr>
-                <w:rFonts w:ascii="Apple SD Gothic Neo" w:hAnsi="Apple SD Gothic Neo" w:eastAsia="Apple SD Gothic Neo" w:cs="Apple SD Gothic Neo"/>
+                <w:rFonts w:ascii="맑은 고딕" w:hAnsi="맑은 고딕" w:eastAsia="맑은 고딕" w:cs="맑은 고딕"/>
                 <w:b w:val="0"/>
                 <w:sz w:val="20"/>
               </w:rPr>
@@ -3117,7 +3117,7 @@
             <w:r/>
             <w:r>
               <w:rPr>
-                <w:rFonts w:ascii="Apple SD Gothic Neo" w:hAnsi="Apple SD Gothic Neo" w:eastAsia="Apple SD Gothic Neo" w:cs="Apple SD Gothic Neo"/>
+                <w:rFonts w:ascii="맑은 고딕" w:hAnsi="맑은 고딕" w:eastAsia="맑은 고딕" w:cs="맑은 고딕"/>
                 <w:b w:val="0"/>
                 <w:sz w:val="20"/>
               </w:rPr>
@@ -3139,7 +3139,7 @@
             <w:r/>
             <w:r>
               <w:rPr>
-                <w:rFonts w:ascii="Apple SD Gothic Neo" w:hAnsi="Apple SD Gothic Neo" w:eastAsia="Apple SD Gothic Neo" w:cs="Apple SD Gothic Neo"/>
+                <w:rFonts w:ascii="맑은 고딕" w:hAnsi="맑은 고딕" w:eastAsia="맑은 고딕" w:cs="맑은 고딕"/>
                 <w:b w:val="0"/>
                 <w:sz w:val="20"/>
               </w:rPr>
@@ -3162,7 +3162,7 @@
             <w:r/>
             <w:r>
               <w:rPr>
-                <w:rFonts w:ascii="Apple SD Gothic Neo" w:hAnsi="Apple SD Gothic Neo" w:eastAsia="Apple SD Gothic Neo" w:cs="Apple SD Gothic Neo"/>
+                <w:rFonts w:ascii="맑은 고딕" w:hAnsi="맑은 고딕" w:eastAsia="맑은 고딕" w:cs="맑은 고딕"/>
                 <w:b w:val="0"/>
                 <w:sz w:val="20"/>
               </w:rPr>
@@ -3183,7 +3183,7 @@
             <w:r/>
             <w:r>
               <w:rPr>
-                <w:rFonts w:ascii="Apple SD Gothic Neo" w:hAnsi="Apple SD Gothic Neo" w:eastAsia="Apple SD Gothic Neo" w:cs="Apple SD Gothic Neo"/>
+                <w:rFonts w:ascii="맑은 고딕" w:hAnsi="맑은 고딕" w:eastAsia="맑은 고딕" w:cs="맑은 고딕"/>
                 <w:b w:val="0"/>
                 <w:sz w:val="20"/>
               </w:rPr>
@@ -3199,7 +3199,7 @@
       </w:pPr>
       <w:r>
         <w:rPr>
-          <w:rFonts w:ascii="Apple SD Gothic Neo" w:hAnsi="Apple SD Gothic Neo" w:eastAsia="Apple SD Gothic Neo" w:cs="Apple SD Gothic Neo"/>
+          <w:rFonts w:ascii="맑은 고딕" w:hAnsi="맑은 고딕" w:eastAsia="맑은 고딕" w:cs="맑은 고딕"/>
           <w:b w:val="0"/>
           <w:i w:val="0"/>
           <w:sz w:val="2"/>
@@ -3213,7 +3213,7 @@
       </w:pPr>
       <w:r>
         <w:rPr>
-          <w:rFonts w:ascii="Apple SD Gothic Neo" w:hAnsi="Apple SD Gothic Neo" w:eastAsia="Apple SD Gothic Neo" w:cs="Apple SD Gothic Neo"/>
+          <w:rFonts w:ascii="맑은 고딕" w:hAnsi="맑은 고딕" w:eastAsia="맑은 고딕" w:cs="맑은 고딕"/>
           <w:b/>
           <w:color w:val="2E75B6"/>
           <w:sz w:val="25"/>
@@ -3247,7 +3247,7 @@
             <w:r/>
             <w:r>
               <w:rPr>
-                <w:rFonts w:ascii="Apple SD Gothic Neo" w:hAnsi="Apple SD Gothic Neo" w:eastAsia="Apple SD Gothic Neo" w:cs="Apple SD Gothic Neo"/>
+                <w:rFonts w:ascii="맑은 고딕" w:hAnsi="맑은 고딕" w:eastAsia="맑은 고딕" w:cs="맑은 고딕"/>
                 <w:b/>
                 <w:color w:val="FFFFFF"/>
                 <w:sz w:val="21"/>
@@ -3270,7 +3270,7 @@
             <w:r/>
             <w:r>
               <w:rPr>
-                <w:rFonts w:ascii="Apple SD Gothic Neo" w:hAnsi="Apple SD Gothic Neo" w:eastAsia="Apple SD Gothic Neo" w:cs="Apple SD Gothic Neo"/>
+                <w:rFonts w:ascii="맑은 고딕" w:hAnsi="맑은 고딕" w:eastAsia="맑은 고딕" w:cs="맑은 고딕"/>
                 <w:b/>
                 <w:color w:val="FFFFFF"/>
                 <w:sz w:val="21"/>
@@ -3294,7 +3294,7 @@
             <w:r/>
             <w:r>
               <w:rPr>
-                <w:rFonts w:ascii="Apple SD Gothic Neo" w:hAnsi="Apple SD Gothic Neo" w:eastAsia="Apple SD Gothic Neo" w:cs="Apple SD Gothic Neo"/>
+                <w:rFonts w:ascii="맑은 고딕" w:hAnsi="맑은 고딕" w:eastAsia="맑은 고딕" w:cs="맑은 고딕"/>
                 <w:b w:val="0"/>
                 <w:sz w:val="20"/>
               </w:rPr>
@@ -3315,7 +3315,7 @@
             <w:r/>
             <w:r>
               <w:rPr>
-                <w:rFonts w:ascii="Apple SD Gothic Neo" w:hAnsi="Apple SD Gothic Neo" w:eastAsia="Apple SD Gothic Neo" w:cs="Apple SD Gothic Neo"/>
+                <w:rFonts w:ascii="맑은 고딕" w:hAnsi="맑은 고딕" w:eastAsia="맑은 고딕" w:cs="맑은 고딕"/>
                 <w:b w:val="0"/>
                 <w:sz w:val="20"/>
               </w:rPr>
@@ -3339,7 +3339,7 @@
             <w:r/>
             <w:r>
               <w:rPr>
-                <w:rFonts w:ascii="Apple SD Gothic Neo" w:hAnsi="Apple SD Gothic Neo" w:eastAsia="Apple SD Gothic Neo" w:cs="Apple SD Gothic Neo"/>
+                <w:rFonts w:ascii="맑은 고딕" w:hAnsi="맑은 고딕" w:eastAsia="맑은 고딕" w:cs="맑은 고딕"/>
                 <w:b w:val="0"/>
                 <w:sz w:val="20"/>
               </w:rPr>
@@ -3361,7 +3361,7 @@
             <w:r/>
             <w:r>
               <w:rPr>
-                <w:rFonts w:ascii="Apple SD Gothic Neo" w:hAnsi="Apple SD Gothic Neo" w:eastAsia="Apple SD Gothic Neo" w:cs="Apple SD Gothic Neo"/>
+                <w:rFonts w:ascii="맑은 고딕" w:hAnsi="맑은 고딕" w:eastAsia="맑은 고딕" w:cs="맑은 고딕"/>
                 <w:b w:val="0"/>
                 <w:sz w:val="20"/>
               </w:rPr>
@@ -3384,7 +3384,7 @@
             <w:r/>
             <w:r>
               <w:rPr>
-                <w:rFonts w:ascii="Apple SD Gothic Neo" w:hAnsi="Apple SD Gothic Neo" w:eastAsia="Apple SD Gothic Neo" w:cs="Apple SD Gothic Neo"/>
+                <w:rFonts w:ascii="맑은 고딕" w:hAnsi="맑은 고딕" w:eastAsia="맑은 고딕" w:cs="맑은 고딕"/>
                 <w:b w:val="0"/>
                 <w:sz w:val="20"/>
               </w:rPr>
@@ -3405,7 +3405,7 @@
             <w:r/>
             <w:r>
               <w:rPr>
-                <w:rFonts w:ascii="Apple SD Gothic Neo" w:hAnsi="Apple SD Gothic Neo" w:eastAsia="Apple SD Gothic Neo" w:cs="Apple SD Gothic Neo"/>
+                <w:rFonts w:ascii="맑은 고딕" w:hAnsi="맑은 고딕" w:eastAsia="맑은 고딕" w:cs="맑은 고딕"/>
                 <w:b w:val="0"/>
                 <w:sz w:val="20"/>
               </w:rPr>
@@ -3429,7 +3429,7 @@
             <w:r/>
             <w:r>
               <w:rPr>
-                <w:rFonts w:ascii="Apple SD Gothic Neo" w:hAnsi="Apple SD Gothic Neo" w:eastAsia="Apple SD Gothic Neo" w:cs="Apple SD Gothic Neo"/>
+                <w:rFonts w:ascii="맑은 고딕" w:hAnsi="맑은 고딕" w:eastAsia="맑은 고딕" w:cs="맑은 고딕"/>
                 <w:b w:val="0"/>
                 <w:sz w:val="20"/>
               </w:rPr>
@@ -3451,7 +3451,7 @@
             <w:r/>
             <w:r>
               <w:rPr>
-                <w:rFonts w:ascii="Apple SD Gothic Neo" w:hAnsi="Apple SD Gothic Neo" w:eastAsia="Apple SD Gothic Neo" w:cs="Apple SD Gothic Neo"/>
+                <w:rFonts w:ascii="맑은 고딕" w:hAnsi="맑은 고딕" w:eastAsia="맑은 고딕" w:cs="맑은 고딕"/>
                 <w:b w:val="0"/>
                 <w:sz w:val="20"/>
               </w:rPr>
@@ -3474,7 +3474,7 @@
             <w:r/>
             <w:r>
               <w:rPr>
-                <w:rFonts w:ascii="Apple SD Gothic Neo" w:hAnsi="Apple SD Gothic Neo" w:eastAsia="Apple SD Gothic Neo" w:cs="Apple SD Gothic Neo"/>
+                <w:rFonts w:ascii="맑은 고딕" w:hAnsi="맑은 고딕" w:eastAsia="맑은 고딕" w:cs="맑은 고딕"/>
                 <w:b w:val="0"/>
                 <w:sz w:val="20"/>
               </w:rPr>
@@ -3495,7 +3495,7 @@
             <w:r/>
             <w:r>
               <w:rPr>
-                <w:rFonts w:ascii="Apple SD Gothic Neo" w:hAnsi="Apple SD Gothic Neo" w:eastAsia="Apple SD Gothic Neo" w:cs="Apple SD Gothic Neo"/>
+                <w:rFonts w:ascii="맑은 고딕" w:hAnsi="맑은 고딕" w:eastAsia="맑은 고딕" w:cs="맑은 고딕"/>
                 <w:b w:val="0"/>
                 <w:sz w:val="20"/>
               </w:rPr>
@@ -3519,7 +3519,7 @@
             <w:r/>
             <w:r>
               <w:rPr>
-                <w:rFonts w:ascii="Apple SD Gothic Neo" w:hAnsi="Apple SD Gothic Neo" w:eastAsia="Apple SD Gothic Neo" w:cs="Apple SD Gothic Neo"/>
+                <w:rFonts w:ascii="맑은 고딕" w:hAnsi="맑은 고딕" w:eastAsia="맑은 고딕" w:cs="맑은 고딕"/>
                 <w:b w:val="0"/>
                 <w:sz w:val="20"/>
               </w:rPr>
@@ -3541,7 +3541,7 @@
             <w:r/>
             <w:r>
               <w:rPr>
-                <w:rFonts w:ascii="Apple SD Gothic Neo" w:hAnsi="Apple SD Gothic Neo" w:eastAsia="Apple SD Gothic Neo" w:cs="Apple SD Gothic Neo"/>
+                <w:rFonts w:ascii="맑은 고딕" w:hAnsi="맑은 고딕" w:eastAsia="맑은 고딕" w:cs="맑은 고딕"/>
                 <w:b w:val="0"/>
                 <w:sz w:val="20"/>
               </w:rPr>
@@ -3564,7 +3564,7 @@
             <w:r/>
             <w:r>
               <w:rPr>
-                <w:rFonts w:ascii="Apple SD Gothic Neo" w:hAnsi="Apple SD Gothic Neo" w:eastAsia="Apple SD Gothic Neo" w:cs="Apple SD Gothic Neo"/>
+                <w:rFonts w:ascii="맑은 고딕" w:hAnsi="맑은 고딕" w:eastAsia="맑은 고딕" w:cs="맑은 고딕"/>
                 <w:b w:val="0"/>
                 <w:sz w:val="20"/>
               </w:rPr>
@@ -3585,7 +3585,7 @@
             <w:r/>
             <w:r>
               <w:rPr>
-                <w:rFonts w:ascii="Apple SD Gothic Neo" w:hAnsi="Apple SD Gothic Neo" w:eastAsia="Apple SD Gothic Neo" w:cs="Apple SD Gothic Neo"/>
+                <w:rFonts w:ascii="맑은 고딕" w:hAnsi="맑은 고딕" w:eastAsia="맑은 고딕" w:cs="맑은 고딕"/>
                 <w:b w:val="0"/>
                 <w:sz w:val="20"/>
               </w:rPr>
@@ -3601,7 +3601,7 @@
       </w:pPr>
       <w:r>
         <w:rPr>
-          <w:rFonts w:ascii="Apple SD Gothic Neo" w:hAnsi="Apple SD Gothic Neo" w:eastAsia="Apple SD Gothic Neo" w:cs="Apple SD Gothic Neo"/>
+          <w:rFonts w:ascii="맑은 고딕" w:hAnsi="맑은 고딕" w:eastAsia="맑은 고딕" w:cs="맑은 고딕"/>
           <w:b w:val="0"/>
           <w:i w:val="0"/>
           <w:sz w:val="2"/>
@@ -3615,7 +3615,7 @@
       </w:pPr>
       <w:r>
         <w:rPr>
-          <w:rFonts w:ascii="Apple SD Gothic Neo" w:hAnsi="Apple SD Gothic Neo" w:eastAsia="Apple SD Gothic Neo" w:cs="Apple SD Gothic Neo"/>
+          <w:rFonts w:ascii="맑은 고딕" w:hAnsi="맑은 고딕" w:eastAsia="맑은 고딕" w:cs="맑은 고딕"/>
           <w:b/>
           <w:color w:val="1F4E78"/>
           <w:sz w:val="30"/>
@@ -3630,7 +3630,7 @@
       </w:pPr>
       <w:r>
         <w:rPr>
-          <w:rFonts w:ascii="Apple SD Gothic Neo" w:hAnsi="Apple SD Gothic Neo" w:eastAsia="Apple SD Gothic Neo" w:cs="Apple SD Gothic Neo"/>
+          <w:rFonts w:ascii="맑은 고딕" w:hAnsi="맑은 고딕" w:eastAsia="맑은 고딕" w:cs="맑은 고딕"/>
           <w:b/>
           <w:color w:val="2E75B6"/>
           <w:sz w:val="25"/>
@@ -3645,7 +3645,7 @@
       </w:pPr>
       <w:r>
         <w:rPr>
-          <w:rFonts w:ascii="Apple SD Gothic Neo" w:hAnsi="Apple SD Gothic Neo" w:eastAsia="Apple SD Gothic Neo" w:cs="Apple SD Gothic Neo"/>
+          <w:rFonts w:ascii="맑은 고딕" w:hAnsi="맑은 고딕" w:eastAsia="맑은 고딕" w:cs="맑은 고딕"/>
           <w:sz w:val="21"/>
         </w:rPr>
         <w:t>클라우드/서버: 가비아 등 일반 호스팅 서버를 우선 사용 (출시 직후). 트래픽 증가 시 AWS 등 확장 가능 구조로 설계.</w:t>
@@ -3658,7 +3658,7 @@
       </w:pPr>
       <w:r>
         <w:rPr>
-          <w:rFonts w:ascii="Apple SD Gothic Neo" w:hAnsi="Apple SD Gothic Neo" w:eastAsia="Apple SD Gothic Neo" w:cs="Apple SD Gothic Neo"/>
+          <w:rFonts w:ascii="맑은 고딕" w:hAnsi="맑은 고딕" w:eastAsia="맑은 고딕" w:cs="맑은 고딕"/>
           <w:sz w:val="21"/>
         </w:rPr>
         <w:t>백엔드: 마이크로서비스 또는 모듈러 모놀리스 구조 (수행사 제안). API는 RESTful 또는 GraphQL 명세 제공 의무.</w:t>
@@ -3671,7 +3671,7 @@
       </w:pPr>
       <w:r>
         <w:rPr>
-          <w:rFonts w:ascii="Apple SD Gothic Neo" w:hAnsi="Apple SD Gothic Neo" w:eastAsia="Apple SD Gothic Neo" w:cs="Apple SD Gothic Neo"/>
+          <w:rFonts w:ascii="맑은 고딕" w:hAnsi="맑은 고딕" w:eastAsia="맑은 고딕" w:cs="맑은 고딕"/>
           <w:sz w:val="21"/>
         </w:rPr>
         <w:t>데이터베이스: 트랜잭션성 데이터(RDB) + 시계열/로그 데이터(별도 저장소) 이원화 권장.</w:t>
@@ -3684,7 +3684,7 @@
       </w:pPr>
       <w:r>
         <w:rPr>
-          <w:rFonts w:ascii="Apple SD Gothic Neo" w:hAnsi="Apple SD Gothic Neo" w:eastAsia="Apple SD Gothic Neo" w:cs="Apple SD Gothic Neo"/>
+          <w:rFonts w:ascii="맑은 고딕" w:hAnsi="맑은 고딕" w:eastAsia="맑은 고딕" w:cs="맑은 고딕"/>
           <w:sz w:val="21"/>
         </w:rPr>
         <w:t>CI/CD: Git 기반 형상관리, 자동 빌드/배포 파이프라인 구축 의무.</w:t>
@@ -3697,7 +3697,7 @@
       </w:pPr>
       <w:r>
         <w:rPr>
-          <w:rFonts w:ascii="Apple SD Gothic Neo" w:hAnsi="Apple SD Gothic Neo" w:eastAsia="Apple SD Gothic Neo" w:cs="Apple SD Gothic Neo"/>
+          <w:rFonts w:ascii="맑은 고딕" w:hAnsi="맑은 고딕" w:eastAsia="맑은 고딕" w:cs="맑은 고딕"/>
           <w:sz w:val="21"/>
         </w:rPr>
         <w:t>관측성: 로그, 메트릭, 알림 체계 구축 (Sentry 또는 동급, CloudWatch 또는 동급).</w:t>
@@ -3710,7 +3710,7 @@
       </w:pPr>
       <w:r>
         <w:rPr>
-          <w:rFonts w:ascii="Apple SD Gothic Neo" w:hAnsi="Apple SD Gothic Neo" w:eastAsia="Apple SD Gothic Neo" w:cs="Apple SD Gothic Neo"/>
+          <w:rFonts w:ascii="맑은 고딕" w:hAnsi="맑은 고딕" w:eastAsia="맑은 고딕" w:cs="맑은 고딕"/>
           <w:b/>
           <w:color w:val="2E75B6"/>
           <w:sz w:val="25"/>
@@ -3744,7 +3744,7 @@
             <w:r/>
             <w:r>
               <w:rPr>
-                <w:rFonts w:ascii="Apple SD Gothic Neo" w:hAnsi="Apple SD Gothic Neo" w:eastAsia="Apple SD Gothic Neo" w:cs="Apple SD Gothic Neo"/>
+                <w:rFonts w:ascii="맑은 고딕" w:hAnsi="맑은 고딕" w:eastAsia="맑은 고딕" w:cs="맑은 고딕"/>
                 <w:b/>
                 <w:color w:val="FFFFFF"/>
                 <w:sz w:val="21"/>
@@ -3767,7 +3767,7 @@
             <w:r/>
             <w:r>
               <w:rPr>
-                <w:rFonts w:ascii="Apple SD Gothic Neo" w:hAnsi="Apple SD Gothic Neo" w:eastAsia="Apple SD Gothic Neo" w:cs="Apple SD Gothic Neo"/>
+                <w:rFonts w:ascii="맑은 고딕" w:hAnsi="맑은 고딕" w:eastAsia="맑은 고딕" w:cs="맑은 고딕"/>
                 <w:b/>
                 <w:color w:val="FFFFFF"/>
                 <w:sz w:val="21"/>
@@ -3791,7 +3791,7 @@
             <w:r/>
             <w:r>
               <w:rPr>
-                <w:rFonts w:ascii="Apple SD Gothic Neo" w:hAnsi="Apple SD Gothic Neo" w:eastAsia="Apple SD Gothic Neo" w:cs="Apple SD Gothic Neo"/>
+                <w:rFonts w:ascii="맑은 고딕" w:hAnsi="맑은 고딕" w:eastAsia="맑은 고딕" w:cs="맑은 고딕"/>
                 <w:b w:val="0"/>
                 <w:sz w:val="20"/>
               </w:rPr>
@@ -3812,7 +3812,7 @@
             <w:r/>
             <w:r>
               <w:rPr>
-                <w:rFonts w:ascii="Apple SD Gothic Neo" w:hAnsi="Apple SD Gothic Neo" w:eastAsia="Apple SD Gothic Neo" w:cs="Apple SD Gothic Neo"/>
+                <w:rFonts w:ascii="맑은 고딕" w:hAnsi="맑은 고딕" w:eastAsia="맑은 고딕" w:cs="맑은 고딕"/>
                 <w:b w:val="0"/>
                 <w:sz w:val="20"/>
               </w:rPr>
@@ -3836,7 +3836,7 @@
             <w:r/>
             <w:r>
               <w:rPr>
-                <w:rFonts w:ascii="Apple SD Gothic Neo" w:hAnsi="Apple SD Gothic Neo" w:eastAsia="Apple SD Gothic Neo" w:cs="Apple SD Gothic Neo"/>
+                <w:rFonts w:ascii="맑은 고딕" w:hAnsi="맑은 고딕" w:eastAsia="맑은 고딕" w:cs="맑은 고딕"/>
                 <w:b w:val="0"/>
                 <w:sz w:val="20"/>
               </w:rPr>
@@ -3858,7 +3858,7 @@
             <w:r/>
             <w:r>
               <w:rPr>
-                <w:rFonts w:ascii="Apple SD Gothic Neo" w:hAnsi="Apple SD Gothic Neo" w:eastAsia="Apple SD Gothic Neo" w:cs="Apple SD Gothic Neo"/>
+                <w:rFonts w:ascii="맑은 고딕" w:hAnsi="맑은 고딕" w:eastAsia="맑은 고딕" w:cs="맑은 고딕"/>
                 <w:b w:val="0"/>
                 <w:sz w:val="20"/>
               </w:rPr>
@@ -3881,7 +3881,7 @@
             <w:r/>
             <w:r>
               <w:rPr>
-                <w:rFonts w:ascii="Apple SD Gothic Neo" w:hAnsi="Apple SD Gothic Neo" w:eastAsia="Apple SD Gothic Neo" w:cs="Apple SD Gothic Neo"/>
+                <w:rFonts w:ascii="맑은 고딕" w:hAnsi="맑은 고딕" w:eastAsia="맑은 고딕" w:cs="맑은 고딕"/>
                 <w:b w:val="0"/>
                 <w:sz w:val="20"/>
               </w:rPr>
@@ -3902,7 +3902,7 @@
             <w:r/>
             <w:r>
               <w:rPr>
-                <w:rFonts w:ascii="Apple SD Gothic Neo" w:hAnsi="Apple SD Gothic Neo" w:eastAsia="Apple SD Gothic Neo" w:cs="Apple SD Gothic Neo"/>
+                <w:rFonts w:ascii="맑은 고딕" w:hAnsi="맑은 고딕" w:eastAsia="맑은 고딕" w:cs="맑은 고딕"/>
                 <w:b w:val="0"/>
                 <w:sz w:val="20"/>
               </w:rPr>
@@ -3926,7 +3926,7 @@
             <w:r/>
             <w:r>
               <w:rPr>
-                <w:rFonts w:ascii="Apple SD Gothic Neo" w:hAnsi="Apple SD Gothic Neo" w:eastAsia="Apple SD Gothic Neo" w:cs="Apple SD Gothic Neo"/>
+                <w:rFonts w:ascii="맑은 고딕" w:hAnsi="맑은 고딕" w:eastAsia="맑은 고딕" w:cs="맑은 고딕"/>
                 <w:b w:val="0"/>
                 <w:sz w:val="20"/>
               </w:rPr>
@@ -3948,7 +3948,7 @@
             <w:r/>
             <w:r>
               <w:rPr>
-                <w:rFonts w:ascii="Apple SD Gothic Neo" w:hAnsi="Apple SD Gothic Neo" w:eastAsia="Apple SD Gothic Neo" w:cs="Apple SD Gothic Neo"/>
+                <w:rFonts w:ascii="맑은 고딕" w:hAnsi="맑은 고딕" w:eastAsia="맑은 고딕" w:cs="맑은 고딕"/>
                 <w:b w:val="0"/>
                 <w:sz w:val="20"/>
               </w:rPr>
@@ -3971,7 +3971,7 @@
             <w:r/>
             <w:r>
               <w:rPr>
-                <w:rFonts w:ascii="Apple SD Gothic Neo" w:hAnsi="Apple SD Gothic Neo" w:eastAsia="Apple SD Gothic Neo" w:cs="Apple SD Gothic Neo"/>
+                <w:rFonts w:ascii="맑은 고딕" w:hAnsi="맑은 고딕" w:eastAsia="맑은 고딕" w:cs="맑은 고딕"/>
                 <w:b w:val="0"/>
                 <w:sz w:val="20"/>
               </w:rPr>
@@ -3992,7 +3992,7 @@
             <w:r/>
             <w:r>
               <w:rPr>
-                <w:rFonts w:ascii="Apple SD Gothic Neo" w:hAnsi="Apple SD Gothic Neo" w:eastAsia="Apple SD Gothic Neo" w:cs="Apple SD Gothic Neo"/>
+                <w:rFonts w:ascii="맑은 고딕" w:hAnsi="맑은 고딕" w:eastAsia="맑은 고딕" w:cs="맑은 고딕"/>
                 <w:b w:val="0"/>
                 <w:sz w:val="20"/>
               </w:rPr>
@@ -4008,7 +4008,7 @@
       </w:pPr>
       <w:r>
         <w:rPr>
-          <w:rFonts w:ascii="Apple SD Gothic Neo" w:hAnsi="Apple SD Gothic Neo" w:eastAsia="Apple SD Gothic Neo" w:cs="Apple SD Gothic Neo"/>
+          <w:rFonts w:ascii="맑은 고딕" w:hAnsi="맑은 고딕" w:eastAsia="맑은 고딕" w:cs="맑은 고딕"/>
           <w:b w:val="0"/>
           <w:i w:val="0"/>
           <w:sz w:val="2"/>
@@ -4022,7 +4022,7 @@
       </w:pPr>
       <w:r>
         <w:rPr>
-          <w:rFonts w:ascii="Apple SD Gothic Neo" w:hAnsi="Apple SD Gothic Neo" w:eastAsia="Apple SD Gothic Neo" w:cs="Apple SD Gothic Neo"/>
+          <w:rFonts w:ascii="맑은 고딕" w:hAnsi="맑은 고딕" w:eastAsia="맑은 고딕" w:cs="맑은 고딕"/>
           <w:b/>
           <w:color w:val="2E75B6"/>
           <w:sz w:val="25"/>
@@ -4037,7 +4037,7 @@
       </w:pPr>
       <w:r>
         <w:rPr>
-          <w:rFonts w:ascii="Apple SD Gothic Neo" w:hAnsi="Apple SD Gothic Neo" w:eastAsia="Apple SD Gothic Neo" w:cs="Apple SD Gothic Neo"/>
+          <w:rFonts w:ascii="맑은 고딕" w:hAnsi="맑은 고딕" w:eastAsia="맑은 고딕" w:cs="맑은 고딕"/>
           <w:sz w:val="21"/>
         </w:rPr>
         <w:t>개인정보 보호법 및 정보통신망법 등 국내 관련 법령 준수.</w:t>
@@ -4050,7 +4050,7 @@
       </w:pPr>
       <w:r>
         <w:rPr>
-          <w:rFonts w:ascii="Apple SD Gothic Neo" w:hAnsi="Apple SD Gothic Neo" w:eastAsia="Apple SD Gothic Neo" w:cs="Apple SD Gothic Neo"/>
+          <w:rFonts w:ascii="맑은 고딕" w:hAnsi="맑은 고딕" w:eastAsia="맑은 고딕" w:cs="맑은 고딕"/>
           <w:sz w:val="21"/>
         </w:rPr>
         <w:t>개인정보는 저장 및 전송 시 모두 암호화 (저장 시 AES-256, 전송 시 TLS 1.2 이상).</w:t>
@@ -4063,7 +4063,7 @@
       </w:pPr>
       <w:r>
         <w:rPr>
-          <w:rFonts w:ascii="Apple SD Gothic Neo" w:hAnsi="Apple SD Gothic Neo" w:eastAsia="Apple SD Gothic Neo" w:cs="Apple SD Gothic Neo"/>
+          <w:rFonts w:ascii="맑은 고딕" w:hAnsi="맑은 고딕" w:eastAsia="맑은 고딕" w:cs="맑은 고딕"/>
           <w:sz w:val="21"/>
         </w:rPr>
         <w:t>기본적인 웹 보안 점검(OWASP Top 10 등) 검토.</w:t>
@@ -4076,7 +4076,7 @@
       </w:pPr>
       <w:r>
         <w:rPr>
-          <w:rFonts w:ascii="Apple SD Gothic Neo" w:hAnsi="Apple SD Gothic Neo" w:eastAsia="Apple SD Gothic Neo" w:cs="Apple SD Gothic Neo"/>
+          <w:rFonts w:ascii="맑은 고딕" w:hAnsi="맑은 고딕" w:eastAsia="맑은 고딕" w:cs="맑은 고딕"/>
           <w:sz w:val="21"/>
         </w:rPr>
         <w:t>결제 정보는 PG사를 통한 처리만 허용하며, 카드번호 등 민감 결제정보를 자체 저장하지 아니함 (PCI-DSS 회피).</w:t>
@@ -4089,7 +4089,7 @@
       </w:pPr>
       <w:r>
         <w:rPr>
-          <w:rFonts w:ascii="Apple SD Gothic Neo" w:hAnsi="Apple SD Gothic Neo" w:eastAsia="Apple SD Gothic Neo" w:cs="Apple SD Gothic Neo"/>
+          <w:rFonts w:ascii="맑은 고딕" w:hAnsi="맑은 고딕" w:eastAsia="맑은 고딕" w:cs="맑은 고딕"/>
           <w:sz w:val="21"/>
         </w:rPr>
         <w:t>BLE UUID는 회차별 암호화 회전(rotation)을 통해 재생 공격(replay attack) 방지.</w:t>
@@ -4102,7 +4102,7 @@
       </w:pPr>
       <w:r>
         <w:rPr>
-          <w:rFonts w:ascii="Apple SD Gothic Neo" w:hAnsi="Apple SD Gothic Neo" w:eastAsia="Apple SD Gothic Neo" w:cs="Apple SD Gothic Neo"/>
+          <w:rFonts w:ascii="맑은 고딕" w:hAnsi="맑은 고딕" w:eastAsia="맑은 고딕" w:cs="맑은 고딕"/>
           <w:sz w:val="21"/>
         </w:rPr>
         <w:t>관리자 주요 액션에 대한 감사로그 기록.</w:t>
@@ -4115,7 +4115,7 @@
       </w:pPr>
       <w:r>
         <w:rPr>
-          <w:rFonts w:ascii="Apple SD Gothic Neo" w:hAnsi="Apple SD Gothic Neo" w:eastAsia="Apple SD Gothic Neo" w:cs="Apple SD Gothic Neo"/>
+          <w:rFonts w:ascii="맑은 고딕" w:hAnsi="맑은 고딕" w:eastAsia="맑은 고딕" w:cs="맑은 고딕"/>
           <w:b/>
           <w:color w:val="2E75B6"/>
           <w:sz w:val="25"/>
@@ -4130,7 +4130,7 @@
       </w:pPr>
       <w:r>
         <w:rPr>
-          <w:rFonts w:ascii="Apple SD Gothic Neo" w:hAnsi="Apple SD Gothic Neo" w:eastAsia="Apple SD Gothic Neo" w:cs="Apple SD Gothic Neo"/>
+          <w:rFonts w:ascii="맑은 고딕" w:hAnsi="맑은 고딕" w:eastAsia="맑은 고딕" w:cs="맑은 고딕"/>
           <w:sz w:val="21"/>
         </w:rPr>
         <w:t>P2/P3 기능(채팅, AI 추천 등)이 본 아키텍처에서 모듈 추가 형태로 확장 가능해야 함.</w:t>
@@ -4143,7 +4143,7 @@
       </w:pPr>
       <w:r>
         <w:rPr>
-          <w:rFonts w:ascii="Apple SD Gothic Neo" w:hAnsi="Apple SD Gothic Neo" w:eastAsia="Apple SD Gothic Neo" w:cs="Apple SD Gothic Neo"/>
+          <w:rFonts w:ascii="맑은 고딕" w:hAnsi="맑은 고딕" w:eastAsia="맑은 고딕" w:cs="맑은 고딕"/>
           <w:sz w:val="21"/>
         </w:rPr>
         <w:t>코드 품질: 일반적인 코딩 표준 준수, 핵심 비즈니스 로직 동작 검증.</w:t>
@@ -4156,7 +4156,7 @@
       </w:pPr>
       <w:r>
         <w:rPr>
-          <w:rFonts w:ascii="Apple SD Gothic Neo" w:hAnsi="Apple SD Gothic Neo" w:eastAsia="Apple SD Gothic Neo" w:cs="Apple SD Gothic Neo"/>
+          <w:rFonts w:ascii="맑은 고딕" w:hAnsi="맑은 고딕" w:eastAsia="맑은 고딕" w:cs="맑은 고딕"/>
           <w:sz w:val="21"/>
         </w:rPr>
         <w:t>문서화: API 명세서(OpenAPI/Swagger), 운영 매뉴얼, 장애 대응 가이드 제공.</w:t>
@@ -4169,7 +4169,7 @@
       </w:pPr>
       <w:r>
         <w:rPr>
-          <w:rFonts w:ascii="Apple SD Gothic Neo" w:hAnsi="Apple SD Gothic Neo" w:eastAsia="Apple SD Gothic Neo" w:cs="Apple SD Gothic Neo"/>
+          <w:rFonts w:ascii="맑은 고딕" w:hAnsi="맑은 고딕" w:eastAsia="맑은 고딕" w:cs="맑은 고딕"/>
           <w:b/>
           <w:color w:val="2E75B6"/>
           <w:sz w:val="25"/>
@@ -4184,7 +4184,7 @@
       </w:pPr>
       <w:r>
         <w:rPr>
-          <w:rFonts w:ascii="Apple SD Gothic Neo" w:hAnsi="Apple SD Gothic Neo" w:eastAsia="Apple SD Gothic Neo" w:cs="Apple SD Gothic Neo"/>
+          <w:rFonts w:ascii="맑은 고딕" w:hAnsi="맑은 고딕" w:eastAsia="맑은 고딕" w:cs="맑은 고딕"/>
           <w:sz w:val="21"/>
         </w:rPr>
         <w:t>앱: iOS 14+ / Android 8.0+ 최신 2개 메이저 OS 버전 정상 동작 보장.</w:t>
@@ -4197,7 +4197,7 @@
       </w:pPr>
       <w:r>
         <w:rPr>
-          <w:rFonts w:ascii="Apple SD Gothic Neo" w:hAnsi="Apple SD Gothic Neo" w:eastAsia="Apple SD Gothic Neo" w:cs="Apple SD Gothic Neo"/>
+          <w:rFonts w:ascii="맑은 고딕" w:hAnsi="맑은 고딕" w:eastAsia="맑은 고딕" w:cs="맑은 고딕"/>
           <w:sz w:val="21"/>
         </w:rPr>
         <w:t>웹: Chrome, Safari 최신 2개 버전 정상 동작.</w:t>
@@ -4210,7 +4210,7 @@
       </w:pPr>
       <w:r>
         <w:rPr>
-          <w:rFonts w:ascii="Apple SD Gothic Neo" w:hAnsi="Apple SD Gothic Neo" w:eastAsia="Apple SD Gothic Neo" w:cs="Apple SD Gothic Neo"/>
+          <w:rFonts w:ascii="맑은 고딕" w:hAnsi="맑은 고딕" w:eastAsia="맑은 고딕" w:cs="맑은 고딕"/>
           <w:sz w:val="21"/>
         </w:rPr>
         <w:t>국내 KISA 보안 표준 권고사항 준수.</w:t>
@@ -4228,7 +4228,7 @@
       </w:pPr>
       <w:r>
         <w:rPr>
-          <w:rFonts w:ascii="Apple SD Gothic Neo" w:hAnsi="Apple SD Gothic Neo" w:eastAsia="Apple SD Gothic Neo" w:cs="Apple SD Gothic Neo"/>
+          <w:rFonts w:ascii="맑은 고딕" w:hAnsi="맑은 고딕" w:eastAsia="맑은 고딕" w:cs="맑은 고딕"/>
           <w:b/>
           <w:color w:val="1F4E78"/>
           <w:sz w:val="30"/>
@@ -4242,7 +4242,7 @@
       </w:pPr>
       <w:r>
         <w:rPr>
-          <w:rFonts w:ascii="Apple SD Gothic Neo" w:hAnsi="Apple SD Gothic Neo" w:eastAsia="Apple SD Gothic Neo" w:cs="Apple SD Gothic Neo"/>
+          <w:rFonts w:ascii="맑은 고딕" w:hAnsi="맑은 고딕" w:eastAsia="맑은 고딕" w:cs="맑은 고딕"/>
           <w:b w:val="0"/>
           <w:i w:val="0"/>
           <w:sz w:val="22"/>
@@ -4257,7 +4257,7 @@
       </w:pPr>
       <w:r>
         <w:rPr>
-          <w:rFonts w:ascii="Apple SD Gothic Neo" w:hAnsi="Apple SD Gothic Neo" w:eastAsia="Apple SD Gothic Neo" w:cs="Apple SD Gothic Neo"/>
+          <w:rFonts w:ascii="맑은 고딕" w:hAnsi="맑은 고딕" w:eastAsia="맑은 고딕" w:cs="맑은 고딕"/>
           <w:b/>
           <w:color w:val="2E75B6"/>
           <w:sz w:val="25"/>
@@ -4272,7 +4272,7 @@
       </w:pPr>
       <w:r>
         <w:rPr>
-          <w:rFonts w:ascii="Apple SD Gothic Neo" w:hAnsi="Apple SD Gothic Neo" w:eastAsia="Apple SD Gothic Neo" w:cs="Apple SD Gothic Neo"/>
+          <w:rFonts w:ascii="맑은 고딕" w:hAnsi="맑은 고딕" w:eastAsia="맑은 고딕" w:cs="맑은 고딕"/>
           <w:sz w:val="21"/>
         </w:rPr>
         <w:t>요구사항 정의서 (확정본)</w:t>
@@ -4285,7 +4285,7 @@
       </w:pPr>
       <w:r>
         <w:rPr>
-          <w:rFonts w:ascii="Apple SD Gothic Neo" w:hAnsi="Apple SD Gothic Neo" w:eastAsia="Apple SD Gothic Neo" w:cs="Apple SD Gothic Neo"/>
+          <w:rFonts w:ascii="맑은 고딕" w:hAnsi="맑은 고딕" w:eastAsia="맑은 고딕" w:cs="맑은 고딕"/>
           <w:sz w:val="21"/>
         </w:rPr>
         <w:t>화면 정의서 (Storyboard)</w:t>
@@ -4298,7 +4298,7 @@
       </w:pPr>
       <w:r>
         <w:rPr>
-          <w:rFonts w:ascii="Apple SD Gothic Neo" w:hAnsi="Apple SD Gothic Neo" w:eastAsia="Apple SD Gothic Neo" w:cs="Apple SD Gothic Neo"/>
+          <w:rFonts w:ascii="맑은 고딕" w:hAnsi="맑은 고딕" w:eastAsia="맑은 고딕" w:cs="맑은 고딕"/>
           <w:sz w:val="21"/>
         </w:rPr>
         <w:t>DB 설계서 (ERD 포함)</w:t>
@@ -4311,7 +4311,7 @@
       </w:pPr>
       <w:r>
         <w:rPr>
-          <w:rFonts w:ascii="Apple SD Gothic Neo" w:hAnsi="Apple SD Gothic Neo" w:eastAsia="Apple SD Gothic Neo" w:cs="Apple SD Gothic Neo"/>
+          <w:rFonts w:ascii="맑은 고딕" w:hAnsi="맑은 고딕" w:eastAsia="맑은 고딕" w:cs="맑은 고딕"/>
           <w:sz w:val="21"/>
         </w:rPr>
         <w:t>API 명세서 (OpenAPI/Swagger 형식)</w:t>
@@ -4324,7 +4324,7 @@
       </w:pPr>
       <w:r>
         <w:rPr>
-          <w:rFonts w:ascii="Apple SD Gothic Neo" w:hAnsi="Apple SD Gothic Neo" w:eastAsia="Apple SD Gothic Neo" w:cs="Apple SD Gothic Neo"/>
+          <w:rFonts w:ascii="맑은 고딕" w:hAnsi="맑은 고딕" w:eastAsia="맑은 고딕" w:cs="맑은 고딕"/>
           <w:sz w:val="21"/>
         </w:rPr>
         <w:t>BLE 핸드셰이크 프로토콜 설계서</w:t>
@@ -4337,7 +4337,7 @@
       </w:pPr>
       <w:r>
         <w:rPr>
-          <w:rFonts w:ascii="Apple SD Gothic Neo" w:hAnsi="Apple SD Gothic Neo" w:eastAsia="Apple SD Gothic Neo" w:cs="Apple SD Gothic Neo"/>
+          <w:rFonts w:ascii="맑은 고딕" w:hAnsi="맑은 고딕" w:eastAsia="맑은 고딕" w:cs="맑은 고딕"/>
           <w:sz w:val="21"/>
         </w:rPr>
         <w:t>시스템 아키텍처 설계서</w:t>
@@ -4350,7 +4350,7 @@
       </w:pPr>
       <w:r>
         <w:rPr>
-          <w:rFonts w:ascii="Apple SD Gothic Neo" w:hAnsi="Apple SD Gothic Neo" w:eastAsia="Apple SD Gothic Neo" w:cs="Apple SD Gothic Neo"/>
+          <w:rFonts w:ascii="맑은 고딕" w:hAnsi="맑은 고딕" w:eastAsia="맑은 고딕" w:cs="맑은 고딕"/>
           <w:b/>
           <w:color w:val="2E75B6"/>
           <w:sz w:val="25"/>
@@ -4365,7 +4365,7 @@
       </w:pPr>
       <w:r>
         <w:rPr>
-          <w:rFonts w:ascii="Apple SD Gothic Neo" w:hAnsi="Apple SD Gothic Neo" w:eastAsia="Apple SD Gothic Neo" w:cs="Apple SD Gothic Neo"/>
+          <w:rFonts w:ascii="맑은 고딕" w:hAnsi="맑은 고딕" w:eastAsia="맑은 고딕" w:cs="맑은 고딕"/>
           <w:sz w:val="21"/>
         </w:rPr>
         <w:t>UI 디자인 원본 (Figma 또는 동급, 발주처 계정으로 이관)</w:t>
@@ -4378,7 +4378,7 @@
       </w:pPr>
       <w:r>
         <w:rPr>
-          <w:rFonts w:ascii="Apple SD Gothic Neo" w:hAnsi="Apple SD Gothic Neo" w:eastAsia="Apple SD Gothic Neo" w:cs="Apple SD Gothic Neo"/>
+          <w:rFonts w:ascii="맑은 고딕" w:hAnsi="맑은 고딕" w:eastAsia="맑은 고딕" w:cs="맑은 고딕"/>
           <w:sz w:val="21"/>
         </w:rPr>
         <w:t>디자인 시스템(컴포넌트 라이브러리) 문서</w:t>
@@ -4391,7 +4391,7 @@
       </w:pPr>
       <w:r>
         <w:rPr>
-          <w:rFonts w:ascii="Apple SD Gothic Neo" w:hAnsi="Apple SD Gothic Neo" w:eastAsia="Apple SD Gothic Neo" w:cs="Apple SD Gothic Neo"/>
+          <w:rFonts w:ascii="맑은 고딕" w:hAnsi="맑은 고딕" w:eastAsia="맑은 고딕" w:cs="맑은 고딕"/>
           <w:sz w:val="21"/>
         </w:rPr>
         <w:t>앱 아이콘, 스플래시, 마케팅 키비주얼 (소스파일 포함)</w:t>
@@ -4404,7 +4404,7 @@
       </w:pPr>
       <w:r>
         <w:rPr>
-          <w:rFonts w:ascii="Apple SD Gothic Neo" w:hAnsi="Apple SD Gothic Neo" w:eastAsia="Apple SD Gothic Neo" w:cs="Apple SD Gothic Neo"/>
+          <w:rFonts w:ascii="맑은 고딕" w:hAnsi="맑은 고딕" w:eastAsia="맑은 고딕" w:cs="맑은 고딕"/>
           <w:b/>
           <w:color w:val="2E75B6"/>
           <w:sz w:val="25"/>
@@ -4419,7 +4419,7 @@
       </w:pPr>
       <w:r>
         <w:rPr>
-          <w:rFonts w:ascii="Apple SD Gothic Neo" w:hAnsi="Apple SD Gothic Neo" w:eastAsia="Apple SD Gothic Neo" w:cs="Apple SD Gothic Neo"/>
+          <w:rFonts w:ascii="맑은 고딕" w:hAnsi="맑은 고딕" w:eastAsia="맑은 고딕" w:cs="맑은 고딕"/>
           <w:sz w:val="21"/>
         </w:rPr>
         <w:t>전체 소스코드 (Git 저장소, 발주처 계정으로 이관)</w:t>
@@ -4432,7 +4432,7 @@
       </w:pPr>
       <w:r>
         <w:rPr>
-          <w:rFonts w:ascii="Apple SD Gothic Neo" w:hAnsi="Apple SD Gothic Neo" w:eastAsia="Apple SD Gothic Neo" w:cs="Apple SD Gothic Neo"/>
+          <w:rFonts w:ascii="맑은 고딕" w:hAnsi="맑은 고딕" w:eastAsia="맑은 고딕" w:cs="맑은 고딕"/>
           <w:sz w:val="21"/>
         </w:rPr>
         <w:t>빌드 가능한 형태의 프로젝트 (의존성 명세, 빌드 가이드 포함)</w:t>
@@ -4445,7 +4445,7 @@
       </w:pPr>
       <w:r>
         <w:rPr>
-          <w:rFonts w:ascii="Apple SD Gothic Neo" w:hAnsi="Apple SD Gothic Neo" w:eastAsia="Apple SD Gothic Neo" w:cs="Apple SD Gothic Neo"/>
+          <w:rFonts w:ascii="맑은 고딕" w:hAnsi="맑은 고딕" w:eastAsia="맑은 고딕" w:cs="맑은 고딕"/>
           <w:sz w:val="21"/>
         </w:rPr>
         <w:t>앱 설치파일 (iOS .ipa, Android .aab/.apk)</w:t>
@@ -4458,7 +4458,7 @@
       </w:pPr>
       <w:r>
         <w:rPr>
-          <w:rFonts w:ascii="Apple SD Gothic Neo" w:hAnsi="Apple SD Gothic Neo" w:eastAsia="Apple SD Gothic Neo" w:cs="Apple SD Gothic Neo"/>
+          <w:rFonts w:ascii="맑은 고딕" w:hAnsi="맑은 고딕" w:eastAsia="맑은 고딕" w:cs="맑은 고딕"/>
           <w:sz w:val="21"/>
         </w:rPr>
         <w:t>비콘 펌웨어 바이너리 및 소스코드</w:t>
@@ -4471,7 +4471,7 @@
       </w:pPr>
       <w:r>
         <w:rPr>
-          <w:rFonts w:ascii="Apple SD Gothic Neo" w:hAnsi="Apple SD Gothic Neo" w:eastAsia="Apple SD Gothic Neo" w:cs="Apple SD Gothic Neo"/>
+          <w:rFonts w:ascii="맑은 고딕" w:hAnsi="맑은 고딕" w:eastAsia="맑은 고딕" w:cs="맑은 고딕"/>
           <w:sz w:val="21"/>
         </w:rPr>
         <w:t>배포 스크립트 (CI/CD 파이프라인 정의)</w:t>
@@ -4484,7 +4484,7 @@
       </w:pPr>
       <w:r>
         <w:rPr>
-          <w:rFonts w:ascii="Apple SD Gothic Neo" w:hAnsi="Apple SD Gothic Neo" w:eastAsia="Apple SD Gothic Neo" w:cs="Apple SD Gothic Neo"/>
+          <w:rFonts w:ascii="맑은 고딕" w:hAnsi="맑은 고딕" w:eastAsia="맑은 고딕" w:cs="맑은 고딕"/>
           <w:b/>
           <w:color w:val="2E75B6"/>
           <w:sz w:val="25"/>
@@ -4499,7 +4499,7 @@
       </w:pPr>
       <w:r>
         <w:rPr>
-          <w:rFonts w:ascii="Apple SD Gothic Neo" w:hAnsi="Apple SD Gothic Neo" w:eastAsia="Apple SD Gothic Neo" w:cs="Apple SD Gothic Neo"/>
+          <w:rFonts w:ascii="맑은 고딕" w:hAnsi="맑은 고딕" w:eastAsia="맑은 고딕" w:cs="맑은 고딕"/>
           <w:sz w:val="21"/>
         </w:rPr>
         <w:t>운영 매뉴얼 (관리자용, SP용)</w:t>
@@ -4512,7 +4512,7 @@
       </w:pPr>
       <w:r>
         <w:rPr>
-          <w:rFonts w:ascii="Apple SD Gothic Neo" w:hAnsi="Apple SD Gothic Neo" w:eastAsia="Apple SD Gothic Neo" w:cs="Apple SD Gothic Neo"/>
+          <w:rFonts w:ascii="맑은 고딕" w:hAnsi="맑은 고딕" w:eastAsia="맑은 고딕" w:cs="맑은 고딕"/>
           <w:sz w:val="21"/>
         </w:rPr>
         <w:t>장애 대응 가이드</w:t>
@@ -4525,7 +4525,7 @@
       </w:pPr>
       <w:r>
         <w:rPr>
-          <w:rFonts w:ascii="Apple SD Gothic Neo" w:hAnsi="Apple SD Gothic Neo" w:eastAsia="Apple SD Gothic Neo" w:cs="Apple SD Gothic Neo"/>
+          <w:rFonts w:ascii="맑은 고딕" w:hAnsi="맑은 고딕" w:eastAsia="맑은 고딕" w:cs="맑은 고딕"/>
           <w:sz w:val="21"/>
         </w:rPr>
         <w:t>개인정보 처리방침 초안 및 약관 초안 (법무 검토는 발주처 책임)</w:t>
@@ -4538,7 +4538,7 @@
       </w:pPr>
       <w:r>
         <w:rPr>
-          <w:rFonts w:ascii="Apple SD Gothic Neo" w:hAnsi="Apple SD Gothic Neo" w:eastAsia="Apple SD Gothic Neo" w:cs="Apple SD Gothic Neo"/>
+          <w:rFonts w:ascii="맑은 고딕" w:hAnsi="맑은 고딕" w:eastAsia="맑은 고딕" w:cs="맑은 고딕"/>
           <w:sz w:val="21"/>
         </w:rPr>
         <w:t>최종 결과보고서</w:t>
@@ -4551,7 +4551,7 @@
       </w:pPr>
       <w:r>
         <w:rPr>
-          <w:rFonts w:ascii="Apple SD Gothic Neo" w:hAnsi="Apple SD Gothic Neo" w:eastAsia="Apple SD Gothic Neo" w:cs="Apple SD Gothic Neo"/>
+          <w:rFonts w:ascii="맑은 고딕" w:hAnsi="맑은 고딕" w:eastAsia="맑은 고딕" w:cs="맑은 고딕"/>
           <w:b/>
           <w:color w:val="2E75B6"/>
           <w:sz w:val="25"/>
@@ -4566,7 +4566,7 @@
       </w:pPr>
       <w:r>
         <w:rPr>
-          <w:rFonts w:ascii="Apple SD Gothic Neo" w:hAnsi="Apple SD Gothic Neo" w:eastAsia="Apple SD Gothic Neo" w:cs="Apple SD Gothic Neo"/>
+          <w:rFonts w:ascii="맑은 고딕" w:hAnsi="맑은 고딕" w:eastAsia="맑은 고딕" w:cs="맑은 고딕"/>
           <w:sz w:val="21"/>
         </w:rPr>
         <w:t>모든 산출물은 한국어로 작성 (국제표준 약어/용어는 영문 허용).</w:t>
@@ -4579,7 +4579,7 @@
       </w:pPr>
       <w:r>
         <w:rPr>
-          <w:rFonts w:ascii="Apple SD Gothic Neo" w:hAnsi="Apple SD Gothic Neo" w:eastAsia="Apple SD Gothic Neo" w:cs="Apple SD Gothic Neo"/>
+          <w:rFonts w:ascii="맑은 고딕" w:hAnsi="맑은 고딕" w:eastAsia="맑은 고딕" w:cs="맑은 고딕"/>
           <w:sz w:val="21"/>
         </w:rPr>
         <w:t>문서: PDF + 원본(Word, Excel, Figma 등) 동시 납품.</w:t>
@@ -4592,7 +4592,7 @@
       </w:pPr>
       <w:r>
         <w:rPr>
-          <w:rFonts w:ascii="Apple SD Gothic Neo" w:hAnsi="Apple SD Gothic Neo" w:eastAsia="Apple SD Gothic Neo" w:cs="Apple SD Gothic Neo"/>
+          <w:rFonts w:ascii="맑은 고딕" w:hAnsi="맑은 고딕" w:eastAsia="맑은 고딕" w:cs="맑은 고딕"/>
           <w:sz w:val="21"/>
         </w:rPr>
         <w:t>코드/디자인: 발주처 지정 저장소 계정으로 이관 완료한 시점을 인도일로 본다.</w:t>
@@ -4610,7 +4610,7 @@
       </w:pPr>
       <w:r>
         <w:rPr>
-          <w:rFonts w:ascii="Apple SD Gothic Neo" w:hAnsi="Apple SD Gothic Neo" w:eastAsia="Apple SD Gothic Neo" w:cs="Apple SD Gothic Neo"/>
+          <w:rFonts w:ascii="맑은 고딕" w:hAnsi="맑은 고딕" w:eastAsia="맑은 고딕" w:cs="맑은 고딕"/>
           <w:b/>
           <w:color w:val="1F4E78"/>
           <w:sz w:val="30"/>
@@ -4625,7 +4625,7 @@
       </w:pPr>
       <w:r>
         <w:rPr>
-          <w:rFonts w:ascii="Apple SD Gothic Neo" w:hAnsi="Apple SD Gothic Neo" w:eastAsia="Apple SD Gothic Neo" w:cs="Apple SD Gothic Neo"/>
+          <w:rFonts w:ascii="맑은 고딕" w:hAnsi="맑은 고딕" w:eastAsia="맑은 고딕" w:cs="맑은 고딕"/>
           <w:b/>
           <w:color w:val="2E75B6"/>
           <w:sz w:val="25"/>
@@ -4640,7 +4640,7 @@
       </w:pPr>
       <w:r>
         <w:rPr>
-          <w:rFonts w:ascii="Apple SD Gothic Neo" w:hAnsi="Apple SD Gothic Neo" w:eastAsia="Apple SD Gothic Neo" w:cs="Apple SD Gothic Neo"/>
+          <w:rFonts w:ascii="맑은 고딕" w:hAnsi="맑은 고딕" w:eastAsia="맑은 고딕" w:cs="맑은 고딕"/>
           <w:sz w:val="21"/>
         </w:rPr>
         <w:t>단계별 검수 + 최종 검수의 이중 검수 체계로 운영한다.</w:t>
@@ -4653,7 +4653,7 @@
       </w:pPr>
       <w:r>
         <w:rPr>
-          <w:rFonts w:ascii="Apple SD Gothic Neo" w:hAnsi="Apple SD Gothic Neo" w:eastAsia="Apple SD Gothic Neo" w:cs="Apple SD Gothic Neo"/>
+          <w:rFonts w:ascii="맑은 고딕" w:hAnsi="맑은 고딕" w:eastAsia="맑은 고딕" w:cs="맑은 고딕"/>
           <w:sz w:val="21"/>
         </w:rPr>
         <w:t>각 단계 종료 시 발주측 PM의 서면 승인을 받아야 다음 단계로 진행한다.</w:t>
@@ -4666,7 +4666,7 @@
       </w:pPr>
       <w:r>
         <w:rPr>
-          <w:rFonts w:ascii="Apple SD Gothic Neo" w:hAnsi="Apple SD Gothic Neo" w:eastAsia="Apple SD Gothic Neo" w:cs="Apple SD Gothic Neo"/>
+          <w:rFonts w:ascii="맑은 고딕" w:hAnsi="맑은 고딕" w:eastAsia="맑은 고딕" w:cs="맑은 고딕"/>
           <w:sz w:val="21"/>
         </w:rPr>
         <w:t>최종 검수는 발주처 인수테스트(UAT) 통과 시점을 기준으로 한다.</w:t>
@@ -4679,7 +4679,7 @@
       </w:pPr>
       <w:r>
         <w:rPr>
-          <w:rFonts w:ascii="Apple SD Gothic Neo" w:hAnsi="Apple SD Gothic Neo" w:eastAsia="Apple SD Gothic Neo" w:cs="Apple SD Gothic Neo"/>
+          <w:rFonts w:ascii="맑은 고딕" w:hAnsi="맑은 고딕" w:eastAsia="맑은 고딕" w:cs="맑은 고딕"/>
           <w:b/>
           <w:color w:val="2E75B6"/>
           <w:sz w:val="25"/>
@@ -4713,7 +4713,7 @@
             <w:r/>
             <w:r>
               <w:rPr>
-                <w:rFonts w:ascii="Apple SD Gothic Neo" w:hAnsi="Apple SD Gothic Neo" w:eastAsia="Apple SD Gothic Neo" w:cs="Apple SD Gothic Neo"/>
+                <w:rFonts w:ascii="맑은 고딕" w:hAnsi="맑은 고딕" w:eastAsia="맑은 고딕" w:cs="맑은 고딕"/>
                 <w:b/>
                 <w:color w:val="FFFFFF"/>
                 <w:sz w:val="21"/>
@@ -4736,7 +4736,7 @@
             <w:r/>
             <w:r>
               <w:rPr>
-                <w:rFonts w:ascii="Apple SD Gothic Neo" w:hAnsi="Apple SD Gothic Neo" w:eastAsia="Apple SD Gothic Neo" w:cs="Apple SD Gothic Neo"/>
+                <w:rFonts w:ascii="맑은 고딕" w:hAnsi="맑은 고딕" w:eastAsia="맑은 고딕" w:cs="맑은 고딕"/>
                 <w:b/>
                 <w:color w:val="FFFFFF"/>
                 <w:sz w:val="21"/>
@@ -4760,7 +4760,7 @@
             <w:r/>
             <w:r>
               <w:rPr>
-                <w:rFonts w:ascii="Apple SD Gothic Neo" w:hAnsi="Apple SD Gothic Neo" w:eastAsia="Apple SD Gothic Neo" w:cs="Apple SD Gothic Neo"/>
+                <w:rFonts w:ascii="맑은 고딕" w:hAnsi="맑은 고딕" w:eastAsia="맑은 고딕" w:cs="맑은 고딕"/>
                 <w:b w:val="0"/>
                 <w:sz w:val="20"/>
               </w:rPr>
@@ -4781,7 +4781,7 @@
             <w:r/>
             <w:r>
               <w:rPr>
-                <w:rFonts w:ascii="Apple SD Gothic Neo" w:hAnsi="Apple SD Gothic Neo" w:eastAsia="Apple SD Gothic Neo" w:cs="Apple SD Gothic Neo"/>
+                <w:rFonts w:ascii="맑은 고딕" w:hAnsi="맑은 고딕" w:eastAsia="맑은 고딕" w:cs="맑은 고딕"/>
                 <w:b w:val="0"/>
                 <w:sz w:val="20"/>
               </w:rPr>
@@ -4805,7 +4805,7 @@
             <w:r/>
             <w:r>
               <w:rPr>
-                <w:rFonts w:ascii="Apple SD Gothic Neo" w:hAnsi="Apple SD Gothic Neo" w:eastAsia="Apple SD Gothic Neo" w:cs="Apple SD Gothic Neo"/>
+                <w:rFonts w:ascii="맑은 고딕" w:hAnsi="맑은 고딕" w:eastAsia="맑은 고딕" w:cs="맑은 고딕"/>
                 <w:b w:val="0"/>
                 <w:sz w:val="20"/>
               </w:rPr>
@@ -4827,7 +4827,7 @@
             <w:r/>
             <w:r>
               <w:rPr>
-                <w:rFonts w:ascii="Apple SD Gothic Neo" w:hAnsi="Apple SD Gothic Neo" w:eastAsia="Apple SD Gothic Neo" w:cs="Apple SD Gothic Neo"/>
+                <w:rFonts w:ascii="맑은 고딕" w:hAnsi="맑은 고딕" w:eastAsia="맑은 고딕" w:cs="맑은 고딕"/>
                 <w:b w:val="0"/>
                 <w:sz w:val="20"/>
               </w:rPr>
@@ -4850,7 +4850,7 @@
             <w:r/>
             <w:r>
               <w:rPr>
-                <w:rFonts w:ascii="Apple SD Gothic Neo" w:hAnsi="Apple SD Gothic Neo" w:eastAsia="Apple SD Gothic Neo" w:cs="Apple SD Gothic Neo"/>
+                <w:rFonts w:ascii="맑은 고딕" w:hAnsi="맑은 고딕" w:eastAsia="맑은 고딕" w:cs="맑은 고딕"/>
                 <w:b w:val="0"/>
                 <w:sz w:val="20"/>
               </w:rPr>
@@ -4871,7 +4871,7 @@
             <w:r/>
             <w:r>
               <w:rPr>
-                <w:rFonts w:ascii="Apple SD Gothic Neo" w:hAnsi="Apple SD Gothic Neo" w:eastAsia="Apple SD Gothic Neo" w:cs="Apple SD Gothic Neo"/>
+                <w:rFonts w:ascii="맑은 고딕" w:hAnsi="맑은 고딕" w:eastAsia="맑은 고딕" w:cs="맑은 고딕"/>
                 <w:b w:val="0"/>
                 <w:sz w:val="20"/>
               </w:rPr>
@@ -4895,7 +4895,7 @@
             <w:r/>
             <w:r>
               <w:rPr>
-                <w:rFonts w:ascii="Apple SD Gothic Neo" w:hAnsi="Apple SD Gothic Neo" w:eastAsia="Apple SD Gothic Neo" w:cs="Apple SD Gothic Neo"/>
+                <w:rFonts w:ascii="맑은 고딕" w:hAnsi="맑은 고딕" w:eastAsia="맑은 고딕" w:cs="맑은 고딕"/>
                 <w:b w:val="0"/>
                 <w:sz w:val="20"/>
               </w:rPr>
@@ -4917,7 +4917,7 @@
             <w:r/>
             <w:r>
               <w:rPr>
-                <w:rFonts w:ascii="Apple SD Gothic Neo" w:hAnsi="Apple SD Gothic Neo" w:eastAsia="Apple SD Gothic Neo" w:cs="Apple SD Gothic Neo"/>
+                <w:rFonts w:ascii="맑은 고딕" w:hAnsi="맑은 고딕" w:eastAsia="맑은 고딕" w:cs="맑은 고딕"/>
                 <w:b w:val="0"/>
                 <w:sz w:val="20"/>
               </w:rPr>
@@ -4940,7 +4940,7 @@
             <w:r/>
             <w:r>
               <w:rPr>
-                <w:rFonts w:ascii="Apple SD Gothic Neo" w:hAnsi="Apple SD Gothic Neo" w:eastAsia="Apple SD Gothic Neo" w:cs="Apple SD Gothic Neo"/>
+                <w:rFonts w:ascii="맑은 고딕" w:hAnsi="맑은 고딕" w:eastAsia="맑은 고딕" w:cs="맑은 고딕"/>
                 <w:b w:val="0"/>
                 <w:sz w:val="20"/>
               </w:rPr>
@@ -4961,7 +4961,7 @@
             <w:r/>
             <w:r>
               <w:rPr>
-                <w:rFonts w:ascii="Apple SD Gothic Neo" w:hAnsi="Apple SD Gothic Neo" w:eastAsia="Apple SD Gothic Neo" w:cs="Apple SD Gothic Neo"/>
+                <w:rFonts w:ascii="맑은 고딕" w:hAnsi="맑은 고딕" w:eastAsia="맑은 고딕" w:cs="맑은 고딕"/>
                 <w:b w:val="0"/>
                 <w:sz w:val="20"/>
               </w:rPr>
@@ -4977,7 +4977,7 @@
       </w:pPr>
       <w:r>
         <w:rPr>
-          <w:rFonts w:ascii="Apple SD Gothic Neo" w:hAnsi="Apple SD Gothic Neo" w:eastAsia="Apple SD Gothic Neo" w:cs="Apple SD Gothic Neo"/>
+          <w:rFonts w:ascii="맑은 고딕" w:hAnsi="맑은 고딕" w:eastAsia="맑은 고딕" w:cs="맑은 고딕"/>
           <w:b w:val="0"/>
           <w:i w:val="0"/>
           <w:sz w:val="2"/>
@@ -4991,7 +4991,7 @@
       </w:pPr>
       <w:r>
         <w:rPr>
-          <w:rFonts w:ascii="Apple SD Gothic Neo" w:hAnsi="Apple SD Gothic Neo" w:eastAsia="Apple SD Gothic Neo" w:cs="Apple SD Gothic Neo"/>
+          <w:rFonts w:ascii="맑은 고딕" w:hAnsi="맑은 고딕" w:eastAsia="맑은 고딕" w:cs="맑은 고딕"/>
           <w:b/>
           <w:color w:val="2E75B6"/>
           <w:sz w:val="25"/>
@@ -5025,7 +5025,7 @@
             <w:r/>
             <w:r>
               <w:rPr>
-                <w:rFonts w:ascii="Apple SD Gothic Neo" w:hAnsi="Apple SD Gothic Neo" w:eastAsia="Apple SD Gothic Neo" w:cs="Apple SD Gothic Neo"/>
+                <w:rFonts w:ascii="맑은 고딕" w:hAnsi="맑은 고딕" w:eastAsia="맑은 고딕" w:cs="맑은 고딕"/>
                 <w:b/>
                 <w:color w:val="FFFFFF"/>
                 <w:sz w:val="21"/>
@@ -5048,7 +5048,7 @@
             <w:r/>
             <w:r>
               <w:rPr>
-                <w:rFonts w:ascii="Apple SD Gothic Neo" w:hAnsi="Apple SD Gothic Neo" w:eastAsia="Apple SD Gothic Neo" w:cs="Apple SD Gothic Neo"/>
+                <w:rFonts w:ascii="맑은 고딕" w:hAnsi="맑은 고딕" w:eastAsia="맑은 고딕" w:cs="맑은 고딕"/>
                 <w:b/>
                 <w:color w:val="FFFFFF"/>
                 <w:sz w:val="21"/>
@@ -5072,7 +5072,7 @@
             <w:r/>
             <w:r>
               <w:rPr>
-                <w:rFonts w:ascii="Apple SD Gothic Neo" w:hAnsi="Apple SD Gothic Neo" w:eastAsia="Apple SD Gothic Neo" w:cs="Apple SD Gothic Neo"/>
+                <w:rFonts w:ascii="맑은 고딕" w:hAnsi="맑은 고딕" w:eastAsia="맑은 고딕" w:cs="맑은 고딕"/>
                 <w:b w:val="0"/>
                 <w:sz w:val="20"/>
               </w:rPr>
@@ -5093,7 +5093,7 @@
             <w:r/>
             <w:r>
               <w:rPr>
-                <w:rFonts w:ascii="Apple SD Gothic Neo" w:hAnsi="Apple SD Gothic Neo" w:eastAsia="Apple SD Gothic Neo" w:cs="Apple SD Gothic Neo"/>
+                <w:rFonts w:ascii="맑은 고딕" w:hAnsi="맑은 고딕" w:eastAsia="맑은 고딕" w:cs="맑은 고딕"/>
                 <w:b w:val="0"/>
                 <w:sz w:val="20"/>
               </w:rPr>
@@ -5117,7 +5117,7 @@
             <w:r/>
             <w:r>
               <w:rPr>
-                <w:rFonts w:ascii="Apple SD Gothic Neo" w:hAnsi="Apple SD Gothic Neo" w:eastAsia="Apple SD Gothic Neo" w:cs="Apple SD Gothic Neo"/>
+                <w:rFonts w:ascii="맑은 고딕" w:hAnsi="맑은 고딕" w:eastAsia="맑은 고딕" w:cs="맑은 고딕"/>
                 <w:b w:val="0"/>
                 <w:sz w:val="20"/>
               </w:rPr>
@@ -5139,7 +5139,7 @@
             <w:r/>
             <w:r>
               <w:rPr>
-                <w:rFonts w:ascii="Apple SD Gothic Neo" w:hAnsi="Apple SD Gothic Neo" w:eastAsia="Apple SD Gothic Neo" w:cs="Apple SD Gothic Neo"/>
+                <w:rFonts w:ascii="맑은 고딕" w:hAnsi="맑은 고딕" w:eastAsia="맑은 고딕" w:cs="맑은 고딕"/>
                 <w:b w:val="0"/>
                 <w:sz w:val="20"/>
               </w:rPr>
@@ -5162,7 +5162,7 @@
             <w:r/>
             <w:r>
               <w:rPr>
-                <w:rFonts w:ascii="Apple SD Gothic Neo" w:hAnsi="Apple SD Gothic Neo" w:eastAsia="Apple SD Gothic Neo" w:cs="Apple SD Gothic Neo"/>
+                <w:rFonts w:ascii="맑은 고딕" w:hAnsi="맑은 고딕" w:eastAsia="맑은 고딕" w:cs="맑은 고딕"/>
                 <w:b w:val="0"/>
                 <w:sz w:val="20"/>
               </w:rPr>
@@ -5183,7 +5183,7 @@
             <w:r/>
             <w:r>
               <w:rPr>
-                <w:rFonts w:ascii="Apple SD Gothic Neo" w:hAnsi="Apple SD Gothic Neo" w:eastAsia="Apple SD Gothic Neo" w:cs="Apple SD Gothic Neo"/>
+                <w:rFonts w:ascii="맑은 고딕" w:hAnsi="맑은 고딕" w:eastAsia="맑은 고딕" w:cs="맑은 고딕"/>
                 <w:b w:val="0"/>
                 <w:sz w:val="20"/>
               </w:rPr>
@@ -5207,7 +5207,7 @@
             <w:r/>
             <w:r>
               <w:rPr>
-                <w:rFonts w:ascii="Apple SD Gothic Neo" w:hAnsi="Apple SD Gothic Neo" w:eastAsia="Apple SD Gothic Neo" w:cs="Apple SD Gothic Neo"/>
+                <w:rFonts w:ascii="맑은 고딕" w:hAnsi="맑은 고딕" w:eastAsia="맑은 고딕" w:cs="맑은 고딕"/>
                 <w:b w:val="0"/>
                 <w:sz w:val="20"/>
               </w:rPr>
@@ -5229,7 +5229,7 @@
             <w:r/>
             <w:r>
               <w:rPr>
-                <w:rFonts w:ascii="Apple SD Gothic Neo" w:hAnsi="Apple SD Gothic Neo" w:eastAsia="Apple SD Gothic Neo" w:cs="Apple SD Gothic Neo"/>
+                <w:rFonts w:ascii="맑은 고딕" w:hAnsi="맑은 고딕" w:eastAsia="맑은 고딕" w:cs="맑은 고딕"/>
                 <w:b w:val="0"/>
                 <w:sz w:val="20"/>
               </w:rPr>
@@ -5245,7 +5245,7 @@
       </w:pPr>
       <w:r>
         <w:rPr>
-          <w:rFonts w:ascii="Apple SD Gothic Neo" w:hAnsi="Apple SD Gothic Neo" w:eastAsia="Apple SD Gothic Neo" w:cs="Apple SD Gothic Neo"/>
+          <w:rFonts w:ascii="맑은 고딕" w:hAnsi="맑은 고딕" w:eastAsia="맑은 고딕" w:cs="맑은 고딕"/>
           <w:b w:val="0"/>
           <w:i w:val="0"/>
           <w:sz w:val="2"/>
@@ -5259,7 +5259,7 @@
       </w:pPr>
       <w:r>
         <w:rPr>
-          <w:rFonts w:ascii="Apple SD Gothic Neo" w:hAnsi="Apple SD Gothic Neo" w:eastAsia="Apple SD Gothic Neo" w:cs="Apple SD Gothic Neo"/>
+          <w:rFonts w:ascii="맑은 고딕" w:hAnsi="맑은 고딕" w:eastAsia="맑은 고딕" w:cs="맑은 고딕"/>
           <w:b/>
           <w:color w:val="2E75B6"/>
           <w:sz w:val="25"/>
@@ -5274,7 +5274,7 @@
       </w:pPr>
       <w:r>
         <w:rPr>
-          <w:rFonts w:ascii="Apple SD Gothic Neo" w:hAnsi="Apple SD Gothic Neo" w:eastAsia="Apple SD Gothic Neo" w:cs="Apple SD Gothic Neo"/>
+          <w:rFonts w:ascii="맑은 고딕" w:hAnsi="맑은 고딕" w:eastAsia="맑은 고딕" w:cs="맑은 고딕"/>
           <w:sz w:val="21"/>
         </w:rPr>
         <w:t>수행사가 단계 완료 보고서 및 산출물을 발주처에 제출</w:t>
@@ -5287,7 +5287,7 @@
       </w:pPr>
       <w:r>
         <w:rPr>
-          <w:rFonts w:ascii="Apple SD Gothic Neo" w:hAnsi="Apple SD Gothic Neo" w:eastAsia="Apple SD Gothic Neo" w:cs="Apple SD Gothic Neo"/>
+          <w:rFonts w:ascii="맑은 고딕" w:hAnsi="맑은 고딕" w:eastAsia="맑은 고딕" w:cs="맑은 고딕"/>
           <w:sz w:val="21"/>
         </w:rPr>
         <w:t>발주처는 영업일 기준 7일 이내 1차 검토 후 보완 요청 또는 검수 합격 통지</w:t>
@@ -5300,7 +5300,7 @@
       </w:pPr>
       <w:r>
         <w:rPr>
-          <w:rFonts w:ascii="Apple SD Gothic Neo" w:hAnsi="Apple SD Gothic Neo" w:eastAsia="Apple SD Gothic Neo" w:cs="Apple SD Gothic Neo"/>
+          <w:rFonts w:ascii="맑은 고딕" w:hAnsi="맑은 고딕" w:eastAsia="맑은 고딕" w:cs="맑은 고딕"/>
           <w:sz w:val="21"/>
         </w:rPr>
         <w:t>보완 요청 시, 수행사는 영업일 기준 5일 이내 보완 결과 제출 (반복 가능)</w:t>
@@ -5313,7 +5313,7 @@
       </w:pPr>
       <w:r>
         <w:rPr>
-          <w:rFonts w:ascii="Apple SD Gothic Neo" w:hAnsi="Apple SD Gothic Neo" w:eastAsia="Apple SD Gothic Neo" w:cs="Apple SD Gothic Neo"/>
+          <w:rFonts w:ascii="맑은 고딕" w:hAnsi="맑은 고딕" w:eastAsia="맑은 고딕" w:cs="맑은 고딕"/>
           <w:sz w:val="21"/>
         </w:rPr>
         <w:t>최종 검수 합격 시, 발주측 PM이 검수확인서에 서명함으로써 해당 단계 완료를 확정</w:t>
@@ -5326,7 +5326,7 @@
       </w:pPr>
       <w:r>
         <w:rPr>
-          <w:rFonts w:ascii="Apple SD Gothic Neo" w:hAnsi="Apple SD Gothic Neo" w:eastAsia="Apple SD Gothic Neo" w:cs="Apple SD Gothic Neo"/>
+          <w:rFonts w:ascii="맑은 고딕" w:hAnsi="맑은 고딕" w:eastAsia="맑은 고딕" w:cs="맑은 고딕"/>
           <w:sz w:val="21"/>
         </w:rPr>
         <w:t>UAT 기간은 최종 검수 단계에서 영업일 기준 10일을 기본으로 하며 협의 가능</w:t>
@@ -5344,7 +5344,7 @@
       </w:pPr>
       <w:r>
         <w:rPr>
-          <w:rFonts w:ascii="Apple SD Gothic Neo" w:hAnsi="Apple SD Gothic Neo" w:eastAsia="Apple SD Gothic Neo" w:cs="Apple SD Gothic Neo"/>
+          <w:rFonts w:ascii="맑은 고딕" w:hAnsi="맑은 고딕" w:eastAsia="맑은 고딕" w:cs="맑은 고딕"/>
           <w:b/>
           <w:color w:val="1F4E78"/>
           <w:sz w:val="30"/>
@@ -5359,7 +5359,7 @@
       </w:pPr>
       <w:r>
         <w:rPr>
-          <w:rFonts w:ascii="Apple SD Gothic Neo" w:hAnsi="Apple SD Gothic Neo" w:eastAsia="Apple SD Gothic Neo" w:cs="Apple SD Gothic Neo"/>
+          <w:rFonts w:ascii="맑은 고딕" w:hAnsi="맑은 고딕" w:eastAsia="맑은 고딕" w:cs="맑은 고딕"/>
           <w:b/>
           <w:color w:val="2E75B6"/>
           <w:sz w:val="25"/>
@@ -5374,7 +5374,7 @@
       </w:pPr>
       <w:r>
         <w:rPr>
-          <w:rFonts w:ascii="Apple SD Gothic Neo" w:hAnsi="Apple SD Gothic Neo" w:eastAsia="Apple SD Gothic Neo" w:cs="Apple SD Gothic Neo"/>
+          <w:rFonts w:ascii="맑은 고딕" w:hAnsi="맑은 고딕" w:eastAsia="맑은 고딕" w:cs="맑은 고딕"/>
           <w:sz w:val="21"/>
         </w:rPr>
         <w:t>본 과업의 결과로 산출되는 모든 산출물(소스코드, 디자인 원본, 문서, 비콘 펌웨어 등)의 일체의 지적재산권(저작권, 특허권 등)은 검수 완료 및 대금 완납과 동시에 발주처에 귀속된다.</w:t>
@@ -5387,7 +5387,7 @@
       </w:pPr>
       <w:r>
         <w:rPr>
-          <w:rFonts w:ascii="Apple SD Gothic Neo" w:hAnsi="Apple SD Gothic Neo" w:eastAsia="Apple SD Gothic Neo" w:cs="Apple SD Gothic Neo"/>
+          <w:rFonts w:ascii="맑은 고딕" w:hAnsi="맑은 고딕" w:eastAsia="맑은 고딕" w:cs="맑은 고딕"/>
           <w:sz w:val="21"/>
         </w:rPr>
         <w:t>수행사는 본 과업 수행 과정에서 발생한 모든 산출물을 제3자에게 공개하거나 재사용할 수 없다.</w:t>
@@ -5400,7 +5400,7 @@
       </w:pPr>
       <w:r>
         <w:rPr>
-          <w:rFonts w:ascii="Apple SD Gothic Neo" w:hAnsi="Apple SD Gothic Neo" w:eastAsia="Apple SD Gothic Neo" w:cs="Apple SD Gothic Neo"/>
+          <w:rFonts w:ascii="맑은 고딕" w:hAnsi="맑은 고딕" w:eastAsia="맑은 고딕" w:cs="맑은 고딕"/>
           <w:sz w:val="21"/>
         </w:rPr>
         <w:t>단, 수행사가 본 과업 이전부터 보유하고 있던 자체 라이브러리/프레임워크(Pre-existing IP)는 본 항의 예외로 하되, 이를 본 과업에 사용한 경우 발주처에 영구 사용권을 무상으로 부여한다.</w:t>
@@ -5413,7 +5413,7 @@
       </w:pPr>
       <w:r>
         <w:rPr>
-          <w:rFonts w:ascii="Apple SD Gothic Neo" w:hAnsi="Apple SD Gothic Neo" w:eastAsia="Apple SD Gothic Neo" w:cs="Apple SD Gothic Neo"/>
+          <w:rFonts w:ascii="맑은 고딕" w:hAnsi="맑은 고딕" w:eastAsia="맑은 고딕" w:cs="맑은 고딕"/>
           <w:sz w:val="21"/>
         </w:rPr>
         <w:t>오픈소스 소프트웨어(OSS)는 라이선스 조건을 준수하여 사용하며, 사용 OSS 목록과 라이선스를 별도 문서로 제공한다.</w:t>
@@ -5426,7 +5426,7 @@
       </w:pPr>
       <w:r>
         <w:rPr>
-          <w:rFonts w:ascii="Apple SD Gothic Neo" w:hAnsi="Apple SD Gothic Neo" w:eastAsia="Apple SD Gothic Neo" w:cs="Apple SD Gothic Neo"/>
+          <w:rFonts w:ascii="맑은 고딕" w:hAnsi="맑은 고딕" w:eastAsia="맑은 고딕" w:cs="맑은 고딕"/>
           <w:b/>
           <w:color w:val="2E75B6"/>
           <w:sz w:val="25"/>
@@ -5441,7 +5441,7 @@
       </w:pPr>
       <w:r>
         <w:rPr>
-          <w:rFonts w:ascii="Apple SD Gothic Neo" w:hAnsi="Apple SD Gothic Neo" w:eastAsia="Apple SD Gothic Neo" w:cs="Apple SD Gothic Neo"/>
+          <w:rFonts w:ascii="맑은 고딕" w:hAnsi="맑은 고딕" w:eastAsia="맑은 고딕" w:cs="맑은 고딕"/>
           <w:sz w:val="21"/>
         </w:rPr>
         <w:t>수행사는 본 과업 수행 중 알게 된 발주처의 모든 정보(사업 전략, 기술 정보, 고객 정보 등)에 대해 비밀을 유지하며, 계약 종료 후 합의된 기간 동안 비밀유지 의무를 부담한다.</w:t>
@@ -5454,7 +5454,7 @@
       </w:pPr>
       <w:r>
         <w:rPr>
-          <w:rFonts w:ascii="Apple SD Gothic Neo" w:hAnsi="Apple SD Gothic Neo" w:eastAsia="Apple SD Gothic Neo" w:cs="Apple SD Gothic Neo"/>
+          <w:rFonts w:ascii="맑은 고딕" w:hAnsi="맑은 고딕" w:eastAsia="맑은 고딕" w:cs="맑은 고딕"/>
           <w:sz w:val="21"/>
         </w:rPr>
         <w:t>수행사는 본 과업 수행에 참여하는 모든 인력에 대해 별도의 비밀유지서약을 받아 발주처에 제출한다.</w:t>
@@ -5467,7 +5467,7 @@
       </w:pPr>
       <w:r>
         <w:rPr>
-          <w:rFonts w:ascii="Apple SD Gothic Neo" w:hAnsi="Apple SD Gothic Neo" w:eastAsia="Apple SD Gothic Neo" w:cs="Apple SD Gothic Neo"/>
+          <w:rFonts w:ascii="맑은 고딕" w:hAnsi="맑은 고딕" w:eastAsia="맑은 고딕" w:cs="맑은 고딕"/>
           <w:sz w:val="21"/>
         </w:rPr>
         <w:t>위반 시 손해배상 및 별도 법적 책임을 부담한다.</w:t>
@@ -5480,7 +5480,7 @@
       </w:pPr>
       <w:r>
         <w:rPr>
-          <w:rFonts w:ascii="Apple SD Gothic Neo" w:hAnsi="Apple SD Gothic Neo" w:eastAsia="Apple SD Gothic Neo" w:cs="Apple SD Gothic Neo"/>
+          <w:rFonts w:ascii="맑은 고딕" w:hAnsi="맑은 고딕" w:eastAsia="맑은 고딕" w:cs="맑은 고딕"/>
           <w:b/>
           <w:color w:val="2E75B6"/>
           <w:sz w:val="25"/>
@@ -5495,7 +5495,7 @@
       </w:pPr>
       <w:r>
         <w:rPr>
-          <w:rFonts w:ascii="Apple SD Gothic Neo" w:hAnsi="Apple SD Gothic Neo" w:eastAsia="Apple SD Gothic Neo" w:cs="Apple SD Gothic Neo"/>
+          <w:rFonts w:ascii="맑은 고딕" w:hAnsi="맑은 고딕" w:eastAsia="맑은 고딕" w:cs="맑은 고딕"/>
           <w:sz w:val="21"/>
         </w:rPr>
         <w:t>개발 단계에서 발주처의 실 운영 데이터를 사용하지 않으며, 가상 데이터 또는 비식별화된 샘플 데이터만 사용한다.</w:t>
@@ -5508,7 +5508,7 @@
       </w:pPr>
       <w:r>
         <w:rPr>
-          <w:rFonts w:ascii="Apple SD Gothic Neo" w:hAnsi="Apple SD Gothic Neo" w:eastAsia="Apple SD Gothic Neo" w:cs="Apple SD Gothic Neo"/>
+          <w:rFonts w:ascii="맑은 고딕" w:hAnsi="맑은 고딕" w:eastAsia="맑은 고딕" w:cs="맑은 고딕"/>
           <w:sz w:val="21"/>
         </w:rPr>
         <w:t>부득이하게 실 데이터 사용이 필요한 경우, 발주처의 사전 서면 동의 및 별도 위탁계약을 체결한 후 사용한다.</w:t>
@@ -5521,7 +5521,7 @@
       </w:pPr>
       <w:r>
         <w:rPr>
-          <w:rFonts w:ascii="Apple SD Gothic Neo" w:hAnsi="Apple SD Gothic Neo" w:eastAsia="Apple SD Gothic Neo" w:cs="Apple SD Gothic Neo"/>
+          <w:rFonts w:ascii="맑은 고딕" w:hAnsi="맑은 고딕" w:eastAsia="맑은 고딕" w:cs="맑은 고딕"/>
           <w:sz w:val="21"/>
         </w:rPr>
         <w:t>개발 환경의 보안 통제(접근권한, VPN, MFA 등)는 발주처가 요구하는 수준으로 구축한다.</w:t>
@@ -5539,7 +5539,7 @@
       </w:pPr>
       <w:r>
         <w:rPr>
-          <w:rFonts w:ascii="Apple SD Gothic Neo" w:hAnsi="Apple SD Gothic Neo" w:eastAsia="Apple SD Gothic Neo" w:cs="Apple SD Gothic Neo"/>
+          <w:rFonts w:ascii="맑은 고딕" w:hAnsi="맑은 고딕" w:eastAsia="맑은 고딕" w:cs="맑은 고딕"/>
           <w:b/>
           <w:color w:val="1F4E78"/>
           <w:sz w:val="30"/>
@@ -5554,7 +5554,7 @@
       </w:pPr>
       <w:r>
         <w:rPr>
-          <w:rFonts w:ascii="Apple SD Gothic Neo" w:hAnsi="Apple SD Gothic Neo" w:eastAsia="Apple SD Gothic Neo" w:cs="Apple SD Gothic Neo"/>
+          <w:rFonts w:ascii="맑은 고딕" w:hAnsi="맑은 고딕" w:eastAsia="맑은 고딕" w:cs="맑은 고딕"/>
           <w:b/>
           <w:color w:val="2E75B6"/>
           <w:sz w:val="25"/>
@@ -5569,7 +5569,7 @@
       </w:pPr>
       <w:r>
         <w:rPr>
-          <w:rFonts w:ascii="Apple SD Gothic Neo" w:hAnsi="Apple SD Gothic Neo" w:eastAsia="Apple SD Gothic Neo" w:cs="Apple SD Gothic Neo"/>
+          <w:rFonts w:ascii="맑은 고딕" w:hAnsi="맑은 고딕" w:eastAsia="맑은 고딕" w:cs="맑은 고딕"/>
           <w:sz w:val="21"/>
         </w:rPr>
         <w:t>최종 검수 합격일로부터 12개월간 무상 하자보수를 제공한다.</w:t>
@@ -5582,7 +5582,7 @@
       </w:pPr>
       <w:r>
         <w:rPr>
-          <w:rFonts w:ascii="Apple SD Gothic Neo" w:hAnsi="Apple SD Gothic Neo" w:eastAsia="Apple SD Gothic Neo" w:cs="Apple SD Gothic Neo"/>
+          <w:rFonts w:ascii="맑은 고딕" w:hAnsi="맑은 고딕" w:eastAsia="맑은 고딕" w:cs="맑은 고딕"/>
           <w:sz w:val="21"/>
         </w:rPr>
         <w:t>하자보수 기간 중 발생한 중대 결함은 신고 접수 후 합리적 기간 내 조치한다.</w:t>
@@ -5595,7 +5595,7 @@
       </w:pPr>
       <w:r>
         <w:rPr>
-          <w:rFonts w:ascii="Apple SD Gothic Neo" w:hAnsi="Apple SD Gothic Neo" w:eastAsia="Apple SD Gothic Neo" w:cs="Apple SD Gothic Neo"/>
+          <w:rFonts w:ascii="맑은 고딕" w:hAnsi="맑은 고딕" w:eastAsia="맑은 고딕" w:cs="맑은 고딕"/>
           <w:sz w:val="21"/>
         </w:rPr>
         <w:t>기타 결함은 양 당사자 협의로 처리한다.</w:t>
@@ -5608,7 +5608,7 @@
       </w:pPr>
       <w:r>
         <w:rPr>
-          <w:rFonts w:ascii="Apple SD Gothic Neo" w:hAnsi="Apple SD Gothic Neo" w:eastAsia="Apple SD Gothic Neo" w:cs="Apple SD Gothic Neo"/>
+          <w:rFonts w:ascii="맑은 고딕" w:hAnsi="맑은 고딕" w:eastAsia="맑은 고딕" w:cs="맑은 고딕"/>
           <w:b/>
           <w:color w:val="2E75B6"/>
           <w:sz w:val="25"/>
@@ -5623,7 +5623,7 @@
       </w:pPr>
       <w:r>
         <w:rPr>
-          <w:rFonts w:ascii="Apple SD Gothic Neo" w:hAnsi="Apple SD Gothic Neo" w:eastAsia="Apple SD Gothic Neo" w:cs="Apple SD Gothic Neo"/>
+          <w:rFonts w:ascii="맑은 고딕" w:hAnsi="맑은 고딕" w:eastAsia="맑은 고딕" w:cs="맑은 고딕"/>
           <w:sz w:val="21"/>
         </w:rPr>
         <w:t>범위: 본 과업 산출물의 결함, 보안 패치, 발주처 환경 변화에 따른 호환성 조치(OS 메이저 업데이트 등).</w:t>
@@ -5636,7 +5636,7 @@
       </w:pPr>
       <w:r>
         <w:rPr>
-          <w:rFonts w:ascii="Apple SD Gothic Neo" w:hAnsi="Apple SD Gothic Neo" w:eastAsia="Apple SD Gothic Neo" w:cs="Apple SD Gothic Neo"/>
+          <w:rFonts w:ascii="맑은 고딕" w:hAnsi="맑은 고딕" w:eastAsia="맑은 고딕" w:cs="맑은 고딕"/>
           <w:sz w:val="21"/>
         </w:rPr>
         <w:t>제외: 신규 기능 추가, 디자인 전면 개편, 외부 시스템 변경에 따른 대응, 발주처 임의 변경으로 인한 장애.</w:t>
@@ -5649,7 +5649,7 @@
       </w:pPr>
       <w:r>
         <w:rPr>
-          <w:rFonts w:ascii="Apple SD Gothic Neo" w:hAnsi="Apple SD Gothic Neo" w:eastAsia="Apple SD Gothic Neo" w:cs="Apple SD Gothic Neo"/>
+          <w:rFonts w:ascii="맑은 고딕" w:hAnsi="맑은 고딕" w:eastAsia="맑은 고딕" w:cs="맑은 고딕"/>
           <w:b/>
           <w:color w:val="2E75B6"/>
           <w:sz w:val="25"/>
@@ -5664,7 +5664,7 @@
       </w:pPr>
       <w:r>
         <w:rPr>
-          <w:rFonts w:ascii="Apple SD Gothic Neo" w:hAnsi="Apple SD Gothic Neo" w:eastAsia="Apple SD Gothic Neo" w:cs="Apple SD Gothic Neo"/>
+          <w:rFonts w:ascii="맑은 고딕" w:hAnsi="맑은 고딕" w:eastAsia="맑은 고딕" w:cs="맑은 고딕"/>
           <w:sz w:val="21"/>
         </w:rPr>
         <w:t>하자보수 기간 종료 후의 운영/유지보수는 본 과업에 포함되지 않으며 별도 계약으로 진행한다.</w:t>
@@ -5677,7 +5677,7 @@
       </w:pPr>
       <w:r>
         <w:rPr>
-          <w:rFonts w:ascii="Apple SD Gothic Neo" w:hAnsi="Apple SD Gothic Neo" w:eastAsia="Apple SD Gothic Neo" w:cs="Apple SD Gothic Neo"/>
+          <w:rFonts w:ascii="맑은 고딕" w:hAnsi="맑은 고딕" w:eastAsia="맑은 고딕" w:cs="맑은 고딕"/>
           <w:sz w:val="21"/>
         </w:rPr>
         <w:t>유지보수 계약 조건(범위, 비용, SLA)은 본 과업 최종 검수 60일 전부터 협의를 개시한다.</w:t>
@@ -5695,7 +5695,7 @@
       </w:pPr>
       <w:r>
         <w:rPr>
-          <w:rFonts w:ascii="Apple SD Gothic Neo" w:hAnsi="Apple SD Gothic Neo" w:eastAsia="Apple SD Gothic Neo" w:cs="Apple SD Gothic Neo"/>
+          <w:rFonts w:ascii="맑은 고딕" w:hAnsi="맑은 고딕" w:eastAsia="맑은 고딕" w:cs="맑은 고딕"/>
           <w:b/>
           <w:color w:val="1F4E78"/>
           <w:sz w:val="30"/>
@@ -5710,7 +5710,7 @@
       </w:pPr>
       <w:r>
         <w:rPr>
-          <w:rFonts w:ascii="Apple SD Gothic Neo" w:hAnsi="Apple SD Gothic Neo" w:eastAsia="Apple SD Gothic Neo" w:cs="Apple SD Gothic Neo"/>
+          <w:rFonts w:ascii="맑은 고딕" w:hAnsi="맑은 고딕" w:eastAsia="맑은 고딕" w:cs="맑은 고딕"/>
           <w:b/>
           <w:color w:val="2E75B6"/>
           <w:sz w:val="25"/>
@@ -5725,7 +5725,7 @@
       </w:pPr>
       <w:r>
         <w:rPr>
-          <w:rFonts w:ascii="Apple SD Gothic Neo" w:hAnsi="Apple SD Gothic Neo" w:eastAsia="Apple SD Gothic Neo" w:cs="Apple SD Gothic Neo"/>
+          <w:rFonts w:ascii="맑은 고딕" w:hAnsi="맑은 고딕" w:eastAsia="맑은 고딕" w:cs="맑은 고딕"/>
           <w:sz w:val="21"/>
         </w:rPr>
         <w:t>본 과업의 범위, 일정, 비용에 영향을 미치는 변경이 필요한 경우, 양 당사자 협의를 거쳐 서면(변경 합의서)으로 확정한다.</w:t>
@@ -5738,7 +5738,7 @@
       </w:pPr>
       <w:r>
         <w:rPr>
-          <w:rFonts w:ascii="Apple SD Gothic Neo" w:hAnsi="Apple SD Gothic Neo" w:eastAsia="Apple SD Gothic Neo" w:cs="Apple SD Gothic Neo"/>
+          <w:rFonts w:ascii="맑은 고딕" w:hAnsi="맑은 고딕" w:eastAsia="맑은 고딕" w:cs="맑은 고딕"/>
           <w:sz w:val="21"/>
         </w:rPr>
         <w:t>발주처 귀책으로 인한 지연/추가 작업은 별도 산정한다.</w:t>
@@ -5751,7 +5751,7 @@
       </w:pPr>
       <w:r>
         <w:rPr>
-          <w:rFonts w:ascii="Apple SD Gothic Neo" w:hAnsi="Apple SD Gothic Neo" w:eastAsia="Apple SD Gothic Neo" w:cs="Apple SD Gothic Neo"/>
+          <w:rFonts w:ascii="맑은 고딕" w:hAnsi="맑은 고딕" w:eastAsia="맑은 고딕" w:cs="맑은 고딕"/>
           <w:b/>
           <w:color w:val="2E75B6"/>
           <w:sz w:val="25"/>
@@ -5766,7 +5766,7 @@
       </w:pPr>
       <w:r>
         <w:rPr>
-          <w:rFonts w:ascii="Apple SD Gothic Neo" w:hAnsi="Apple SD Gothic Neo" w:eastAsia="Apple SD Gothic Neo" w:cs="Apple SD Gothic Neo"/>
+          <w:rFonts w:ascii="맑은 고딕" w:hAnsi="맑은 고딕" w:eastAsia="맑은 고딕" w:cs="맑은 고딕"/>
           <w:sz w:val="21"/>
         </w:rPr>
         <w:t>일방 당사자의 중대한 의무 위반 시, 상대방은 14일의 시정 기간을 부여한 후 시정되지 않으면 서면 통지로 해지할 수 있다.</w:t>
@@ -5779,7 +5779,7 @@
       </w:pPr>
       <w:r>
         <w:rPr>
-          <w:rFonts w:ascii="Apple SD Gothic Neo" w:hAnsi="Apple SD Gothic Neo" w:eastAsia="Apple SD Gothic Neo" w:cs="Apple SD Gothic Neo"/>
+          <w:rFonts w:ascii="맑은 고딕" w:hAnsi="맑은 고딕" w:eastAsia="맑은 고딕" w:cs="맑은 고딕"/>
           <w:sz w:val="21"/>
         </w:rPr>
         <w:t>해지 시까지의 진행된 작업분에 대한 정산은 양 당사자 협의로 정한다.</w:t>
@@ -5792,7 +5792,7 @@
       </w:pPr>
       <w:r>
         <w:rPr>
-          <w:rFonts w:ascii="Apple SD Gothic Neo" w:hAnsi="Apple SD Gothic Neo" w:eastAsia="Apple SD Gothic Neo" w:cs="Apple SD Gothic Neo"/>
+          <w:rFonts w:ascii="맑은 고딕" w:hAnsi="맑은 고딕" w:eastAsia="맑은 고딕" w:cs="맑은 고딕"/>
           <w:sz w:val="21"/>
         </w:rPr>
         <w:t>구체적 해지 조건은 본 과업지시서를 기반으로 한 본 계약서에서 정한다.</w:t>
@@ -5805,7 +5805,7 @@
       </w:pPr>
       <w:r>
         <w:rPr>
-          <w:rFonts w:ascii="Apple SD Gothic Neo" w:hAnsi="Apple SD Gothic Neo" w:eastAsia="Apple SD Gothic Neo" w:cs="Apple SD Gothic Neo"/>
+          <w:rFonts w:ascii="맑은 고딕" w:hAnsi="맑은 고딕" w:eastAsia="맑은 고딕" w:cs="맑은 고딕"/>
           <w:b/>
           <w:color w:val="2E75B6"/>
           <w:sz w:val="25"/>
@@ -5820,7 +5820,7 @@
       </w:pPr>
       <w:r>
         <w:rPr>
-          <w:rFonts w:ascii="Apple SD Gothic Neo" w:hAnsi="Apple SD Gothic Neo" w:eastAsia="Apple SD Gothic Neo" w:cs="Apple SD Gothic Neo"/>
+          <w:rFonts w:ascii="맑은 고딕" w:hAnsi="맑은 고딕" w:eastAsia="맑은 고딕" w:cs="맑은 고딕"/>
           <w:sz w:val="21"/>
         </w:rPr>
         <w:t>수행사의 귀책 사유로 발주처에 손해가 발생한 경우, 수행사는 본 계약 총액을 한도로 손해배상 책임을 진다.</w:t>
@@ -5833,7 +5833,7 @@
       </w:pPr>
       <w:r>
         <w:rPr>
-          <w:rFonts w:ascii="Apple SD Gothic Neo" w:hAnsi="Apple SD Gothic Neo" w:eastAsia="Apple SD Gothic Neo" w:cs="Apple SD Gothic Neo"/>
+          <w:rFonts w:ascii="맑은 고딕" w:hAnsi="맑은 고딕" w:eastAsia="맑은 고딕" w:cs="맑은 고딕"/>
           <w:sz w:val="21"/>
         </w:rPr>
         <w:t>단, 고의 또는 중과실로 인한 손해, 비밀유지 의무 위반, 지적재산권 침해에 따른 손해는 한도 적용을 받지 아니한다.</w:t>
@@ -5846,7 +5846,7 @@
       </w:pPr>
       <w:r>
         <w:rPr>
-          <w:rFonts w:ascii="Apple SD Gothic Neo" w:hAnsi="Apple SD Gothic Neo" w:eastAsia="Apple SD Gothic Neo" w:cs="Apple SD Gothic Neo"/>
+          <w:rFonts w:ascii="맑은 고딕" w:hAnsi="맑은 고딕" w:eastAsia="맑은 고딕" w:cs="맑은 고딕"/>
           <w:b/>
           <w:color w:val="2E75B6"/>
           <w:sz w:val="25"/>
@@ -5861,7 +5861,7 @@
       </w:pPr>
       <w:r>
         <w:rPr>
-          <w:rFonts w:ascii="Apple SD Gothic Neo" w:hAnsi="Apple SD Gothic Neo" w:eastAsia="Apple SD Gothic Neo" w:cs="Apple SD Gothic Neo"/>
+          <w:rFonts w:ascii="맑은 고딕" w:hAnsi="맑은 고딕" w:eastAsia="맑은 고딕" w:cs="맑은 고딕"/>
           <w:sz w:val="21"/>
         </w:rPr>
         <w:t>본 과업 및 관련 계약은 대한민국법을 준거법으로 한다.</w:t>
@@ -5874,7 +5874,7 @@
       </w:pPr>
       <w:r>
         <w:rPr>
-          <w:rFonts w:ascii="Apple SD Gothic Neo" w:hAnsi="Apple SD Gothic Neo" w:eastAsia="Apple SD Gothic Neo" w:cs="Apple SD Gothic Neo"/>
+          <w:rFonts w:ascii="맑은 고딕" w:hAnsi="맑은 고딕" w:eastAsia="맑은 고딕" w:cs="맑은 고딕"/>
           <w:sz w:val="21"/>
         </w:rPr>
         <w:t>본 과업에 관한 분쟁이 발생한 경우, 발주처 본점 소재지 관할 법원을 1심 전속관할로 한다.</w:t>
@@ -5887,7 +5887,7 @@
       </w:pPr>
       <w:r>
         <w:rPr>
-          <w:rFonts w:ascii="Apple SD Gothic Neo" w:hAnsi="Apple SD Gothic Neo" w:eastAsia="Apple SD Gothic Neo" w:cs="Apple SD Gothic Neo"/>
+          <w:rFonts w:ascii="맑은 고딕" w:hAnsi="맑은 고딕" w:eastAsia="맑은 고딕" w:cs="맑은 고딕"/>
           <w:b/>
           <w:color w:val="2E75B6"/>
           <w:sz w:val="25"/>
@@ -5902,7 +5902,7 @@
       </w:pPr>
       <w:r>
         <w:rPr>
-          <w:rFonts w:ascii="Apple SD Gothic Neo" w:hAnsi="Apple SD Gothic Neo" w:eastAsia="Apple SD Gothic Neo" w:cs="Apple SD Gothic Neo"/>
+          <w:rFonts w:ascii="맑은 고딕" w:hAnsi="맑은 고딕" w:eastAsia="맑은 고딕" w:cs="맑은 고딕"/>
           <w:sz w:val="21"/>
         </w:rPr>
         <w:t>본 과업지시서는 본 과업과 관련하여 체결되는 용역계약서의 일부로 편입되며, 본 과업지시서와 계약서가 상충하는 경우 계약서를 우선한다.</w:t>
@@ -5915,7 +5915,7 @@
       </w:pPr>
       <w:r>
         <w:rPr>
-          <w:rFonts w:ascii="Apple SD Gothic Neo" w:hAnsi="Apple SD Gothic Neo" w:eastAsia="Apple SD Gothic Neo" w:cs="Apple SD Gothic Neo"/>
+          <w:rFonts w:ascii="맑은 고딕" w:hAnsi="맑은 고딕" w:eastAsia="맑은 고딕" w:cs="맑은 고딕"/>
           <w:sz w:val="21"/>
         </w:rPr>
         <w:t>본 과업지시서, 별첨 "Pathwave 기능정의서 v1.0", 양 당사자가 합의한 회의록 등은 본 과업의 범위를 해석하는 근거 문서로서 효력을 가진다.</w:t>
@@ -5927,7 +5927,7 @@
       </w:pPr>
       <w:r>
         <w:rPr>
-          <w:rFonts w:ascii="Apple SD Gothic Neo" w:hAnsi="Apple SD Gothic Neo" w:eastAsia="Apple SD Gothic Neo" w:cs="Apple SD Gothic Neo"/>
+          <w:rFonts w:ascii="맑은 고딕" w:hAnsi="맑은 고딕" w:eastAsia="맑은 고딕" w:cs="맑은 고딕"/>
           <w:b w:val="0"/>
           <w:i w:val="0"/>
           <w:sz w:val="22"/>
@@ -5940,7 +5940,7 @@
       </w:pPr>
       <w:r>
         <w:rPr>
-          <w:rFonts w:ascii="Apple SD Gothic Neo" w:hAnsi="Apple SD Gothic Neo" w:eastAsia="Apple SD Gothic Neo" w:cs="Apple SD Gothic Neo"/>
+          <w:rFonts w:ascii="맑은 고딕" w:hAnsi="맑은 고딕" w:eastAsia="맑은 고딕" w:cs="맑은 고딕"/>
           <w:b/>
           <w:i w:val="0"/>
           <w:sz w:val="22"/>
@@ -5955,7 +5955,7 @@
       </w:pPr>
       <w:r>
         <w:rPr>
-          <w:rFonts w:ascii="Apple SD Gothic Neo" w:hAnsi="Apple SD Gothic Neo" w:eastAsia="Apple SD Gothic Neo" w:cs="Apple SD Gothic Neo"/>
+          <w:rFonts w:ascii="맑은 고딕" w:hAnsi="맑은 고딕" w:eastAsia="맑은 고딕" w:cs="맑은 고딕"/>
           <w:sz w:val="21"/>
         </w:rPr>
         <w:t>별첨 1: Pathwave 기능정의서 v1.0</w:t>
@@ -5968,7 +5968,7 @@
       </w:pPr>
       <w:r>
         <w:rPr>
-          <w:rFonts w:ascii="Apple SD Gothic Neo" w:hAnsi="Apple SD Gothic Neo" w:eastAsia="Apple SD Gothic Neo" w:cs="Apple SD Gothic Neo"/>
+          <w:rFonts w:ascii="맑은 고딕" w:hAnsi="맑은 고딕" w:eastAsia="맑은 고딕" w:cs="맑은 고딕"/>
           <w:sz w:val="21"/>
         </w:rPr>
         <w:t>별첨 2: 비콘 클라우드 핸드셰이크 프로토콜 상세 명세</w:t>
@@ -5981,7 +5981,7 @@
       </w:pPr>
       <w:r>
         <w:rPr>
-          <w:rFonts w:ascii="Apple SD Gothic Neo" w:hAnsi="Apple SD Gothic Neo" w:eastAsia="Apple SD Gothic Neo" w:cs="Apple SD Gothic Neo"/>
+          <w:rFonts w:ascii="맑은 고딕" w:hAnsi="맑은 고딕" w:eastAsia="맑은 고딕" w:cs="맑은 고딕"/>
           <w:sz w:val="21"/>
         </w:rPr>
         <w:t>별첨 3: 발주처 표준 비밀유지서약서 (NDA) 양식</w:t>
@@ -5993,7 +5993,7 @@
       </w:pPr>
       <w:r>
         <w:rPr>
-          <w:rFonts w:ascii="Apple SD Gothic Neo" w:hAnsi="Apple SD Gothic Neo" w:eastAsia="Apple SD Gothic Neo" w:cs="Apple SD Gothic Neo"/>
+          <w:rFonts w:ascii="맑은 고딕" w:hAnsi="맑은 고딕" w:eastAsia="맑은 고딕" w:cs="맑은 고딕"/>
           <w:b w:val="0"/>
           <w:i w:val="0"/>
           <w:sz w:val="22"/>
@@ -6007,7 +6007,7 @@
       </w:pPr>
       <w:r>
         <w:rPr>
-          <w:rFonts w:ascii="Apple SD Gothic Neo" w:hAnsi="Apple SD Gothic Neo" w:eastAsia="Apple SD Gothic Neo" w:cs="Apple SD Gothic Neo"/>
+          <w:rFonts w:ascii="맑은 고딕" w:hAnsi="맑은 고딕" w:eastAsia="맑은 고딕" w:cs="맑은 고딕"/>
           <w:b w:val="0"/>
           <w:i w:val="0"/>
           <w:color w:val="808080"/>
@@ -6390,7 +6390,7 @@
     <w:qFormat/>
     <w:rsid w:val="00FC693F"/>
     <w:rPr>
-      <w:rFonts w:ascii="Apple SD Gothic Neo" w:hAnsi="Apple SD Gothic Neo" w:eastAsia="Apple SD Gothic Neo" w:cs="Apple SD Gothic Neo"/>
+      <w:rFonts w:ascii="맑은 고딕" w:hAnsi="맑은 고딕" w:eastAsia="맑은 고딕" w:cs="맑은 고딕"/>
       <w:sz w:val="22"/>
     </w:rPr>
   </w:style>

</xml_diff>